<commit_message>
Regenerate Word manuscript with Times New Roman (academic style)
- Build a custom pandoc reference doc: theme fonts set to Times New
  Roman (body + headings), heading colour changed from accent-blue to
  black, body already 12pt
- Matches MethodsX/Elsevier manuscript typography
- Keep reference_academic.docx for future regeneration

https://claude.ai/code/session_01GRhKW3iKJjm2wYYeUd56Hq
</commit_message>
<xml_diff>
--- a/paper/methodsx_manuscript.docx
+++ b/paper/methodsx_manuscript.docx
@@ -6989,7 +6989,7 @@
     </w:pPr>
     <w:rPr>
       <w:rFonts w:asciiTheme="majorHAnsi" w:cstheme="majorBidi" w:eastAsiaTheme="majorEastAsia" w:hAnsiTheme="majorHAnsi"/>
-      <w:color w:themeColor="accent1" w:themeShade="BF" w:val="0F4761"/>
+      <w:color w:val="000000"/>
       <w:sz w:val="40"/>
       <w:szCs w:val="40"/>
     </w:rPr>
@@ -7012,7 +7012,7 @@
     </w:pPr>
     <w:rPr>
       <w:rFonts w:asciiTheme="majorHAnsi" w:cstheme="majorBidi" w:eastAsiaTheme="majorEastAsia" w:hAnsiTheme="majorHAnsi"/>
-      <w:color w:themeColor="accent1" w:themeShade="BF" w:val="0F4761"/>
+      <w:color w:val="000000"/>
       <w:sz w:val="32"/>
       <w:szCs w:val="32"/>
     </w:rPr>
@@ -7035,7 +7035,7 @@
     </w:pPr>
     <w:rPr>
       <w:rFonts w:cstheme="majorBidi" w:eastAsiaTheme="majorEastAsia"/>
-      <w:color w:themeColor="accent1" w:themeShade="BF" w:val="0F4761"/>
+      <w:color w:val="000000"/>
       <w:sz w:val="28"/>
       <w:szCs w:val="28"/>
     </w:rPr>
@@ -7060,7 +7060,7 @@
       <w:rFonts w:cstheme="majorBidi" w:eastAsiaTheme="majorEastAsia"/>
       <w:i/>
       <w:iCs/>
-      <w:color w:themeColor="accent1" w:themeShade="BF" w:val="0F4761"/>
+      <w:color w:val="000000"/>
     </w:rPr>
   </w:style>
   <w:style w:styleId="Heading5" w:type="paragraph">
@@ -7081,7 +7081,7 @@
     </w:pPr>
     <w:rPr>
       <w:rFonts w:cstheme="majorBidi" w:eastAsiaTheme="majorEastAsia"/>
-      <w:color w:themeColor="accent1" w:themeShade="BF" w:val="0F4761"/>
+      <w:color w:val="000000"/>
     </w:rPr>
   </w:style>
   <w:style w:styleId="Heading6" w:type="paragraph">
@@ -7180,7 +7180,7 @@
     <w:rsid w:val="00A10FD9"/>
     <w:rPr>
       <w:rFonts w:asciiTheme="majorHAnsi" w:cstheme="majorBidi" w:eastAsiaTheme="majorEastAsia" w:hAnsiTheme="majorHAnsi"/>
-      <w:color w:themeColor="accent1" w:themeShade="BF" w:val="0F4761"/>
+      <w:color w:val="000000"/>
       <w:sz w:val="40"/>
       <w:szCs w:val="40"/>
     </w:rPr>
@@ -7194,7 +7194,7 @@
     <w:rsid w:val="00A10FD9"/>
     <w:rPr>
       <w:rFonts w:asciiTheme="majorHAnsi" w:cstheme="majorBidi" w:eastAsiaTheme="majorEastAsia" w:hAnsiTheme="majorHAnsi"/>
-      <w:color w:themeColor="accent1" w:themeShade="BF" w:val="0F4761"/>
+      <w:color w:val="000000"/>
       <w:sz w:val="32"/>
       <w:szCs w:val="32"/>
     </w:rPr>
@@ -7208,7 +7208,7 @@
     <w:rsid w:val="00A10FD9"/>
     <w:rPr>
       <w:rFonts w:cstheme="majorBidi" w:eastAsiaTheme="majorEastAsia"/>
-      <w:color w:themeColor="accent1" w:themeShade="BF" w:val="0F4761"/>
+      <w:color w:val="000000"/>
       <w:sz w:val="28"/>
       <w:szCs w:val="28"/>
     </w:rPr>
@@ -7224,7 +7224,7 @@
       <w:rFonts w:cstheme="majorBidi" w:eastAsiaTheme="majorEastAsia"/>
       <w:i/>
       <w:iCs/>
-      <w:color w:themeColor="accent1" w:themeShade="BF" w:val="0F4761"/>
+      <w:color w:val="000000"/>
     </w:rPr>
   </w:style>
   <w:style w:customStyle="1" w:styleId="Heading5Char" w:type="character">
@@ -7236,7 +7236,7 @@
     <w:rsid w:val="00A10FD9"/>
     <w:rPr>
       <w:rFonts w:cstheme="majorBidi" w:eastAsiaTheme="majorEastAsia"/>
-      <w:color w:themeColor="accent1" w:themeShade="BF" w:val="0F4761"/>
+      <w:color w:val="000000"/>
     </w:rPr>
   </w:style>
   <w:style w:customStyle="1" w:styleId="Heading6Char" w:type="character">
@@ -7731,7 +7731,7 @@
     </a:clrScheme>
     <a:fontScheme name="Office">
       <a:majorFont>
-        <a:latin typeface="Aptos Display" panose="02110004020202020204"/>
+        <a:latin typeface="Times New Roman" panose="02110004020202020204"/>
         <a:ea typeface=""/>
         <a:cs typeface=""/>
         <a:font script="Jpan" typeface="游ゴシック Light"/>
@@ -7783,7 +7783,7 @@
         <a:font script="Tfng" typeface="Ebrima"/>
       </a:majorFont>
       <a:minorFont>
-        <a:latin typeface="Aptos" panose="02110004020202020204"/>
+        <a:latin typeface="Times New Roman" panose="02110004020202020204"/>
         <a:ea typeface=""/>
         <a:cs typeface=""/>
         <a:font script="Jpan" typeface="游明朝"/>

</xml_diff>

<commit_message>
Tighten title and abstract, reduce em-dashes
- Title: simplify "transfer-learning and automatic false-positive cleanup
  pipeline" → "transfer-learning pipeline with automatic false-positive
  cleanup"; drop redundant "long"
- Abstract: trim from ~240 to ~170 words (under MethodsX 200-word limit);
  move deep architecture internals (frequency bands, bidirectional LSTM)
  to Method details where they already appear; restructure into two clear
  design choices
- Replace em-dashes with commas/parentheses in abstract and bullets
- "near-zero" → "zero" confusion (matches exact V12 confusion matrix)
- Regenerate Word version to match

https://claude.ai/code/session_01GRhKW3iKJjm2wYYeUd56Hq
</commit_message>
<xml_diff>
--- a/paper/methodsx_manuscript.docx
+++ b/paper/methodsx_manuscript.docx
@@ -7,13 +7,13 @@
         <w:pStyle w:val="Title"/>
       </w:pPr>
       <w:r>
-        <w:t xml:space="preserve">A transfer-learning and automatic false-positive cleanup pipeline</w:t>
-      </w:r>
-      <w:r>
-        <w:t xml:space="preserve"> </w:t>
-      </w:r>
-      <w:r>
-        <w:t xml:space="preserve">for detecting primate vocalizations in long tropical-forest recordings</w:t>
+        <w:t xml:space="preserve">A transfer-learning pipeline with automatic false-positive cleanup</w:t>
+      </w:r>
+      <w:r>
+        <w:t xml:space="preserve"> </w:t>
+      </w:r>
+      <w:r>
+        <w:t xml:space="preserve">for detecting primate vocalizations in tropical-forest recordings</w:t>
       </w:r>
     </w:p>
     <w:p>
@@ -45,25 +45,25 @@
         <w:pStyle w:val="Abstract"/>
       </w:pPr>
       <w:r>
-        <w:t xml:space="preserve">Passive acoustic monitoring (PAM) produces thousands of hours of</w:t>
-      </w:r>
-      <w:r>
-        <w:t xml:space="preserve"> </w:t>
-      </w:r>
-      <w:r>
-        <w:t xml:space="preserve">tropical-forest audio that are infeasible to annotate by hand. We describe an</w:t>
-      </w:r>
-      <w:r>
-        <w:t xml:space="preserve"> </w:t>
-      </w:r>
-      <w:r>
-        <w:t xml:space="preserve">end-to-end pipeline that detects primate vocalizations — the putty-nosed</w:t>
-      </w:r>
-      <w:r>
-        <w:t xml:space="preserve"> </w:t>
-      </w:r>
-      <w:r>
-        <w:t xml:space="preserve">monkey (</w:t>
+        <w:t xml:space="preserve">Passive acoustic monitoring produces thousands of hours of tropical-forest</w:t>
+      </w:r>
+      <w:r>
+        <w:t xml:space="preserve"> </w:t>
+      </w:r>
+      <w:r>
+        <w:t xml:space="preserve">audio that are infeasible to annotate by hand. We describe an end-to-end</w:t>
+      </w:r>
+      <w:r>
+        <w:t xml:space="preserve"> </w:t>
+      </w:r>
+      <w:r>
+        <w:t xml:space="preserve">pipeline that detects two primate species, the putty-nosed monkey</w:t>
+      </w:r>
+      <w:r>
+        <w:t xml:space="preserve"> </w:t>
+      </w:r>
+      <w:r>
+        <w:t xml:space="preserve">(</w:t>
       </w:r>
       <w:r>
         <w:rPr>
@@ -86,34 +86,43 @@
         <w:t xml:space="preserve">Colobus guereza</w:t>
       </w:r>
       <w:r>
-        <w:t xml:space="preserve"> </w:t>
-      </w:r>
-      <w:r>
-        <w:t xml:space="preserve">—</w:t>
-      </w:r>
-      <w:r>
-        <w:t xml:space="preserve"> </w:t>
-      </w:r>
-      <w:r>
-        <w:t xml:space="preserve">in long field recordings from Makokou, Gabon. A four-class model is built by</w:t>
-      </w:r>
-      <w:r>
-        <w:t xml:space="preserve"> </w:t>
-      </w:r>
-      <w:r>
-        <w:t xml:space="preserve">pooling all putty-nosed call types into a single Cernic class at the training</w:t>
-      </w:r>
-      <w:r>
-        <w:t xml:space="preserve"> </w:t>
-      </w:r>
-      <w:r>
-        <w:t xml:space="preserve">level (so no softmax summation is needed at detection time) and by adding a</w:t>
-      </w:r>
-      <w:r>
-        <w:t xml:space="preserve"> </w:t>
-      </w:r>
-      <w:r>
-        <w:t xml:space="preserve">dedicated hard-negative</w:t>
+        <w:t xml:space="preserve">, in long field</w:t>
+      </w:r>
+      <w:r>
+        <w:t xml:space="preserve"> </w:t>
+      </w:r>
+      <w:r>
+        <w:t xml:space="preserve">recordings from Makokou, Gabon. Two-second mel-spectrogram windows are</w:t>
+      </w:r>
+      <w:r>
+        <w:t xml:space="preserve"> </w:t>
+      </w:r>
+      <w:r>
+        <w:t xml:space="preserve">classified by a frequency-position-aware CRNN head on a VGG19 backbone, trained</w:t>
+      </w:r>
+      <w:r>
+        <w:t xml:space="preserve"> </w:t>
+      </w:r>
+      <w:r>
+        <w:t xml:space="preserve">in two transfer-learning stages on human-verified clips. Two design choices</w:t>
+      </w:r>
+      <w:r>
+        <w:t xml:space="preserve"> </w:t>
+      </w:r>
+      <w:r>
+        <w:t xml:space="preserve">target precision in real soundscapes. First, all putty-nosed call types are</w:t>
+      </w:r>
+      <w:r>
+        <w:t xml:space="preserve"> </w:t>
+      </w:r>
+      <w:r>
+        <w:t xml:space="preserve">pooled into a single class during training, so presence is read directly from</w:t>
+      </w:r>
+      <w:r>
+        <w:t xml:space="preserve"> </w:t>
+      </w:r>
+      <w:r>
+        <w:t xml:space="preserve">one output without summing softmax scores. Second, a dedicated hard-negative</w:t>
       </w:r>
       <w:r>
         <w:t xml:space="preserve"> </w:t>
@@ -125,13 +134,13 @@
         <w:t xml:space="preserve"> </w:t>
       </w:r>
       <w:r>
-        <w:t xml:space="preserve">class for a forest sound that the detector</w:t>
-      </w:r>
-      <w:r>
-        <w:t xml:space="preserve"> </w:t>
-      </w:r>
-      <w:r>
-        <w:t xml:space="preserve">repeatedly mistakes for</w:t>
+        <w:t xml:space="preserve">class absorbs a low-frequency forest sound that the detector</w:t>
+      </w:r>
+      <w:r>
+        <w:t xml:space="preserve"> </w:t>
+      </w:r>
+      <w:r>
+        <w:t xml:space="preserve">otherwise mistakes for</w:t>
       </w:r>
       <w:r>
         <w:t xml:space="preserve"> </w:t>
@@ -144,107 +153,31 @@
         <w:t xml:space="preserve">Colobus</w:t>
       </w:r>
       <w:r>
-        <w:t xml:space="preserve">. Two-second audio windows — with</w:t>
-      </w:r>
-      <w:r>
-        <w:t xml:space="preserve"> </w:t>
-      </w:r>
-      <w:r>
-        <w:t xml:space="preserve">short clips embedded in real background noise and longer clips trimmed to their</w:t>
-      </w:r>
-      <w:r>
-        <w:t xml:space="preserve"> </w:t>
-      </w:r>
-      <w:r>
-        <w:t xml:space="preserve">highest-energy window — are converted to mel-spectrogram images and</w:t>
-      </w:r>
-      <w:r>
-        <w:t xml:space="preserve"> </w:t>
-      </w:r>
-      <w:r>
-        <w:t xml:space="preserve">classified by a frequency-position-aware temporal-frequency CRNN head attached</w:t>
-      </w:r>
-      <w:r>
-        <w:t xml:space="preserve"> </w:t>
-      </w:r>
-      <w:r>
-        <w:t xml:space="preserve">to a VGG19 backbone: an explicit frequency-coordinate channel is fused into the</w:t>
-      </w:r>
-      <w:r>
-        <w:t xml:space="preserve"> </w:t>
-      </w:r>
-      <w:r>
-        <w:t xml:space="preserve">feature map so the head knows</w:t>
-      </w:r>
-      <w:r>
-        <w:t xml:space="preserve"> </w:t>
-      </w:r>
-      <w:r>
-        <w:rPr>
-          <w:i/>
-          <w:iCs/>
-        </w:rPr>
-        <w:t xml:space="preserve">where</w:t>
-      </w:r>
-      <w:r>
-        <w:t xml:space="preserve"> </w:t>
-      </w:r>
-      <w:r>
-        <w:t xml:space="preserve">in frequency a call sits, after which</w:t>
-      </w:r>
-      <w:r>
-        <w:t xml:space="preserve"> </w:t>
-      </w:r>
-      <w:r>
-        <w:t xml:space="preserve">the map is split into four frequency bands, processed by per-band and cross-band</w:t>
-      </w:r>
-      <w:r>
-        <w:t xml:space="preserve"> </w:t>
-      </w:r>
-      <w:r>
-        <w:t xml:space="preserve">convolutions, and fed through a bidirectional LSTM to capture spectro-temporal</w:t>
-      </w:r>
-      <w:r>
-        <w:t xml:space="preserve"> </w:t>
-      </w:r>
-      <w:r>
-        <w:t xml:space="preserve">structure. Two-stage training (frozen base then partial fine-tuning) on</w:t>
-      </w:r>
-      <w:r>
-        <w:t xml:space="preserve"> </w:t>
-      </w:r>
-      <w:r>
-        <w:t xml:space="preserve">human-verified, label-audited clips reaches 98% validation accuracy with</w:t>
-      </w:r>
-      <w:r>
-        <w:t xml:space="preserve"> </w:t>
-      </w:r>
-      <w:r>
-        <w:t xml:space="preserve">near-zero confusion between the two primate classes. At detection time the</w:t>
-      </w:r>
-      <w:r>
-        <w:t xml:space="preserve"> </w:t>
-      </w:r>
-      <w:r>
-        <w:t xml:space="preserve">confuser class is folded into the background group so it never produces a</w:t>
-      </w:r>
-      <w:r>
-        <w:t xml:space="preserve"> </w:t>
-      </w:r>
-      <w:r>
-        <w:t xml:space="preserve">detection. An automatic three-filter cleanup additionally flags suspicious</w:t>
-      </w:r>
-      <w:r>
-        <w:t xml:space="preserve"> </w:t>
-      </w:r>
-      <w:r>
-        <w:t xml:space="preserve">detections, and confirmed false positives are recycled as hard negatives for</w:t>
-      </w:r>
-      <w:r>
-        <w:t xml:space="preserve"> </w:t>
-      </w:r>
-      <w:r>
-        <w:t xml:space="preserve">iterative retraining.</w:t>
+        <w:t xml:space="preserve">. The model reaches 98% validation</w:t>
+      </w:r>
+      <w:r>
+        <w:t xml:space="preserve"> </w:t>
+      </w:r>
+      <w:r>
+        <w:t xml:space="preserve">accuracy with zero confusion between the two primate classes. At detection time</w:t>
+      </w:r>
+      <w:r>
+        <w:t xml:space="preserve"> </w:t>
+      </w:r>
+      <w:r>
+        <w:t xml:space="preserve">the confuser class is folded into background, a low-frequency energy gate</w:t>
+      </w:r>
+      <w:r>
+        <w:t xml:space="preserve"> </w:t>
+      </w:r>
+      <w:r>
+        <w:t xml:space="preserve">removes high-frequency false positives, and an automatic three-filter cleanup</w:t>
+      </w:r>
+      <w:r>
+        <w:t xml:space="preserve"> </w:t>
+      </w:r>
+      <w:r>
+        <w:t xml:space="preserve">recycles confirmed false positives as hard negatives for iterative retraining.</w:t>
       </w:r>
     </w:p>
     <w:p>
@@ -308,13 +241,13 @@
         <w:t xml:space="preserve"> </w:t>
       </w:r>
       <w:r>
-        <w:t xml:space="preserve">false positives — in particular</w:t>
-      </w:r>
-      <w:r>
-        <w:t xml:space="preserve"> </w:t>
-      </w:r>
-      <w:r>
-        <w:t xml:space="preserve">high-frequency bird and insect sounds — without manual listening.</w:t>
+        <w:t xml:space="preserve">false positives (notably high-frequency</w:t>
+      </w:r>
+      <w:r>
+        <w:t xml:space="preserve"> </w:t>
+      </w:r>
+      <w:r>
+        <w:t xml:space="preserve">bird and insect sounds) without manual listening.</w:t>
       </w:r>
     </w:p>
     <w:p>

</xml_diff>

<commit_message>
Trim abstract to 181 words and remove technical steps
MethodsX method-article template caps the abstract (prose + bullets) at
200 words and asks authors to outline the method without technical steps.
Previous version was 226 words and described step-level mechanics.

- Prose now states problem (precision), what the pipeline does, and the
  result — no mel-spectrogram/CRNN/softmax/gate mechanics (those live in
  Method details)
- Bullets carry the named technical contributions at a high level
- Total: 122 (prose) + 59 (bullets) = 181 words

https://claude.ai/code/session_01GRhKW3iKJjm2wYYeUd56Hq
</commit_message>
<xml_diff>
--- a/paper/methodsx_manuscript.docx
+++ b/paper/methodsx_manuscript.docx
@@ -51,19 +51,31 @@
         <w:t xml:space="preserve"> </w:t>
       </w:r>
       <w:r>
-        <w:t xml:space="preserve">audio that are infeasible to annotate by hand. We describe an end-to-end</w:t>
-      </w:r>
-      <w:r>
-        <w:t xml:space="preserve"> </w:t>
-      </w:r>
-      <w:r>
-        <w:t xml:space="preserve">pipeline that detects two primate species, the putty-nosed monkey</w:t>
-      </w:r>
-      <w:r>
-        <w:t xml:space="preserve"> </w:t>
-      </w:r>
-      <w:r>
-        <w:t xml:space="preserve">(</w:t>
+        <w:t xml:space="preserve">audio that are infeasible to annotate by hand. The practical obstacle is</w:t>
+      </w:r>
+      <w:r>
+        <w:t xml:space="preserve"> </w:t>
+      </w:r>
+      <w:r>
+        <w:t xml:space="preserve">precision: a classifier trained on clean reference clips also fires on the</w:t>
+      </w:r>
+      <w:r>
+        <w:t xml:space="preserve"> </w:t>
+      </w:r>
+      <w:r>
+        <w:t xml:space="preserve">many non-target forest sounds absent from training, so every detection must be</w:t>
+      </w:r>
+      <w:r>
+        <w:t xml:space="preserve"> </w:t>
+      </w:r>
+      <w:r>
+        <w:t xml:space="preserve">checked by ear. We describe an end-to-end pipeline that detects two primate</w:t>
+      </w:r>
+      <w:r>
+        <w:t xml:space="preserve"> </w:t>
+      </w:r>
+      <w:r>
+        <w:t xml:space="preserve">species, the putty-nosed monkey (</w:t>
       </w:r>
       <w:r>
         <w:rPr>
@@ -86,98 +98,37 @@
         <w:t xml:space="preserve">Colobus guereza</w:t>
       </w:r>
       <w:r>
-        <w:t xml:space="preserve">, in long field</w:t>
-      </w:r>
-      <w:r>
-        <w:t xml:space="preserve"> </w:t>
-      </w:r>
-      <w:r>
-        <w:t xml:space="preserve">recordings from Makokou, Gabon. Two-second mel-spectrogram windows are</w:t>
-      </w:r>
-      <w:r>
-        <w:t xml:space="preserve"> </w:t>
-      </w:r>
-      <w:r>
-        <w:t xml:space="preserve">classified by a frequency-position-aware CRNN head on a VGG19 backbone, trained</w:t>
-      </w:r>
-      <w:r>
-        <w:t xml:space="preserve"> </w:t>
-      </w:r>
-      <w:r>
-        <w:t xml:space="preserve">in two transfer-learning stages on human-verified clips. Two design choices</w:t>
-      </w:r>
-      <w:r>
-        <w:t xml:space="preserve"> </w:t>
-      </w:r>
-      <w:r>
-        <w:t xml:space="preserve">target precision in real soundscapes. First, all putty-nosed call types are</w:t>
-      </w:r>
-      <w:r>
-        <w:t xml:space="preserve"> </w:t>
-      </w:r>
-      <w:r>
-        <w:t xml:space="preserve">pooled into a single class during training, so presence is read directly from</w:t>
-      </w:r>
-      <w:r>
-        <w:t xml:space="preserve"> </w:t>
-      </w:r>
-      <w:r>
-        <w:t xml:space="preserve">one output without summing softmax scores. Second, a dedicated hard-negative</w:t>
-      </w:r>
-      <w:r>
-        <w:t xml:space="preserve"> </w:t>
-      </w:r>
-      <w:r>
-        <w:t xml:space="preserve">“confuser”</w:t>
-      </w:r>
-      <w:r>
-        <w:t xml:space="preserve"> </w:t>
-      </w:r>
-      <w:r>
-        <w:t xml:space="preserve">class absorbs a low-frequency forest sound that the detector</w:t>
-      </w:r>
-      <w:r>
-        <w:t xml:space="preserve"> </w:t>
-      </w:r>
-      <w:r>
-        <w:t xml:space="preserve">otherwise mistakes for</w:t>
-      </w:r>
-      <w:r>
-        <w:t xml:space="preserve"> </w:t>
-      </w:r>
-      <w:r>
-        <w:rPr>
-          <w:i/>
-          <w:iCs/>
-        </w:rPr>
-        <w:t xml:space="preserve">Colobus</w:t>
-      </w:r>
-      <w:r>
-        <w:t xml:space="preserve">. The model reaches 98% validation</w:t>
-      </w:r>
-      <w:r>
-        <w:t xml:space="preserve"> </w:t>
-      </w:r>
-      <w:r>
-        <w:t xml:space="preserve">accuracy with zero confusion between the two primate classes. At detection time</w:t>
-      </w:r>
-      <w:r>
-        <w:t xml:space="preserve"> </w:t>
-      </w:r>
-      <w:r>
-        <w:t xml:space="preserve">the confuser class is folded into background, a low-frequency energy gate</w:t>
-      </w:r>
-      <w:r>
-        <w:t xml:space="preserve"> </w:t>
-      </w:r>
-      <w:r>
-        <w:t xml:space="preserve">removes high-frequency false positives, and an automatic three-filter cleanup</w:t>
-      </w:r>
-      <w:r>
-        <w:t xml:space="preserve"> </w:t>
-      </w:r>
-      <w:r>
-        <w:t xml:space="preserve">recycles confirmed false positives as hard negatives for iterative retraining.</w:t>
+        <w:t xml:space="preserve">, in long field recordings from Makokou, Gabon, while</w:t>
+      </w:r>
+      <w:r>
+        <w:t xml:space="preserve"> </w:t>
+      </w:r>
+      <w:r>
+        <w:t xml:space="preserve">keeping manual listening close to zero. A transfer-learning classifier is</w:t>
+      </w:r>
+      <w:r>
+        <w:t xml:space="preserve"> </w:t>
+      </w:r>
+      <w:r>
+        <w:t xml:space="preserve">paired with targeted controls that suppress each species’ characteristic false</w:t>
+      </w:r>
+      <w:r>
+        <w:t xml:space="preserve"> </w:t>
+      </w:r>
+      <w:r>
+        <w:t xml:space="preserve">positives and with an automatic cleanup loop that recycles confirmed errors</w:t>
+      </w:r>
+      <w:r>
+        <w:t xml:space="preserve"> </w:t>
+      </w:r>
+      <w:r>
+        <w:t xml:space="preserve">back into training. The method reaches 98% validation accuracy with zero</w:t>
+      </w:r>
+      <w:r>
+        <w:t xml:space="preserve"> </w:t>
+      </w:r>
+      <w:r>
+        <w:t xml:space="preserve">confusion between the two primate species.</w:t>
       </w:r>
     </w:p>
     <w:p>
@@ -189,13 +140,19 @@
         </w:numPr>
       </w:pPr>
       <w:r>
-        <w:t xml:space="preserve">A frequency-position-aware temporal-frequency CRNN head on a VGG19</w:t>
-      </w:r>
-      <w:r>
-        <w:t xml:space="preserve"> </w:t>
-      </w:r>
-      <w:r>
-        <w:t xml:space="preserve">backbone for primate call detection with two-stage transfer learning.</w:t>
+        <w:t xml:space="preserve">A two-stage transfer-learning classifier (VGG19 backbone with a</w:t>
+      </w:r>
+      <w:r>
+        <w:t xml:space="preserve"> </w:t>
+      </w:r>
+      <w:r>
+        <w:t xml:space="preserve">frequency-position-aware recurrent head) for detecting primate calls in</w:t>
+      </w:r>
+      <w:r>
+        <w:t xml:space="preserve"> </w:t>
+      </w:r>
+      <w:r>
+        <w:t xml:space="preserve">continuous field recordings.</w:t>
       </w:r>
     </w:p>
     <w:p>
@@ -207,47 +164,19 @@
         </w:numPr>
       </w:pPr>
       <w:r>
-        <w:t xml:space="preserve">A frequency-coordinate (CoordConv) channel, a dedicated hard-negative</w:t>
-      </w:r>
-      <w:r>
-        <w:t xml:space="preserve"> </w:t>
-      </w:r>
-      <w:r>
-        <w:t xml:space="preserve">“confuser”</w:t>
-      </w:r>
-      <w:r>
-        <w:t xml:space="preserve"> </w:t>
-      </w:r>
-      <w:r>
-        <w:t xml:space="preserve">class, and a targeted high-frequency nuisance augmentation that</w:t>
-      </w:r>
-      <w:r>
-        <w:t xml:space="preserve"> </w:t>
-      </w:r>
-      <w:r>
-        <w:t xml:space="preserve">together suppress</w:t>
-      </w:r>
-      <w:r>
-        <w:t xml:space="preserve"> </w:t>
-      </w:r>
-      <w:r>
-        <w:rPr>
-          <w:i/>
-          <w:iCs/>
-        </w:rPr>
-        <w:t xml:space="preserve">Colobus</w:t>
-      </w:r>
-      <w:r>
-        <w:t xml:space="preserve"> </w:t>
-      </w:r>
-      <w:r>
-        <w:t xml:space="preserve">false positives (notably high-frequency</w:t>
-      </w:r>
-      <w:r>
-        <w:t xml:space="preserve"> </w:t>
-      </w:r>
-      <w:r>
-        <w:t xml:space="preserve">bird and insect sounds) without manual listening.</w:t>
+        <w:t xml:space="preserve">Three targeted controls (a dedicated hard-negative class, a</w:t>
+      </w:r>
+      <w:r>
+        <w:t xml:space="preserve"> </w:t>
+      </w:r>
+      <w:r>
+        <w:t xml:space="preserve">frequency-position encoding, and a high-frequency nuisance augmentation) that</w:t>
+      </w:r>
+      <w:r>
+        <w:t xml:space="preserve"> </w:t>
+      </w:r>
+      <w:r>
+        <w:t xml:space="preserve">suppress species-specific false positives without manual listening.</w:t>
       </w:r>
     </w:p>
     <w:p>
@@ -259,7 +188,7 @@
         </w:numPr>
       </w:pPr>
       <w:r>
-        <w:t xml:space="preserve">An automatic three-filter cleanup pipeline that feeds confirmed false</w:t>
+        <w:t xml:space="preserve">An automatic three-filter cleanup loop that feeds confirmed false</w:t>
       </w:r>
       <w:r>
         <w:t xml:space="preserve"> </w:t>

</xml_diff>

<commit_message>
Shorten "Name of your method" to a concise handle
Published MethodsX examples (e.g. "CNN-LULC Predictor") use a short
method name, not a full sentence. Replace the one-sentence description
with "CRNN Primate-Call Detector"; the full mechanism is already in
Method details.

https://claude.ai/code/session_01GRhKW3iKJjm2wYYeUd56Hq
</commit_message>
<xml_diff>
--- a/paper/methodsx_manuscript.docx
+++ b/paper/methodsx_manuscript.docx
@@ -486,19 +486,7 @@
               <w:jc w:val="left"/>
             </w:pPr>
             <w:r>
-              <w:t xml:space="preserve">VGG19 frequency-position-aware temporal-frequency CRNN</w:t>
-            </w:r>
-            <w:r>
-              <w:t xml:space="preserve"> </w:t>
-            </w:r>
-            <w:r>
-              <w:t xml:space="preserve">with two-stage fine-tuning, a dedicated hard-negative confuser class, and</w:t>
-            </w:r>
-            <w:r>
-              <w:t xml:space="preserve"> </w:t>
-            </w:r>
-            <w:r>
-              <w:t xml:space="preserve">three-filter automatic false-positive cleanup for primate vocalizations</w:t>
+              <w:t xml:space="preserve">CRNN Primate-Call Detector</w:t>
             </w:r>
           </w:p>
         </w:tc>

</xml_diff>

<commit_message>
Add V12 two-stage training-curves figure
Reconstructed per-epoch accuracy/loss from the recorded V12 training log
(Stage 1: 29 epochs frozen-base head training; Stage 2: 28 epochs
fine-tuning last two VGG19 blocks). Academic style matching the confusion
matrix; dashed divider marks the stage transition; best-val-accuracy
checkpoint (98.12%) annotated.

- New figure inserted in Method validation, referenced from the
  validation-performance paragraph
- Paragraph now describes the two-stage training and checkpoint selection

https://claude.ai/code/session_01GRhKW3iKJjm2wYYeUd56Hq
</commit_message>
<xml_diff>
--- a/paper/methodsx_manuscript.docx
+++ b/paper/methodsx_manuscript.docx
@@ -3729,7 +3729,7 @@
     </w:p>
     <w:bookmarkEnd w:id="30"/>
     <w:bookmarkEnd w:id="31"/>
-    <w:bookmarkStart w:id="41" w:name="method-validation"/>
+    <w:bookmarkStart w:id="45" w:name="method-validation"/>
     <w:p>
       <w:pPr>
         <w:pStyle w:val="Heading1"/>
@@ -3780,7 +3780,7 @@
         <w:t xml:space="preserve">false-positive rate.</w:t>
       </w:r>
     </w:p>
-    <w:bookmarkStart w:id="38" w:name="validation-set-performance-v12-model."/>
+    <w:bookmarkStart w:id="42" w:name="validation-set-performance-v12-model."/>
     <w:p>
       <w:pPr>
         <w:pStyle w:val="Heading4"/>
@@ -3806,7 +3806,54 @@
         <w:t xml:space="preserve"> </w:t>
       </w:r>
       <w:r>
-        <w:t xml:space="preserve">validation split. Table </w:t>
+        <w:t xml:space="preserve">validation split. The model was trained in two stages</w:t>
+      </w:r>
+      <w:r>
+        <w:t xml:space="preserve"> </w:t>
+      </w:r>
+      <w:r>
+        <w:t xml:space="preserve">(Fig. </w:t>
+      </w:r>
+      <w:hyperlink w:anchor="fig:training">
+        <w:r>
+          <w:rPr>
+            <w:rStyle w:val="Hyperlink"/>
+          </w:rPr>
+          <w:t xml:space="preserve">1</w:t>
+        </w:r>
+      </w:hyperlink>
+      <w:r>
+        <w:t xml:space="preserve">): a frozen-base stage that trains only the</w:t>
+      </w:r>
+      <w:r>
+        <w:t xml:space="preserve"> </w:t>
+      </w:r>
+      <w:r>
+        <w:t xml:space="preserve">classifier head, followed by a fine-tuning stage in which the last two VGG19</w:t>
+      </w:r>
+      <w:r>
+        <w:t xml:space="preserve"> </w:t>
+      </w:r>
+      <w:r>
+        <w:t xml:space="preserve">blocks are unfrozen. Both stages use early stopping and learning-rate</w:t>
+      </w:r>
+      <w:r>
+        <w:t xml:space="preserve"> </w:t>
+      </w:r>
+      <w:r>
+        <w:t xml:space="preserve">reduction on a validation-accuracy plateau; the deployed checkpoint is the</w:t>
+      </w:r>
+      <w:r>
+        <w:t xml:space="preserve"> </w:t>
+      </w:r>
+      <w:r>
+        <w:t xml:space="preserve">epoch with the highest validation accuracy (98.12 %).</w:t>
+      </w:r>
+      <w:r>
+        <w:t xml:space="preserve"> </w:t>
+      </w:r>
+      <w:r>
+        <w:t xml:space="preserve">Table </w:t>
       </w:r>
       <w:hyperlink w:anchor="tab:val">
         <w:r>
@@ -3843,7 +3890,88 @@
         <w:t xml:space="preserve">gives the full confusion matrix.</w:t>
       </w:r>
     </w:p>
-    <w:bookmarkStart w:id="32" w:name="tab:val"/>
+    <w:bookmarkStart w:id="35" w:name="fig:training"/>
+    <w:p>
+      <w:pPr>
+        <w:pStyle w:val="CaptionedFigure"/>
+      </w:pPr>
+      <w:r>
+        <w:drawing>
+          <wp:inline>
+            <wp:extent cx="5334000" cy="2115910"/>
+            <wp:effectExtent b="0" l="0" r="0" t="0"/>
+            <wp:docPr descr="" title="" id="33" name="Picture"/>
+            <a:graphic>
+              <a:graphicData uri="http://schemas.openxmlformats.org/drawingml/2006/picture">
+                <pic:pic>
+                  <pic:nvPicPr>
+                    <pic:cNvPr descr="training_curves_v12.pdf" id="34" name="Picture"/>
+                    <pic:cNvPicPr>
+                      <a:picLocks noChangeArrowheads="1" noChangeAspect="1"/>
+                    </pic:cNvPicPr>
+                  </pic:nvPicPr>
+                  <pic:blipFill>
+                    <a:blip r:embed="rId32"/>
+                    <a:stretch>
+                      <a:fillRect/>
+                    </a:stretch>
+                  </pic:blipFill>
+                  <pic:spPr bwMode="auto">
+                    <a:xfrm>
+                      <a:off x="0" y="0"/>
+                      <a:ext cx="5334000" cy="2115910"/>
+                    </a:xfrm>
+                    <a:prstGeom prst="rect">
+                      <a:avLst/>
+                    </a:prstGeom>
+                    <a:noFill/>
+                    <a:ln w="9525">
+                      <a:noFill/>
+                      <a:headEnd/>
+                      <a:tailEnd/>
+                    </a:ln>
+                  </pic:spPr>
+                </pic:pic>
+              </a:graphicData>
+            </a:graphic>
+          </wp:inline>
+        </w:drawing>
+      </w:r>
+    </w:p>
+    <w:p>
+      <w:pPr>
+        <w:pStyle w:val="ImageCaption"/>
+      </w:pPr>
+      <w:r>
+        <w:t xml:space="preserve">Two-stage training history of the V12 model: training and validation</w:t>
+      </w:r>
+      <w:r>
+        <w:t xml:space="preserve"> </w:t>
+      </w:r>
+      <w:r>
+        <w:t xml:space="preserve">accuracy (left) and loss (right) per epoch. The dashed line marks the</w:t>
+      </w:r>
+      <w:r>
+        <w:t xml:space="preserve"> </w:t>
+      </w:r>
+      <w:r>
+        <w:t xml:space="preserve">transition from frozen-base head training (Stage 1) to fine-tuning of the last</w:t>
+      </w:r>
+      <w:r>
+        <w:t xml:space="preserve"> </w:t>
+      </w:r>
+      <w:r>
+        <w:t xml:space="preserve">two VGG19 blocks (Stage 2). The deployed model is the best-validation-accuracy</w:t>
+      </w:r>
+      <w:r>
+        <w:t xml:space="preserve"> </w:t>
+      </w:r>
+      <w:r>
+        <w:t xml:space="preserve">checkpoint (98.12 %).</w:t>
+      </w:r>
+    </w:p>
+    <w:bookmarkEnd w:id="35"/>
+    <w:bookmarkStart w:id="36" w:name="tab:val"/>
     <w:p>
       <w:pPr>
         <w:pStyle w:val="TableCaption"/>
@@ -4187,8 +4315,8 @@
         </w:tc>
       </w:tr>
     </w:tbl>
-    <w:bookmarkEnd w:id="32"/>
-    <w:bookmarkStart w:id="33" w:name="tab:confusion"/>
+    <w:bookmarkEnd w:id="36"/>
+    <w:bookmarkStart w:id="37" w:name="tab:confusion"/>
     <w:p>
       <w:pPr>
         <w:pStyle w:val="TableCaption"/>
@@ -4554,8 +4682,8 @@
         </w:tc>
       </w:tr>
     </w:tbl>
-    <w:bookmarkEnd w:id="33"/>
-    <w:bookmarkStart w:id="37" w:name="fig:confusion"/>
+    <w:bookmarkEnd w:id="37"/>
+    <w:bookmarkStart w:id="41" w:name="fig:confusion"/>
     <w:p>
       <w:pPr>
         <w:pStyle w:val="CaptionedFigure"/>
@@ -4565,18 +4693,18 @@
           <wp:inline>
             <wp:extent cx="3467100" cy="2929699"/>
             <wp:effectExtent b="0" l="0" r="0" t="0"/>
-            <wp:docPr descr="" title="" id="35" name="Picture"/>
+            <wp:docPr descr="" title="" id="39" name="Picture"/>
             <a:graphic>
               <a:graphicData uri="http://schemas.openxmlformats.org/drawingml/2006/picture">
                 <pic:pic>
                   <pic:nvPicPr>
-                    <pic:cNvPr descr="confusion_matrix_v12.pdf" id="36" name="Picture"/>
+                    <pic:cNvPr descr="confusion_matrix_v12.pdf" id="40" name="Picture"/>
                     <pic:cNvPicPr>
                       <a:picLocks noChangeArrowheads="1" noChangeAspect="1"/>
                     </pic:cNvPicPr>
                   </pic:nvPicPr>
                   <pic:blipFill>
-                    <a:blip r:embed="rId34"/>
+                    <a:blip r:embed="rId38"/>
                     <a:stretch>
                       <a:fillRect/>
                     </a:stretch>
@@ -4656,7 +4784,7 @@
         <w:t xml:space="preserve">is exactly zero.</w:t>
       </w:r>
     </w:p>
-    <w:bookmarkEnd w:id="37"/>
+    <w:bookmarkEnd w:id="41"/>
     <w:p>
       <w:pPr>
         <w:pStyle w:val="BodyText"/>
@@ -4675,7 +4803,7 @@
           <w:rPr>
             <w:rStyle w:val="Hyperlink"/>
           </w:rPr>
-          <w:t xml:space="preserve">1</w:t>
+          <w:t xml:space="preserve">2</w:t>
         </w:r>
       </w:hyperlink>
       <w:r>
@@ -4880,8 +5008,8 @@
         <w:t xml:space="preserve">high-frequency shortcut that previously caused Cernic–confuser confusion.</w:t>
       </w:r>
     </w:p>
-    <w:bookmarkEnd w:id="38"/>
-    <w:bookmarkStart w:id="39" w:name="field-deployment."/>
+    <w:bookmarkEnd w:id="42"/>
+    <w:bookmarkStart w:id="43" w:name="field-deployment."/>
     <w:p>
       <w:pPr>
         <w:pStyle w:val="Heading4"/>
@@ -5043,8 +5171,8 @@
         <w:t xml:space="preserve">all stations have been processed.</w:t>
       </w:r>
     </w:p>
-    <w:bookmarkEnd w:id="39"/>
-    <w:bookmarkStart w:id="40" w:name="Xfd7e2a660e56df99e009fb7f8d0a1a9ea97b8e1"/>
+    <w:bookmarkEnd w:id="43"/>
+    <w:bookmarkStart w:id="44" w:name="Xfd7e2a660e56df99e009fb7f8d0a1a9ea97b8e1"/>
     <w:p>
       <w:pPr>
         <w:pStyle w:val="Heading4"/>
@@ -5309,9 +5437,9 @@
         <w:t xml:space="preserve">deployed across all stations.</w:t>
       </w:r>
     </w:p>
-    <w:bookmarkEnd w:id="40"/>
-    <w:bookmarkEnd w:id="41"/>
-    <w:bookmarkStart w:id="42" w:name="limitations"/>
+    <w:bookmarkEnd w:id="44"/>
+    <w:bookmarkEnd w:id="45"/>
+    <w:bookmarkStart w:id="46" w:name="limitations"/>
     <w:p>
       <w:pPr>
         <w:pStyle w:val="Heading1"/>
@@ -5774,8 +5902,8 @@
         <w:t xml:space="preserve">assumptions.</w:t>
       </w:r>
     </w:p>
-    <w:bookmarkEnd w:id="42"/>
-    <w:bookmarkStart w:id="43" w:name="ethics-statements"/>
+    <w:bookmarkEnd w:id="46"/>
+    <w:bookmarkStart w:id="47" w:name="ethics-statements"/>
     <w:p>
       <w:pPr>
         <w:pStyle w:val="Heading1"/>
@@ -5828,8 +5956,8 @@
         <w:t xml:space="preserve">guidelines for non-invasive field research.]</w:t>
       </w:r>
     </w:p>
-    <w:bookmarkEnd w:id="43"/>
-    <w:bookmarkStart w:id="44" w:name="credit-author-statement"/>
+    <w:bookmarkEnd w:id="47"/>
+    <w:bookmarkStart w:id="48" w:name="credit-author-statement"/>
     <w:p>
       <w:pPr>
         <w:pStyle w:val="Heading1"/>
@@ -5884,8 +6012,8 @@
         <w:t xml:space="preserve">editing, Funding acquisition].</w:t>
       </w:r>
     </w:p>
-    <w:bookmarkEnd w:id="44"/>
-    <w:bookmarkStart w:id="45" w:name="acknowledgments"/>
+    <w:bookmarkEnd w:id="48"/>
+    <w:bookmarkStart w:id="49" w:name="acknowledgments"/>
     <w:p>
       <w:pPr>
         <w:pStyle w:val="Heading1"/>
@@ -5920,8 +6048,8 @@
         <w:t xml:space="preserve">commercial, or not-for-profit sectors.</w:t>
       </w:r>
     </w:p>
-    <w:bookmarkEnd w:id="45"/>
-    <w:bookmarkStart w:id="46" w:name="declaration-of-interests"/>
+    <w:bookmarkEnd w:id="49"/>
+    <w:bookmarkStart w:id="50" w:name="declaration-of-interests"/>
     <w:p>
       <w:pPr>
         <w:pStyle w:val="Heading1"/>
@@ -5986,8 +6114,8 @@
         <w:t xml:space="preserve">competing interests:</w:t>
       </w:r>
     </w:p>
-    <w:bookmarkEnd w:id="46"/>
-    <w:bookmarkStart w:id="47" w:name="data-availability"/>
+    <w:bookmarkEnd w:id="50"/>
+    <w:bookmarkStart w:id="51" w:name="data-availability"/>
     <w:p>
       <w:pPr>
         <w:pStyle w:val="Heading1"/>
@@ -6063,8 +6191,8 @@
         <w:t xml:space="preserve">.]</w:t>
       </w:r>
     </w:p>
-    <w:bookmarkEnd w:id="47"/>
-    <w:bookmarkStart w:id="57" w:name="Xcca0bcaed302a7900b6627b02d68ebe31e9e060"/>
+    <w:bookmarkEnd w:id="51"/>
+    <w:bookmarkStart w:id="61" w:name="Xcca0bcaed302a7900b6627b02d68ebe31e9e060"/>
     <w:p>
       <w:pPr>
         <w:pStyle w:val="Heading1"/>
@@ -6132,7 +6260,7 @@
       <w:r>
         <w:t xml:space="preserve"> </w:t>
       </w:r>
-      <w:hyperlink r:id="rId48">
+      <w:hyperlink r:id="rId52">
         <w:r>
           <w:rPr>
             <w:rStyle w:val="Hyperlink"/>
@@ -6163,7 +6291,7 @@
       <w:r>
         <w:t xml:space="preserve"> </w:t>
       </w:r>
-      <w:hyperlink r:id="rId49">
+      <w:hyperlink r:id="rId53">
         <w:r>
           <w:rPr>
             <w:rStyle w:val="Hyperlink"/>
@@ -6194,7 +6322,7 @@
       <w:r>
         <w:t xml:space="preserve"> </w:t>
       </w:r>
-      <w:hyperlink r:id="rId50">
+      <w:hyperlink r:id="rId54">
         <w:r>
           <w:rPr>
             <w:rStyle w:val="Hyperlink"/>
@@ -6225,7 +6353,7 @@
       <w:r>
         <w:t xml:space="preserve"> </w:t>
       </w:r>
-      <w:hyperlink r:id="rId51">
+      <w:hyperlink r:id="rId55">
         <w:r>
           <w:rPr>
             <w:rStyle w:val="Hyperlink"/>
@@ -6262,7 +6390,7 @@
       <w:r>
         <w:t xml:space="preserve"> </w:t>
       </w:r>
-      <w:hyperlink r:id="rId52">
+      <w:hyperlink r:id="rId56">
         <w:r>
           <w:rPr>
             <w:rStyle w:val="Hyperlink"/>
@@ -6305,7 +6433,7 @@
       <w:r>
         <w:t xml:space="preserve"> </w:t>
       </w:r>
-      <w:hyperlink r:id="rId53">
+      <w:hyperlink r:id="rId57">
         <w:r>
           <w:rPr>
             <w:rStyle w:val="Hyperlink"/>
@@ -6336,7 +6464,7 @@
       <w:r>
         <w:t xml:space="preserve"> </w:t>
       </w:r>
-      <w:hyperlink r:id="rId54">
+      <w:hyperlink r:id="rId58">
         <w:r>
           <w:rPr>
             <w:rStyle w:val="Hyperlink"/>
@@ -6373,7 +6501,7 @@
       <w:r>
         <w:t xml:space="preserve"> </w:t>
       </w:r>
-      <w:hyperlink r:id="rId55">
+      <w:hyperlink r:id="rId59">
         <w:r>
           <w:rPr>
             <w:rStyle w:val="Hyperlink"/>
@@ -6404,7 +6532,7 @@
       <w:r>
         <w:t xml:space="preserve"> </w:t>
       </w:r>
-      <w:hyperlink r:id="rId56">
+      <w:hyperlink r:id="rId60">
         <w:r>
           <w:rPr>
             <w:rStyle w:val="Hyperlink"/>
@@ -6413,7 +6541,7 @@
         </w:r>
       </w:hyperlink>
     </w:p>
-    <w:bookmarkEnd w:id="57"/>
+    <w:bookmarkEnd w:id="61"/>
     <w:sectPr>
       <w:footnotePr>
         <w:numRestart w:val="eachSect"/>

</xml_diff>

<commit_message>
Reword title: application-forward, keep both method points
"Transfer-learning detection of primate vocalizations in tropical-forest
recordings with automatic false-positive cleanup" (13 words). Leads with
the task, ends with the distinctive contribution; less modifier-heavy than
the previous phrasing. Keeps transfer learning + auto cleanup.

https://claude.ai/code/session_01GRhKW3iKJjm2wYYeUd56Hq
</commit_message>
<xml_diff>
--- a/paper/methodsx_manuscript.docx
+++ b/paper/methodsx_manuscript.docx
@@ -7,13 +7,13 @@
         <w:pStyle w:val="Title"/>
       </w:pPr>
       <w:r>
-        <w:t xml:space="preserve">A transfer-learning pipeline with automatic false-positive cleanup</w:t>
-      </w:r>
-      <w:r>
-        <w:t xml:space="preserve"> </w:t>
-      </w:r>
-      <w:r>
-        <w:t xml:space="preserve">for detecting primate vocalizations in tropical-forest recordings</w:t>
+        <w:t xml:space="preserve">Transfer-learning detection of primate vocalizations in</w:t>
+      </w:r>
+      <w:r>
+        <w:t xml:space="preserve"> </w:t>
+      </w:r>
+      <w:r>
+        <w:t xml:space="preserve">tropical-forest recordings with automatic false-positive cleanup</w:t>
       </w:r>
     </w:p>
     <w:p>

</xml_diff>

<commit_message>
Trim keywords from 9 to 7 (MethodsX Guide caps at 7)
Remove "Mel-spectrogram" and "Out-of-distribution detection" (the two most
secondary terms). The remaining 7 satisfy both the template (no maximum) and
the Guide for Authors (1-7), and won't trip the submission system's limit.

https://claude.ai/code/session_01GRhKW3iKJjm2wYYeUd56Hq
</commit_message>
<xml_diff>
--- a/paper/methodsx_manuscript.docx
+++ b/paper/methodsx_manuscript.docx
@@ -208,13 +208,7 @@
         <w:t xml:space="preserve"> </w:t>
       </w:r>
       <w:r>
-        <w:t xml:space="preserve">Convolutional recurrent neural network ,Mel-spectrogram ,</w:t>
-      </w:r>
-      <w:r>
-        <w:t xml:space="preserve"> </w:t>
-      </w:r>
-      <w:r>
-        <w:t xml:space="preserve">False-positive filtering ,Out-of-distribution detection ,</w:t>
+        <w:t xml:space="preserve">Convolutional recurrent neural network ,False-positive filtering ,</w:t>
       </w:r>
       <w:r>
         <w:t xml:space="preserve"> </w:t>

</xml_diff>

<commit_message>
Refine Specifications table and attribute augmentation
- More specific subject area: add "deep learning" to surface the AI/ML angle
  (top-level subject area stays Agricultural and Biological Sciences, per the
  application-domain convention used by published MethodsX examples)
- Name and reference of original method: add CoordConv (Liu et al., 2018) as
  the basis for the frequency-position encoding, and Sun et al. (2022) as the
  source of the spectrogram data-augmentation pipeline; rewrite all entries
  as "method (Author, Year)" for readability while keeping \cite links
- §3 Data augmentation: attribute the augmentation operations to Sun et al.
  (2022), matching the source recorded in src/augmentation.py

https://claude.ai/code/session_01GRhKW3iKJjm2wYYeUd56Hq
</commit_message>
<xml_diff>
--- a/paper/methodsx_manuscript.docx
+++ b/paper/methodsx_manuscript.docx
@@ -454,7 +454,7 @@
               <w:t xml:space="preserve"> </w:t>
             </w:r>
             <w:r>
-              <w:t xml:space="preserve">conservation biology</w:t>
+              <w:t xml:space="preserve">deep learning; conservation biology</w:t>
             </w:r>
           </w:p>
         </w:tc>
@@ -512,31 +512,55 @@
               <w:t xml:space="preserve"> </w:t>
             </w:r>
             <w:r>
-              <w:t xml:space="preserve">architecture</w:t>
+              <w:t xml:space="preserve">architecture (Simonyan &amp; Zisserman, 2015)</w:t>
             </w:r>
             <w:r>
               <w:t xml:space="preserve"> </w:t>
             </w:r>
             <w:r>
-              <w:t xml:space="preserve">; out-of-distribution detection via the</w:t>
+              <w:t xml:space="preserve">; frequency-position</w:t>
             </w:r>
             <w:r>
               <w:t xml:space="preserve"> </w:t>
             </w:r>
             <w:r>
-              <w:t xml:space="preserve">Mahalanobis distance</w:t>
+              <w:t xml:space="preserve">encoding adapted from CoordConv (Liu et al., 2018)</w:t>
             </w:r>
             <w:r>
               <w:t xml:space="preserve"> </w:t>
             </w:r>
             <w:r>
-              <w:t xml:space="preserve">; audio event tagging with YAMNet trained</w:t>
+              <w:t xml:space="preserve">; spectrogram</w:t>
             </w:r>
             <w:r>
               <w:t xml:space="preserve"> </w:t>
             </w:r>
             <w:r>
-              <w:t xml:space="preserve">on AudioSet</w:t>
+              <w:t xml:space="preserve">data augmentation adapted from a rainforest-CNN pipeline (Sun et al., 2022)</w:t>
+            </w:r>
+            <w:r>
+              <w:t xml:space="preserve"> </w:t>
+            </w:r>
+            <w:r>
+              <w:t xml:space="preserve">; out-of-distribution detection via the Mahalanobis distance</w:t>
+            </w:r>
+            <w:r>
+              <w:t xml:space="preserve"> </w:t>
+            </w:r>
+            <w:r>
+              <w:t xml:space="preserve">(Lee et al., 2018)</w:t>
+            </w:r>
+            <w:r>
+              <w:t xml:space="preserve"> </w:t>
+            </w:r>
+            <w:r>
+              <w:t xml:space="preserve">; audio event tagging with YAMNet trained on</w:t>
+            </w:r>
+            <w:r>
+              <w:t xml:space="preserve"> </w:t>
+            </w:r>
+            <w:r>
+              <w:t xml:space="preserve">AudioSet (Gemmeke et al., 2017; Hershey et al., 2017)</w:t>
             </w:r>
             <w:r>
               <w:t xml:space="preserve"> </w:t>
@@ -1728,19 +1752,22 @@
         <w:t xml:space="preserve"> </w:t>
       </w:r>
       <w:r>
-        <w:t xml:space="preserve">the true diversity of ambient sound rather than synthetic variants. The</w:t>
-      </w:r>
-      <w:r>
-        <w:t xml:space="preserve"> </w:t>
-      </w:r>
-      <w:r>
-        <w:t xml:space="preserve">augmentation operations are spectrogram-domain analogues of standard</w:t>
-      </w:r>
-      <w:r>
-        <w:t xml:space="preserve"> </w:t>
-      </w:r>
-      <w:r>
-        <w:t xml:space="preserve">spectrogram-domain masking and mixing techniques.</w:t>
+        <w:t xml:space="preserve">the true diversity of ambient sound rather than synthetic variants. These</w:t>
+      </w:r>
+      <w:r>
+        <w:t xml:space="preserve"> </w:t>
+      </w:r>
+      <w:r>
+        <w:t xml:space="preserve">spectrogram-domain operations are adapted from the rainforest-CNN</w:t>
+      </w:r>
+      <w:r>
+        <w:t xml:space="preserve"> </w:t>
+      </w:r>
+      <w:r>
+        <w:t xml:space="preserve">data-augmentation pipeline of Sun et al. </w:t>
+      </w:r>
+      <w:r>
+        <w:t xml:space="preserve">.</w:t>
       </w:r>
     </w:p>
     <w:bookmarkStart w:id="16" w:name="X877d4525f2ce6283914e1771e5b4ee23a60ca6f"/>

</xml_diff>

<commit_message>
Add placeholder for co-author to expand Background
Visible bracketed note in the Background asking Santi to add the
conservation / IUCN status of the two species and why acoustic monitoring
matters for their conservation.

https://claude.ai/code/session_01GRhKW3iKJjm2wYYeUd56Hq
</commit_message>
<xml_diff>
--- a/paper/methodsx_manuscript.docx
+++ b/paper/methodsx_manuscript.docx
@@ -834,7 +834,51 @@
         <w:t xml:space="preserve">Colobus guereza</w:t>
       </w:r>
       <w:r>
-        <w:t xml:space="preserve">. Rather</w:t>
+        <w:t xml:space="preserve">.</w:t>
+      </w:r>
+      <w:r>
+        <w:t xml:space="preserve"> </w:t>
+      </w:r>
+      <w:r>
+        <w:rPr>
+          <w:b/>
+          <w:bCs/>
+        </w:rPr>
+        <w:t xml:space="preserve">[Santi — please add more background here, e.g. the conservation /</w:t>
+      </w:r>
+      <w:r>
+        <w:rPr>
+          <w:b/>
+          <w:bCs/>
+        </w:rPr>
+        <w:t xml:space="preserve"> </w:t>
+      </w:r>
+      <w:r>
+        <w:rPr>
+          <w:b/>
+          <w:bCs/>
+        </w:rPr>
+        <w:t xml:space="preserve">IUCN status of the two species and why acoustic monitoring matters for their</w:t>
+      </w:r>
+      <w:r>
+        <w:rPr>
+          <w:b/>
+          <w:bCs/>
+        </w:rPr>
+        <w:t xml:space="preserve"> </w:t>
+      </w:r>
+      <w:r>
+        <w:rPr>
+          <w:b/>
+          <w:bCs/>
+        </w:rPr>
+        <w:t xml:space="preserve">conservation.]</w:t>
+      </w:r>
+      <w:r>
+        <w:t xml:space="preserve"> </w:t>
+      </w:r>
+      <w:r>
+        <w:t xml:space="preserve">Rather</w:t>
       </w:r>
       <w:r>
         <w:t xml:space="preserve"> </w:t>

</xml_diff>

<commit_message>
Abstract: name the model in prose, use Latin species names
- Drop the common name "putty-nosed monkey"; use Cercopithecus nictitans and
  Colobus guereza consistently (matches Colobus, which had no common name)
- Prose now names the model (VGG19 + frequency-position-aware recurrent head)
  and the core modification idea (encoding where in frequency a call sits),
  instead of the vague "a transfer-learning classifier"; the three controls
  are still enumerated in the bullets. Naming the method is allowed -- the
  template bans technical *steps*, not mentioning the model/innovations
- Total 194 words (still under the 200-word cap)

https://claude.ai/code/session_01GRhKW3iKJjm2wYYeUd56Hq
</commit_message>
<xml_diff>
--- a/paper/methodsx_manuscript.docx
+++ b/paper/methodsx_manuscript.docx
@@ -75,7 +75,10 @@
         <w:t xml:space="preserve"> </w:t>
       </w:r>
       <w:r>
-        <w:t xml:space="preserve">species, the putty-nosed monkey (</w:t>
+        <w:t xml:space="preserve">species,</w:t>
+      </w:r>
+      <w:r>
+        <w:t xml:space="preserve"> </w:t>
       </w:r>
       <w:r>
         <w:rPr>
@@ -85,7 +88,10 @@
         <w:t xml:space="preserve">Cercopithecus nictitans</w:t>
       </w:r>
       <w:r>
-        <w:t xml:space="preserve">) and</w:t>
+        <w:t xml:space="preserve"> </w:t>
+      </w:r>
+      <w:r>
+        <w:t xml:space="preserve">and</w:t>
       </w:r>
       <w:r>
         <w:t xml:space="preserve"> </w:t>
@@ -98,37 +104,49 @@
         <w:t xml:space="preserve">Colobus guereza</w:t>
       </w:r>
       <w:r>
-        <w:t xml:space="preserve">, in long field recordings from Makokou, Gabon, while</w:t>
-      </w:r>
-      <w:r>
-        <w:t xml:space="preserve"> </w:t>
-      </w:r>
-      <w:r>
-        <w:t xml:space="preserve">keeping manual listening close to zero. A transfer-learning classifier is</w:t>
-      </w:r>
-      <w:r>
-        <w:t xml:space="preserve"> </w:t>
-      </w:r>
-      <w:r>
-        <w:t xml:space="preserve">paired with targeted controls that suppress each species’ characteristic false</w:t>
-      </w:r>
-      <w:r>
-        <w:t xml:space="preserve"> </w:t>
-      </w:r>
-      <w:r>
-        <w:t xml:space="preserve">positives and with an automatic cleanup loop that recycles confirmed errors</w:t>
-      </w:r>
-      <w:r>
-        <w:t xml:space="preserve"> </w:t>
-      </w:r>
-      <w:r>
-        <w:t xml:space="preserve">back into training. The method reaches 98% validation accuracy with zero</w:t>
-      </w:r>
-      <w:r>
-        <w:t xml:space="preserve"> </w:t>
-      </w:r>
-      <w:r>
-        <w:t xml:space="preserve">confusion between the two primate species.</w:t>
+        <w:t xml:space="preserve">, in</w:t>
+      </w:r>
+      <w:r>
+        <w:t xml:space="preserve"> </w:t>
+      </w:r>
+      <w:r>
+        <w:t xml:space="preserve">long field recordings from Makokou, Gabon, while keeping manual listening close</w:t>
+      </w:r>
+      <w:r>
+        <w:t xml:space="preserve"> </w:t>
+      </w:r>
+      <w:r>
+        <w:t xml:space="preserve">to zero. The classifier couples a VGG19 backbone with a frequency-position-aware</w:t>
+      </w:r>
+      <w:r>
+        <w:t xml:space="preserve"> </w:t>
+      </w:r>
+      <w:r>
+        <w:t xml:space="preserve">recurrent head that encodes where in frequency a call sits, and pairs it with</w:t>
+      </w:r>
+      <w:r>
+        <w:t xml:space="preserve"> </w:t>
+      </w:r>
+      <w:r>
+        <w:t xml:space="preserve">targeted controls that suppress each species’ characteristic false positives</w:t>
+      </w:r>
+      <w:r>
+        <w:t xml:space="preserve"> </w:t>
+      </w:r>
+      <w:r>
+        <w:t xml:space="preserve">and an automatic cleanup loop that recycles confirmed errors back into training.</w:t>
+      </w:r>
+      <w:r>
+        <w:t xml:space="preserve"> </w:t>
+      </w:r>
+      <w:r>
+        <w:t xml:space="preserve">The method reaches 98% validation accuracy with zero confusion between the two</w:t>
+      </w:r>
+      <w:r>
+        <w:t xml:space="preserve"> </w:t>
+      </w:r>
+      <w:r>
+        <w:t xml:space="preserve">primate species.</w:t>
       </w:r>
     </w:p>
     <w:p>

</xml_diff>

<commit_message>
Abstract: add significance and transferability (match example style)
Published MethodsX examples open with the significance of the problem and
highlight reusability; ours did neither explicitly.

- Opening now states the conservation/monitoring significance ("a key tool
  for tracking vocal animals and informing their conservation")
- Closing now states transferability ("transfers to new species by swapping
  in reference clips")
- Trim wording and drop the now-redundant architecture parenthetical from
  bullet 1 (prose already names VGG19 + frequency-position head) to stay
  within the 200-word cap (198 words)

https://claude.ai/code/session_01GRhKW3iKJjm2wYYeUd56Hq
</commit_message>
<xml_diff>
--- a/paper/methodsx_manuscript.docx
+++ b/paper/methodsx_manuscript.docx
@@ -45,37 +45,37 @@
         <w:pStyle w:val="Abstract"/>
       </w:pPr>
       <w:r>
-        <w:t xml:space="preserve">Passive acoustic monitoring produces thousands of hours of tropical-forest</w:t>
-      </w:r>
-      <w:r>
-        <w:t xml:space="preserve"> </w:t>
-      </w:r>
-      <w:r>
-        <w:t xml:space="preserve">audio that are infeasible to annotate by hand. The practical obstacle is</w:t>
-      </w:r>
-      <w:r>
-        <w:t xml:space="preserve"> </w:t>
-      </w:r>
-      <w:r>
-        <w:t xml:space="preserve">precision: a classifier trained on clean reference clips also fires on the</w:t>
-      </w:r>
-      <w:r>
-        <w:t xml:space="preserve"> </w:t>
-      </w:r>
-      <w:r>
-        <w:t xml:space="preserve">many non-target forest sounds absent from training, so every detection must be</w:t>
-      </w:r>
-      <w:r>
-        <w:t xml:space="preserve"> </w:t>
-      </w:r>
-      <w:r>
-        <w:t xml:space="preserve">checked by ear. We describe an end-to-end pipeline that detects two primate</w:t>
-      </w:r>
-      <w:r>
-        <w:t xml:space="preserve"> </w:t>
-      </w:r>
-      <w:r>
-        <w:t xml:space="preserve">species,</w:t>
+        <w:t xml:space="preserve">Passive acoustic monitoring is a key tool for tracking vocal animals and</w:t>
+      </w:r>
+      <w:r>
+        <w:t xml:space="preserve"> </w:t>
+      </w:r>
+      <w:r>
+        <w:t xml:space="preserve">informing their conservation, but it produces thousands of hours of audio that</w:t>
+      </w:r>
+      <w:r>
+        <w:t xml:space="preserve"> </w:t>
+      </w:r>
+      <w:r>
+        <w:t xml:space="preserve">cannot be annotated by hand. The obstacle is precision: a classifier trained on</w:t>
+      </w:r>
+      <w:r>
+        <w:t xml:space="preserve"> </w:t>
+      </w:r>
+      <w:r>
+        <w:t xml:space="preserve">clean reference clips also fires on the many non-target forest sounds absent</w:t>
+      </w:r>
+      <w:r>
+        <w:t xml:space="preserve"> </w:t>
+      </w:r>
+      <w:r>
+        <w:t xml:space="preserve">from training, so every detection must be checked by ear. We describe an</w:t>
+      </w:r>
+      <w:r>
+        <w:t xml:space="preserve"> </w:t>
+      </w:r>
+      <w:r>
+        <w:t xml:space="preserve">end-to-end pipeline that detects two primate species,</w:t>
       </w:r>
       <w:r>
         <w:t xml:space="preserve"> </w:t>
@@ -85,68 +85,82 @@
           <w:i/>
           <w:iCs/>
         </w:rPr>
-        <w:t xml:space="preserve">Cercopithecus nictitans</w:t>
-      </w:r>
-      <w:r>
-        <w:t xml:space="preserve"> </w:t>
-      </w:r>
-      <w:r>
-        <w:t xml:space="preserve">and</w:t>
-      </w:r>
-      <w:r>
-        <w:t xml:space="preserve"> </w:t>
+        <w:t xml:space="preserve">Cercopithecus</w:t>
       </w:r>
       <w:r>
         <w:rPr>
           <w:i/>
           <w:iCs/>
         </w:rPr>
+        <w:t xml:space="preserve"> </w:t>
+      </w:r>
+      <w:r>
+        <w:rPr>
+          <w:i/>
+          <w:iCs/>
+        </w:rPr>
+        <w:t xml:space="preserve">nictitans</w:t>
+      </w:r>
+      <w:r>
+        <w:t xml:space="preserve"> </w:t>
+      </w:r>
+      <w:r>
+        <w:t xml:space="preserve">and</w:t>
+      </w:r>
+      <w:r>
+        <w:t xml:space="preserve"> </w:t>
+      </w:r>
+      <w:r>
+        <w:rPr>
+          <w:i/>
+          <w:iCs/>
+        </w:rPr>
         <w:t xml:space="preserve">Colobus guereza</w:t>
       </w:r>
       <w:r>
-        <w:t xml:space="preserve">, in</w:t>
-      </w:r>
-      <w:r>
-        <w:t xml:space="preserve"> </w:t>
-      </w:r>
-      <w:r>
-        <w:t xml:space="preserve">long field recordings from Makokou, Gabon, while keeping manual listening close</w:t>
-      </w:r>
-      <w:r>
-        <w:t xml:space="preserve"> </w:t>
-      </w:r>
-      <w:r>
-        <w:t xml:space="preserve">to zero. The classifier couples a VGG19 backbone with a frequency-position-aware</w:t>
-      </w:r>
-      <w:r>
-        <w:t xml:space="preserve"> </w:t>
-      </w:r>
-      <w:r>
-        <w:t xml:space="preserve">recurrent head that encodes where in frequency a call sits, and pairs it with</w:t>
-      </w:r>
-      <w:r>
-        <w:t xml:space="preserve"> </w:t>
-      </w:r>
-      <w:r>
-        <w:t xml:space="preserve">targeted controls that suppress each species’ characteristic false positives</w:t>
-      </w:r>
-      <w:r>
-        <w:t xml:space="preserve"> </w:t>
-      </w:r>
-      <w:r>
-        <w:t xml:space="preserve">and an automatic cleanup loop that recycles confirmed errors back into training.</w:t>
-      </w:r>
-      <w:r>
-        <w:t xml:space="preserve"> </w:t>
-      </w:r>
-      <w:r>
-        <w:t xml:space="preserve">The method reaches 98% validation accuracy with zero confusion between the two</w:t>
-      </w:r>
-      <w:r>
-        <w:t xml:space="preserve"> </w:t>
-      </w:r>
-      <w:r>
-        <w:t xml:space="preserve">primate species.</w:t>
+        <w:t xml:space="preserve">, in long recordings from Makokou,</w:t>
+      </w:r>
+      <w:r>
+        <w:t xml:space="preserve"> </w:t>
+      </w:r>
+      <w:r>
+        <w:t xml:space="preserve">Gabon, while keeping manual listening near zero. The classifier couples a</w:t>
+      </w:r>
+      <w:r>
+        <w:t xml:space="preserve"> </w:t>
+      </w:r>
+      <w:r>
+        <w:t xml:space="preserve">VGG19 backbone with a frequency-position-aware recurrent head that encodes</w:t>
+      </w:r>
+      <w:r>
+        <w:t xml:space="preserve"> </w:t>
+      </w:r>
+      <w:r>
+        <w:t xml:space="preserve">where in frequency a call sits, with targeted controls that suppress each</w:t>
+      </w:r>
+      <w:r>
+        <w:t xml:space="preserve"> </w:t>
+      </w:r>
+      <w:r>
+        <w:t xml:space="preserve">species’ characteristic false positives and an automatic cleanup loop that</w:t>
+      </w:r>
+      <w:r>
+        <w:t xml:space="preserve"> </w:t>
+      </w:r>
+      <w:r>
+        <w:t xml:space="preserve">recycles confirmed errors into training. It reaches 98% validation accuracy</w:t>
+      </w:r>
+      <w:r>
+        <w:t xml:space="preserve"> </w:t>
+      </w:r>
+      <w:r>
+        <w:t xml:space="preserve">with zero confusion between them, and transfers to new species by swapping in</w:t>
+      </w:r>
+      <w:r>
+        <w:t xml:space="preserve"> </w:t>
+      </w:r>
+      <w:r>
+        <w:t xml:space="preserve">reference clips.</w:t>
       </w:r>
     </w:p>
     <w:p>
@@ -158,13 +172,7 @@
         </w:numPr>
       </w:pPr>
       <w:r>
-        <w:t xml:space="preserve">A two-stage transfer-learning classifier (VGG19 backbone with a</w:t>
-      </w:r>
-      <w:r>
-        <w:t xml:space="preserve"> </w:t>
-      </w:r>
-      <w:r>
-        <w:t xml:space="preserve">frequency-position-aware recurrent head) for detecting primate calls in</w:t>
+        <w:t xml:space="preserve">A two-stage transfer-learning classifier for detecting primate calls in</w:t>
       </w:r>
       <w:r>
         <w:t xml:space="preserve"> </w:t>

</xml_diff>

<commit_message>
Add Santi placeholder on the abstract conservation framing
Visible bracketed note next to the conservation-significance clause asking
the co-author to review/expand it (to be removed before submission; does not
count toward the 200-word abstract limit).

https://claude.ai/code/session_01GRhKW3iKJjm2wYYeUd56Hq
</commit_message>
<xml_diff>
--- a/paper/methodsx_manuscript.docx
+++ b/paper/methodsx_manuscript.docx
@@ -51,13 +51,40 @@
         <w:t xml:space="preserve"> </w:t>
       </w:r>
       <w:r>
-        <w:t xml:space="preserve">informing their conservation, but it produces thousands of hours of audio that</w:t>
-      </w:r>
-      <w:r>
-        <w:t xml:space="preserve"> </w:t>
-      </w:r>
-      <w:r>
-        <w:t xml:space="preserve">cannot be annotated by hand. The obstacle is precision: a classifier trained on</w:t>
+        <w:t xml:space="preserve">informing their conservation</w:t>
+      </w:r>
+      <w:r>
+        <w:t xml:space="preserve"> </w:t>
+      </w:r>
+      <w:r>
+        <w:rPr>
+          <w:b/>
+          <w:bCs/>
+        </w:rPr>
+        <w:t xml:space="preserve">[Santi — please review / expand this</w:t>
+      </w:r>
+      <w:r>
+        <w:rPr>
+          <w:b/>
+          <w:bCs/>
+        </w:rPr>
+        <w:t xml:space="preserve"> </w:t>
+      </w:r>
+      <w:r>
+        <w:rPr>
+          <w:b/>
+          <w:bCs/>
+        </w:rPr>
+        <w:t xml:space="preserve">conservation-significance framing]</w:t>
+      </w:r>
+      <w:r>
+        <w:t xml:space="preserve">, but it produces thousands of hours of</w:t>
+      </w:r>
+      <w:r>
+        <w:t xml:space="preserve"> </w:t>
+      </w:r>
+      <w:r>
+        <w:t xml:space="preserve">audio that cannot be annotated by hand. The obstacle is precision: a classifier trained on</w:t>
       </w:r>
       <w:r>
         <w:t xml:space="preserve"> </w:t>

</xml_diff>

<commit_message>
Restructure abstract as a pipeline-flow narrative
Reframe per co-author's priority: significance -> problem -> how (pipeline)
-> result -> reusable pipeline.

- Prose now follows the pipeline: audio -> mel-spectrograms -> VGG19
  transfer-learning model with a frequency-position-aware CRNN head ->
  sliding-window detection -> automatic cleanup -> retraining
- CRNN named descriptively (standard architecture, not framed as a novelty);
  the frequency-position encoding remains the headline idea
- Replace the dense "three targeted controls" bullet with plain-language
  takeaways (model / cleanup / reusable pipeline), like the published
  examples' terse bullets
- 193 words (under the 200-word cap); Santi placeholder retained

https://claude.ai/code/session_01GRhKW3iKJjm2wYYeUd56Hq
</commit_message>
<xml_diff>
--- a/paper/methodsx_manuscript.docx
+++ b/paper/methodsx_manuscript.docx
@@ -84,25 +84,25 @@
         <w:t xml:space="preserve"> </w:t>
       </w:r>
       <w:r>
-        <w:t xml:space="preserve">audio that cannot be annotated by hand. The obstacle is precision: a classifier trained on</w:t>
-      </w:r>
-      <w:r>
-        <w:t xml:space="preserve"> </w:t>
-      </w:r>
-      <w:r>
-        <w:t xml:space="preserve">clean reference clips also fires on the many non-target forest sounds absent</w:t>
-      </w:r>
-      <w:r>
-        <w:t xml:space="preserve"> </w:t>
-      </w:r>
-      <w:r>
-        <w:t xml:space="preserve">from training, so every detection must be checked by ear. We describe an</w:t>
-      </w:r>
-      <w:r>
-        <w:t xml:space="preserve"> </w:t>
-      </w:r>
-      <w:r>
-        <w:t xml:space="preserve">end-to-end pipeline that detects two primate species,</w:t>
+        <w:t xml:space="preserve">audio that cannot be annotated by hand. The obstacle is precision: a classifier</w:t>
+      </w:r>
+      <w:r>
+        <w:t xml:space="preserve"> </w:t>
+      </w:r>
+      <w:r>
+        <w:t xml:space="preserve">trained on clean reference clips also fires on the many non-target forest</w:t>
+      </w:r>
+      <w:r>
+        <w:t xml:space="preserve"> </w:t>
+      </w:r>
+      <w:r>
+        <w:t xml:space="preserve">sounds (birds, insects, wind) absent from training, so every detection must be</w:t>
+      </w:r>
+      <w:r>
+        <w:t xml:space="preserve"> </w:t>
+      </w:r>
+      <w:r>
+        <w:t xml:space="preserve">checked by ear. We describe a pipeline that detects two primate species,</w:t>
       </w:r>
       <w:r>
         <w:t xml:space="preserve"> </w:t>
@@ -112,82 +112,68 @@
           <w:i/>
           <w:iCs/>
         </w:rPr>
-        <w:t xml:space="preserve">Cercopithecus</w:t>
+        <w:t xml:space="preserve">Cercopithecus nictitans</w:t>
+      </w:r>
+      <w:r>
+        <w:t xml:space="preserve"> </w:t>
+      </w:r>
+      <w:r>
+        <w:t xml:space="preserve">and</w:t>
+      </w:r>
+      <w:r>
+        <w:t xml:space="preserve"> </w:t>
       </w:r>
       <w:r>
         <w:rPr>
           <w:i/>
           <w:iCs/>
         </w:rPr>
-        <w:t xml:space="preserve"> </w:t>
-      </w:r>
-      <w:r>
-        <w:rPr>
-          <w:i/>
-          <w:iCs/>
-        </w:rPr>
-        <w:t xml:space="preserve">nictitans</w:t>
-      </w:r>
-      <w:r>
-        <w:t xml:space="preserve"> </w:t>
-      </w:r>
-      <w:r>
-        <w:t xml:space="preserve">and</w:t>
-      </w:r>
-      <w:r>
-        <w:t xml:space="preserve"> </w:t>
-      </w:r>
-      <w:r>
-        <w:rPr>
-          <w:i/>
-          <w:iCs/>
-        </w:rPr>
         <w:t xml:space="preserve">Colobus guereza</w:t>
       </w:r>
       <w:r>
-        <w:t xml:space="preserve">, in long recordings from Makokou,</w:t>
-      </w:r>
-      <w:r>
-        <w:t xml:space="preserve"> </w:t>
-      </w:r>
-      <w:r>
-        <w:t xml:space="preserve">Gabon, while keeping manual listening near zero. The classifier couples a</w:t>
-      </w:r>
-      <w:r>
-        <w:t xml:space="preserve"> </w:t>
-      </w:r>
-      <w:r>
-        <w:t xml:space="preserve">VGG19 backbone with a frequency-position-aware recurrent head that encodes</w:t>
-      </w:r>
-      <w:r>
-        <w:t xml:space="preserve"> </w:t>
-      </w:r>
-      <w:r>
-        <w:t xml:space="preserve">where in frequency a call sits, with targeted controls that suppress each</w:t>
-      </w:r>
-      <w:r>
-        <w:t xml:space="preserve"> </w:t>
-      </w:r>
-      <w:r>
-        <w:t xml:space="preserve">species’ characteristic false positives and an automatic cleanup loop that</w:t>
-      </w:r>
-      <w:r>
-        <w:t xml:space="preserve"> </w:t>
-      </w:r>
-      <w:r>
-        <w:t xml:space="preserve">recycles confirmed errors into training. It reaches 98% validation accuracy</w:t>
-      </w:r>
-      <w:r>
-        <w:t xml:space="preserve"> </w:t>
-      </w:r>
-      <w:r>
-        <w:t xml:space="preserve">with zero confusion between them, and transfers to new species by swapping in</w:t>
-      </w:r>
-      <w:r>
-        <w:t xml:space="preserve"> </w:t>
-      </w:r>
-      <w:r>
-        <w:t xml:space="preserve">reference clips.</w:t>
+        <w:t xml:space="preserve">, in long</w:t>
+      </w:r>
+      <w:r>
+        <w:t xml:space="preserve"> </w:t>
+      </w:r>
+      <w:r>
+        <w:t xml:space="preserve">recordings from Makokou, Gabon, while keeping manual listening near zero. Audio</w:t>
+      </w:r>
+      <w:r>
+        <w:t xml:space="preserve"> </w:t>
+      </w:r>
+      <w:r>
+        <w:t xml:space="preserve">is converted to mel-spectrograms and classified by a VGG19 transfer-learning</w:t>
+      </w:r>
+      <w:r>
+        <w:t xml:space="preserve"> </w:t>
+      </w:r>
+      <w:r>
+        <w:t xml:space="preserve">model with a frequency-position-aware CRNN head, designed so that forest birds</w:t>
+      </w:r>
+      <w:r>
+        <w:t xml:space="preserve"> </w:t>
+      </w:r>
+      <w:r>
+        <w:t xml:space="preserve">and insects are not mistaken for the target primate; sliding-window detection</w:t>
+      </w:r>
+      <w:r>
+        <w:t xml:space="preserve"> </w:t>
+      </w:r>
+      <w:r>
+        <w:t xml:space="preserve">is followed by an automatic cleanup that flags false positives and recycles</w:t>
+      </w:r>
+      <w:r>
+        <w:t xml:space="preserve"> </w:t>
+      </w:r>
+      <w:r>
+        <w:t xml:space="preserve">them into training. The model reaches 98% validation accuracy with zero</w:t>
+      </w:r>
+      <w:r>
+        <w:t xml:space="preserve"> </w:t>
+      </w:r>
+      <w:r>
+        <w:t xml:space="preserve">confusion between the two species.</w:t>
       </w:r>
     </w:p>
     <w:p>
@@ -199,13 +185,13 @@
         </w:numPr>
       </w:pPr>
       <w:r>
-        <w:t xml:space="preserve">A two-stage transfer-learning classifier for detecting primate calls in</w:t>
-      </w:r>
-      <w:r>
-        <w:t xml:space="preserve"> </w:t>
-      </w:r>
-      <w:r>
-        <w:t xml:space="preserve">continuous field recordings.</w:t>
+        <w:t xml:space="preserve">A VGG19 transfer-learning model with a frequency-position-aware CRNN</w:t>
+      </w:r>
+      <w:r>
+        <w:t xml:space="preserve"> </w:t>
+      </w:r>
+      <w:r>
+        <w:t xml:space="preserve">head, hardened against forest-noise false positives.</w:t>
       </w:r>
     </w:p>
     <w:p>
@@ -217,19 +203,13 @@
         </w:numPr>
       </w:pPr>
       <w:r>
-        <w:t xml:space="preserve">Three targeted controls (a dedicated hard-negative class, a</w:t>
-      </w:r>
-      <w:r>
-        <w:t xml:space="preserve"> </w:t>
-      </w:r>
-      <w:r>
-        <w:t xml:space="preserve">frequency-position encoding, and a high-frequency nuisance augmentation) that</w:t>
-      </w:r>
-      <w:r>
-        <w:t xml:space="preserve"> </w:t>
-      </w:r>
-      <w:r>
-        <w:t xml:space="preserve">suppress species-specific false positives without manual listening.</w:t>
+        <w:t xml:space="preserve">An automatic three-filter cleanup of field detections, with no manual</w:t>
+      </w:r>
+      <w:r>
+        <w:t xml:space="preserve"> </w:t>
+      </w:r>
+      <w:r>
+        <w:t xml:space="preserve">listening.</w:t>
       </w:r>
     </w:p>
     <w:p>
@@ -241,13 +221,13 @@
         </w:numPr>
       </w:pPr>
       <w:r>
-        <w:t xml:space="preserve">An automatic three-filter cleanup loop that feeds confirmed false</w:t>
-      </w:r>
-      <w:r>
-        <w:t xml:space="preserve"> </w:t>
-      </w:r>
-      <w:r>
-        <w:t xml:space="preserve">positives back as hard negatives for iterative retraining.</w:t>
+        <w:t xml:space="preserve">A complete, reusable pipeline that recycles confirmed errors into</w:t>
+      </w:r>
+      <w:r>
+        <w:t xml:space="preserve"> </w:t>
+      </w:r>
+      <w:r>
+        <w:t xml:space="preserve">retraining and re-targets to new species by swapping in reference clips.</w:t>
       </w:r>
     </w:p>
     <w:p>

</xml_diff>

<commit_message>
Abstract: spell out CRNN at first mention, split long sentence
- Define the acronym on first use: "convolutional recurrent neural network
  (CRNN)" (Guide requires uncommon abbreviations be defined; abstract must
  stand alone). VGG19 kept as a proper architecture name.
- Split the dense pipeline sentence into two for readability.
- Drop "the many" for a small word-count buffer (~197 words).

https://claude.ai/code/session_01GRhKW3iKJjm2wYYeUd56Hq
</commit_message>
<xml_diff>
--- a/paper/methodsx_manuscript.docx
+++ b/paper/methodsx_manuscript.docx
@@ -90,7 +90,7 @@
         <w:t xml:space="preserve"> </w:t>
       </w:r>
       <w:r>
-        <w:t xml:space="preserve">trained on clean reference clips also fires on the many non-target forest</w:t>
+        <w:t xml:space="preserve">trained on clean reference clips also fires on non-target forest</w:t>
       </w:r>
       <w:r>
         <w:t xml:space="preserve"> </w:t>
@@ -149,31 +149,31 @@
         <w:t xml:space="preserve"> </w:t>
       </w:r>
       <w:r>
-        <w:t xml:space="preserve">model with a frequency-position-aware CRNN head, designed so that forest birds</w:t>
-      </w:r>
-      <w:r>
-        <w:t xml:space="preserve"> </w:t>
-      </w:r>
-      <w:r>
-        <w:t xml:space="preserve">and insects are not mistaken for the target primate; sliding-window detection</w:t>
-      </w:r>
-      <w:r>
-        <w:t xml:space="preserve"> </w:t>
-      </w:r>
-      <w:r>
-        <w:t xml:space="preserve">is followed by an automatic cleanup that flags false positives and recycles</w:t>
-      </w:r>
-      <w:r>
-        <w:t xml:space="preserve"> </w:t>
-      </w:r>
-      <w:r>
-        <w:t xml:space="preserve">them into training. The model reaches 98% validation accuracy with zero</w:t>
-      </w:r>
-      <w:r>
-        <w:t xml:space="preserve"> </w:t>
-      </w:r>
-      <w:r>
-        <w:t xml:space="preserve">confusion between the two species.</w:t>
+        <w:t xml:space="preserve">model with a frequency-position-aware convolutional recurrent neural network</w:t>
+      </w:r>
+      <w:r>
+        <w:t xml:space="preserve"> </w:t>
+      </w:r>
+      <w:r>
+        <w:t xml:space="preserve">(CRNN) head, designed so that forest birds and insects are not mistaken for the</w:t>
+      </w:r>
+      <w:r>
+        <w:t xml:space="preserve"> </w:t>
+      </w:r>
+      <w:r>
+        <w:t xml:space="preserve">target primate. Sliding-window detection is then followed by an automatic</w:t>
+      </w:r>
+      <w:r>
+        <w:t xml:space="preserve"> </w:t>
+      </w:r>
+      <w:r>
+        <w:t xml:space="preserve">cleanup that flags false positives and recycles them into training. The model</w:t>
+      </w:r>
+      <w:r>
+        <w:t xml:space="preserve"> </w:t>
+      </w:r>
+      <w:r>
+        <w:t xml:space="preserve">reaches 98% validation accuracy with zero confusion between the two species.</w:t>
       </w:r>
     </w:p>
     <w:p>

</xml_diff>

<commit_message>
Method details S1: add training-data composition table
- New Table (training-data composition) lists human-verified reference clips
  per class before augmentation (Cernic 370, Colobus 617, confuser 654,
  Background ~5,900; total ~7,541)
- Remove the now-duplicated inline counts from the class itemize
- Add a sentence linking these raw counts to the post-augmentation per-class
  validation totals (Table 1), so readers aren't confused by 370 -> 518 etc.

https://claude.ai/code/session_01GRhKW3iKJjm2wYYeUd56Hq
</commit_message>
<xml_diff>
--- a/paper/methodsx_manuscript.docx
+++ b/paper/methodsx_manuscript.docx
@@ -969,7 +969,7 @@
       </w:r>
     </w:p>
     <w:bookmarkEnd w:id="13"/>
-    <w:bookmarkStart w:id="31" w:name="method-details"/>
+    <w:bookmarkStart w:id="32" w:name="method-details"/>
     <w:p>
       <w:pPr>
         <w:pStyle w:val="Heading1"/>
@@ -1090,7 +1090,7 @@
         <w:t xml:space="preserve">code.</w:t>
       </w:r>
     </w:p>
-    <w:bookmarkStart w:id="14" w:name="Xba94fc53b659dddb044208ab9692b361fd2e00f"/>
+    <w:bookmarkStart w:id="15" w:name="Xba94fc53b659dddb044208ab9692b361fd2e00f"/>
     <w:p>
       <w:pPr>
         <w:pStyle w:val="Heading2"/>
@@ -1154,7 +1154,24 @@
         <w:pStyle w:val="BodyText"/>
       </w:pPr>
       <w:r>
-        <w:t xml:space="preserve">The model is trained on short reference clips organized into four classes:</w:t>
+        <w:t xml:space="preserve">The model is trained on short reference clips organized into four classes</w:t>
+      </w:r>
+      <w:r>
+        <w:t xml:space="preserve"> </w:t>
+      </w:r>
+      <w:r>
+        <w:t xml:space="preserve">(Table </w:t>
+      </w:r>
+      <w:hyperlink w:anchor="tab:traindata">
+        <w:r>
+          <w:rPr>
+            <w:rStyle w:val="Hyperlink"/>
+          </w:rPr>
+          <w:t xml:space="preserve">1</w:t>
+        </w:r>
+      </w:hyperlink>
+      <w:r>
+        <w:t xml:space="preserve">):</w:t>
       </w:r>
     </w:p>
     <w:p>
@@ -1244,13 +1261,7 @@
         <w:t xml:space="preserve"> </w:t>
       </w:r>
       <w:r>
-        <w:t xml:space="preserve">putty-nosed decision (putty-nose 25, hack 101, kek 124, pyow 101,</w:t>
-      </w:r>
-      <w:r>
-        <w:t xml:space="preserve"> </w:t>
-      </w:r>
-      <w:r>
-        <w:t xml:space="preserve">field-confirmed 19; 370 clips total);</w:t>
+        <w:t xml:space="preserve">putty-nosed decision;</w:t>
       </w:r>
     </w:p>
     <w:p>
@@ -1287,7 +1298,7 @@
         <w:t xml:space="preserve"> </w:t>
       </w:r>
       <w:r>
-        <w:t xml:space="preserve">calls (617 clips);</w:t>
+        <w:t xml:space="preserve">reference calls;</w:t>
       </w:r>
     </w:p>
     <w:p>
@@ -1333,7 +1344,7 @@
         <w:t xml:space="preserve"> </w:t>
       </w:r>
       <w:r>
-        <w:t xml:space="preserve">and human-reviewed so that no genuine target call is included (654 clips).</w:t>
+        <w:t xml:space="preserve">and human-reviewed so that no genuine target call is included.</w:t>
       </w:r>
       <w:r>
         <w:t xml:space="preserve"> </w:t>
@@ -1432,24 +1443,353 @@
         <w:t xml:space="preserve"> </w:t>
       </w:r>
       <w:r>
-        <w:t xml:space="preserve">misclassified clips recycled through the hard-negative mining loop</w:t>
-      </w:r>
-      <w:r>
-        <w:t xml:space="preserve"> </w:t>
-      </w:r>
-      <w:r>
-        <w:t xml:space="preserve">(approximately 5</w:t>
-      </w:r>
-      <w:r>
-        <w:t xml:space="preserve">,</w:t>
-      </w:r>
-      <w:r>
-        <w:t xml:space="preserve">900 clips total).</w:t>
-      </w:r>
-    </w:p>
-    <w:p>
-      <w:pPr>
-        <w:pStyle w:val="FirstParagraph"/>
+        <w:t xml:space="preserve">misclassified clips recycled through the hard-negative mining loop.</w:t>
+      </w:r>
+    </w:p>
+    <w:bookmarkStart w:id="14" w:name="tab:traindata"/>
+    <w:p>
+      <w:pPr>
+        <w:pStyle w:val="TableCaption"/>
+      </w:pPr>
+      <w:r>
+        <w:t xml:space="preserve">Training-data composition: human-verified reference clips per class,</w:t>
+      </w:r>
+      <w:r>
+        <w:t xml:space="preserve"> </w:t>
+      </w:r>
+      <w:r>
+        <w:t xml:space="preserve">before augmentation.</w:t>
+      </w:r>
+    </w:p>
+    <w:tbl>
+      <w:tblPr>
+        <w:tblStyle w:val="Table"/>
+        <w:tblW w:type="auto" w:w="0"/>
+        <w:tblLook w:firstRow="1" w:lastRow="0" w:firstColumn="0" w:lastColumn="0" w:noHBand="0" w:noVBand="0" w:val="0020"/>
+        <w:tblCaption w:val="Training-data composition: human-verified reference clips per class, before augmentation."/>
+      </w:tblPr>
+      <w:tblGrid>
+        <w:gridCol w:w="2640"/>
+        <w:gridCol w:w="2640"/>
+        <w:gridCol w:w="2640"/>
+      </w:tblGrid>
+      <w:tr>
+        <w:trPr>
+          <w:tblHeader w:val="on"/>
+        </w:trPr>
+        <w:tc>
+          <w:tcPr/>
+          <w:p>
+            <w:pPr>
+              <w:pStyle w:val="Compact"/>
+              <w:jc w:val="left"/>
+            </w:pPr>
+            <w:r>
+              <w:t xml:space="preserve">Class</w:t>
+            </w:r>
+          </w:p>
+        </w:tc>
+        <w:tc>
+          <w:tcPr/>
+          <w:p>
+            <w:pPr>
+              <w:pStyle w:val="Compact"/>
+              <w:jc w:val="right"/>
+            </w:pPr>
+            <w:r>
+              <w:t xml:space="preserve">Clips</w:t>
+            </w:r>
+          </w:p>
+        </w:tc>
+        <w:tc>
+          <w:tcPr/>
+          <w:p>
+            <w:pPr>
+              <w:pStyle w:val="Compact"/>
+              <w:jc w:val="left"/>
+            </w:pPr>
+            <w:r>
+              <w:t xml:space="preserve">Composition</w:t>
+            </w:r>
+          </w:p>
+        </w:tc>
+      </w:tr>
+      <w:tr>
+        <w:tc>
+          <w:tcPr/>
+          <w:p>
+            <w:pPr>
+              <w:pStyle w:val="Compact"/>
+              <w:jc w:val="left"/>
+            </w:pPr>
+            <w:r>
+              <w:t xml:space="preserve">Cernic</w:t>
+            </w:r>
+          </w:p>
+        </w:tc>
+        <w:tc>
+          <w:tcPr/>
+          <w:p>
+            <w:pPr>
+              <w:pStyle w:val="Compact"/>
+              <w:jc w:val="right"/>
+            </w:pPr>
+            <w:r>
+              <w:t xml:space="preserve">370</w:t>
+            </w:r>
+          </w:p>
+        </w:tc>
+        <w:tc>
+          <w:tcPr/>
+          <w:p>
+            <w:pPr>
+              <w:pStyle w:val="Compact"/>
+              <w:jc w:val="left"/>
+            </w:pPr>
+            <w:r>
+              <w:t xml:space="preserve">putty-nose 25, hack 101, kek 124, pyow 101,</w:t>
+            </w:r>
+            <w:r>
+              <w:t xml:space="preserve"> </w:t>
+            </w:r>
+            <w:r>
+              <w:t xml:space="preserve">field-confirmed 19</w:t>
+            </w:r>
+          </w:p>
+        </w:tc>
+      </w:tr>
+      <w:tr>
+        <w:tc>
+          <w:tcPr/>
+          <w:p>
+            <w:pPr>
+              <w:pStyle w:val="Compact"/>
+              <w:jc w:val="left"/>
+            </w:pPr>
+            <w:r>
+              <w:t xml:space="preserve">Colobus_guereza</w:t>
+            </w:r>
+          </w:p>
+        </w:tc>
+        <w:tc>
+          <w:tcPr/>
+          <w:p>
+            <w:pPr>
+              <w:pStyle w:val="Compact"/>
+              <w:jc w:val="right"/>
+            </w:pPr>
+            <w:r>
+              <w:t xml:space="preserve">617</w:t>
+            </w:r>
+          </w:p>
+        </w:tc>
+        <w:tc>
+          <w:tcPr/>
+          <w:p>
+            <w:pPr>
+              <w:pStyle w:val="Compact"/>
+              <w:jc w:val="left"/>
+            </w:pPr>
+            <w:r>
+              <w:rPr>
+                <w:i/>
+                <w:iCs/>
+              </w:rPr>
+              <w:t xml:space="preserve">Colobus guereza</w:t>
+            </w:r>
+            <w:r>
+              <w:t xml:space="preserve"> </w:t>
+            </w:r>
+            <w:r>
+              <w:t xml:space="preserve">reference calls</w:t>
+            </w:r>
+          </w:p>
+        </w:tc>
+      </w:tr>
+      <w:tr>
+        <w:tc>
+          <w:tcPr/>
+          <w:p>
+            <w:pPr>
+              <w:pStyle w:val="Compact"/>
+              <w:jc w:val="left"/>
+            </w:pPr>
+            <w:r>
+              <w:t xml:space="preserve">Colobus_confuser</w:t>
+            </w:r>
+          </w:p>
+        </w:tc>
+        <w:tc>
+          <w:tcPr/>
+          <w:p>
+            <w:pPr>
+              <w:pStyle w:val="Compact"/>
+              <w:jc w:val="right"/>
+            </w:pPr>
+            <w:r>
+              <w:t xml:space="preserve">654</w:t>
+            </w:r>
+          </w:p>
+        </w:tc>
+        <w:tc>
+          <w:tcPr/>
+          <w:p>
+            <w:pPr>
+              <w:pStyle w:val="Compact"/>
+              <w:jc w:val="left"/>
+            </w:pPr>
+            <w:r>
+              <w:t xml:space="preserve">field hard-negatives, human-reviewed</w:t>
+            </w:r>
+          </w:p>
+        </w:tc>
+      </w:tr>
+      <w:tr>
+        <w:tc>
+          <w:tcPr/>
+          <w:p>
+            <w:pPr>
+              <w:pStyle w:val="Compact"/>
+              <w:jc w:val="left"/>
+            </w:pPr>
+            <w:r>
+              <w:t xml:space="preserve">Background</w:t>
+            </w:r>
+          </w:p>
+        </w:tc>
+        <w:tc>
+          <w:tcPr/>
+          <w:p>
+            <w:pPr>
+              <w:pStyle w:val="Compact"/>
+              <w:jc w:val="right"/>
+            </w:pPr>
+            <m:oMath>
+              <m:r>
+                <m:rPr>
+                  <m:sty m:val="p"/>
+                </m:rPr>
+                <m:t>∼</m:t>
+              </m:r>
+            </m:oMath>
+            <w:r>
+              <w:t xml:space="preserve">5</w:t>
+            </w:r>
+            <w:r>
+              <w:t xml:space="preserve">,</w:t>
+            </w:r>
+            <w:r>
+              <w:t xml:space="preserve">900</w:t>
+            </w:r>
+          </w:p>
+        </w:tc>
+        <w:tc>
+          <w:tcPr/>
+          <w:p>
+            <w:pPr>
+              <w:pStyle w:val="Compact"/>
+              <w:jc w:val="left"/>
+            </w:pPr>
+            <w:r>
+              <w:t xml:space="preserve">ambient noise, non-target animals,</w:t>
+            </w:r>
+            <w:r>
+              <w:t xml:space="preserve"> </w:t>
+            </w:r>
+            <w:r>
+              <w:t xml:space="preserve">recycled false positives</w:t>
+            </w:r>
+          </w:p>
+        </w:tc>
+      </w:tr>
+      <w:tr>
+        <w:tc>
+          <w:tcPr/>
+          <w:p>
+            <w:pPr>
+              <w:pStyle w:val="Compact"/>
+              <w:jc w:val="left"/>
+            </w:pPr>
+            <w:r>
+              <w:rPr>
+                <w:b/>
+                <w:bCs/>
+              </w:rPr>
+              <w:t xml:space="preserve">Total</w:t>
+            </w:r>
+          </w:p>
+        </w:tc>
+        <w:tc>
+          <w:tcPr/>
+          <w:p>
+            <w:pPr>
+              <w:pStyle w:val="Compact"/>
+              <w:jc w:val="right"/>
+            </w:pPr>
+            <m:oMath>
+              <m:r>
+                <m:rPr>
+                  <m:sty m:val="p"/>
+                </m:rPr>
+                <m:t>∼</m:t>
+              </m:r>
+            </m:oMath>
+            <w:r>
+              <w:t xml:space="preserve">7</w:t>
+            </w:r>
+            <w:r>
+              <w:t xml:space="preserve">,</w:t>
+            </w:r>
+            <w:r>
+              <w:t xml:space="preserve">541</w:t>
+            </w:r>
+          </w:p>
+        </w:tc>
+        <w:tc>
+          <w:tcPr/>
+          <w:p>
+            <w:pPr>
+              <w:pStyle w:val="Compact"/>
+            </w:pPr>
+          </w:p>
+        </w:tc>
+      </w:tr>
+    </w:tbl>
+    <w:bookmarkEnd w:id="14"/>
+    <w:p>
+      <w:pPr>
+        <w:pStyle w:val="BodyText"/>
+      </w:pPr>
+      <w:r>
+        <w:t xml:space="preserve">These are raw clip counts. Augmentation (Section 3) and the</w:t>
+      </w:r>
+      <w:r>
+        <w:t xml:space="preserve"> </w:t>
+      </w:r>
+      <w:r>
+        <w:t xml:space="preserve">train/validation split (Section 5) expand them into the per-class validation</w:t>
+      </w:r>
+      <w:r>
+        <w:t xml:space="preserve"> </w:t>
+      </w:r>
+      <w:r>
+        <w:t xml:space="preserve">totals reported later in Table </w:t>
+      </w:r>
+      <w:hyperlink w:anchor="tab:val">
+        <w:r>
+          <w:rPr>
+            <w:rStyle w:val="Hyperlink"/>
+          </w:rPr>
+          <w:t xml:space="preserve">2</w:t>
+        </w:r>
+      </w:hyperlink>
+      <w:r>
+        <w:t xml:space="preserve">.</w:t>
+      </w:r>
+    </w:p>
+    <w:p>
+      <w:pPr>
+        <w:pStyle w:val="BodyText"/>
       </w:pPr>
       <w:r>
         <w:t xml:space="preserve">All training clips underwent human verification. Because the</w:t>
@@ -1555,8 +1895,8 @@
         <w:t xml:space="preserve">hashing before training.</w:t>
       </w:r>
     </w:p>
-    <w:bookmarkEnd w:id="14"/>
-    <w:bookmarkStart w:id="15" w:name="Xe4b4dadc612911fc6b270728495411981661639"/>
+    <w:bookmarkEnd w:id="15"/>
+    <w:bookmarkStart w:id="16" w:name="Xe4b4dadc612911fc6b270728495411981661639"/>
     <w:p>
       <w:pPr>
         <w:pStyle w:val="Heading2"/>
@@ -1718,8 +2058,8 @@
         <w:t xml:space="preserve">two feature distributions comparable.</w:t>
       </w:r>
     </w:p>
-    <w:bookmarkEnd w:id="15"/>
-    <w:bookmarkStart w:id="17" w:name="data-augmentation"/>
+    <w:bookmarkEnd w:id="16"/>
+    <w:bookmarkStart w:id="18" w:name="data-augmentation"/>
     <w:p>
       <w:pPr>
         <w:pStyle w:val="Heading2"/>
@@ -1847,7 +2187,7 @@
         <w:t xml:space="preserve">.</w:t>
       </w:r>
     </w:p>
-    <w:bookmarkStart w:id="16" w:name="X877d4525f2ce6283914e1771e5b4ee23a60ca6f"/>
+    <w:bookmarkStart w:id="17" w:name="X877d4525f2ce6283914e1771e5b4ee23a60ca6f"/>
     <w:p>
       <w:pPr>
         <w:pStyle w:val="Heading4"/>
@@ -2035,9 +2375,9 @@
         <w:t xml:space="preserve">high band intact.</w:t>
       </w:r>
     </w:p>
-    <w:bookmarkEnd w:id="16"/>
     <w:bookmarkEnd w:id="17"/>
-    <w:bookmarkStart w:id="19" w:name="model-architecture"/>
+    <w:bookmarkEnd w:id="18"/>
+    <w:bookmarkStart w:id="20" w:name="model-architecture"/>
     <w:p>
       <w:pPr>
         <w:pStyle w:val="Heading2"/>
@@ -2216,7 +2556,7 @@
         <w:t xml:space="preserve"> 28, 512 channels) is extracted before the final VGG19 block.</w:t>
       </w:r>
     </w:p>
-    <w:bookmarkStart w:id="18" w:name="frequency-position-encoding."/>
+    <w:bookmarkStart w:id="19" w:name="frequency-position-encoding."/>
     <w:p>
       <w:pPr>
         <w:pStyle w:val="Heading4"/>
@@ -2597,9 +2937,9 @@
         <w:t xml:space="preserve">Colobus_confuser, Background).</w:t>
       </w:r>
     </w:p>
-    <w:bookmarkEnd w:id="18"/>
     <w:bookmarkEnd w:id="19"/>
-    <w:bookmarkStart w:id="23" w:name="model-training"/>
+    <w:bookmarkEnd w:id="20"/>
+    <w:bookmarkStart w:id="24" w:name="model-training"/>
     <w:p>
       <w:pPr>
         <w:pStyle w:val="Heading2"/>
@@ -2622,7 +2962,7 @@
         <w:t xml:space="preserve">protocol of head training followed by partial fine-tuning.</w:t>
       </w:r>
     </w:p>
-    <w:bookmarkStart w:id="20" w:name="stage-1-head-training."/>
+    <w:bookmarkStart w:id="21" w:name="stage-1-head-training."/>
     <w:p>
       <w:pPr>
         <w:pStyle w:val="Heading4"/>
@@ -2680,8 +3020,8 @@
         <w:t xml:space="preserve">, and the loss is sparse categorical cross-entropy.</w:t>
       </w:r>
     </w:p>
-    <w:bookmarkEnd w:id="20"/>
-    <w:bookmarkStart w:id="21" w:name="stage-2-partial-fine-tuning."/>
+    <w:bookmarkEnd w:id="21"/>
+    <w:bookmarkStart w:id="22" w:name="stage-2-partial-fine-tuning."/>
     <w:p>
       <w:pPr>
         <w:pStyle w:val="Heading4"/>
@@ -2772,8 +3112,8 @@
         <w:t xml:space="preserve">avoid catastrophic forgetting.</w:t>
       </w:r>
     </w:p>
-    <w:bookmarkEnd w:id="21"/>
-    <w:bookmarkStart w:id="22" w:name="shared-training-settings."/>
+    <w:bookmarkEnd w:id="22"/>
+    <w:bookmarkStart w:id="23" w:name="shared-training-settings."/>
     <w:p>
       <w:pPr>
         <w:pStyle w:val="Heading4"/>
@@ -2891,9 +3231,9 @@
         <w:t xml:space="preserve">per-class accuracy report and a confusion matrix on the validation set.</w:t>
       </w:r>
     </w:p>
-    <w:bookmarkEnd w:id="22"/>
     <w:bookmarkEnd w:id="23"/>
-    <w:bookmarkStart w:id="25" w:name="sliding-window-detection"/>
+    <w:bookmarkEnd w:id="24"/>
+    <w:bookmarkStart w:id="26" w:name="sliding-window-detection"/>
     <w:p>
       <w:pPr>
         <w:pStyle w:val="Heading2"/>
@@ -3066,7 +3406,7 @@
         <w:t xml:space="preserve">non-maximum suppression at an intersection-over-union threshold of 0.5.</w:t>
       </w:r>
     </w:p>
-    <w:bookmarkStart w:id="24" w:name="low-frequency-energy-gate-for-colobus."/>
+    <w:bookmarkStart w:id="25" w:name="low-frequency-energy-gate-for-colobus."/>
     <w:p>
       <w:pPr>
         <w:pStyle w:val="Heading4"/>
@@ -3246,9 +3586,9 @@
         <w:t xml:space="preserve">review and downstream filtering do not require re-reading the long recordings.</w:t>
       </w:r>
     </w:p>
-    <w:bookmarkEnd w:id="24"/>
     <w:bookmarkEnd w:id="25"/>
-    <w:bookmarkStart w:id="29" w:name="automatic-false-positive-cleanup"/>
+    <w:bookmarkEnd w:id="26"/>
+    <w:bookmarkStart w:id="30" w:name="automatic-false-positive-cleanup"/>
     <w:p>
       <w:pPr>
         <w:pStyle w:val="Heading2"/>
@@ -3289,7 +3629,7 @@
         <w:t xml:space="preserve">source recording.</w:t>
       </w:r>
     </w:p>
-    <w:bookmarkStart w:id="26" w:name="a-mahalanobis-out-of-distribution-filter"/>
+    <w:bookmarkStart w:id="27" w:name="a-mahalanobis-out-of-distribution-filter"/>
     <w:p>
       <w:pPr>
         <w:pStyle w:val="Heading4"/>
@@ -3385,8 +3725,8 @@
         <w:t xml:space="preserve">relative-outlier detector that is robust to the train-to-field domain shift.</w:t>
       </w:r>
     </w:p>
-    <w:bookmarkEnd w:id="26"/>
-    <w:bookmarkStart w:id="27" w:name="b-yamnet-cross-check"/>
+    <w:bookmarkEnd w:id="27"/>
+    <w:bookmarkStart w:id="28" w:name="b-yamnet-cross-check"/>
     <w:p>
       <w:pPr>
         <w:pStyle w:val="Heading4"/>
@@ -3482,8 +3822,8 @@
         <w:t xml:space="preserve">confirm primates.</w:t>
       </w:r>
     </w:p>
-    <w:bookmarkEnd w:id="27"/>
-    <w:bookmarkStart w:id="28" w:name="c-temporal-isolation-filter"/>
+    <w:bookmarkEnd w:id="28"/>
+    <w:bookmarkStart w:id="29" w:name="c-temporal-isolation-filter"/>
     <w:p>
       <w:pPr>
         <w:pStyle w:val="Heading4"/>
@@ -3629,9 +3969,9 @@
         <w:t xml:space="preserve">exported as labelled WAV clips for the next stage.</w:t>
       </w:r>
     </w:p>
-    <w:bookmarkEnd w:id="28"/>
     <w:bookmarkEnd w:id="29"/>
-    <w:bookmarkStart w:id="30" w:name="iterative-hard-negative-mining"/>
+    <w:bookmarkEnd w:id="30"/>
+    <w:bookmarkStart w:id="31" w:name="iterative-hard-negative-mining"/>
     <w:p>
       <w:pPr>
         <w:pStyle w:val="Heading2"/>
@@ -3825,9 +4165,9 @@
         <w:t xml:space="preserve">source recordings have been deleted to save storage.</w:t>
       </w:r>
     </w:p>
-    <w:bookmarkEnd w:id="30"/>
     <w:bookmarkEnd w:id="31"/>
-    <w:bookmarkStart w:id="45" w:name="method-validation"/>
+    <w:bookmarkEnd w:id="32"/>
+    <w:bookmarkStart w:id="46" w:name="method-validation"/>
     <w:p>
       <w:pPr>
         <w:pStyle w:val="Heading1"/>
@@ -3878,7 +4218,7 @@
         <w:t xml:space="preserve">false-positive rate.</w:t>
       </w:r>
     </w:p>
-    <w:bookmarkStart w:id="42" w:name="validation-set-performance-v12-model."/>
+    <w:bookmarkStart w:id="43" w:name="validation-set-performance-v12-model."/>
     <w:p>
       <w:pPr>
         <w:pStyle w:val="Heading4"/>
@@ -3958,7 +4298,7 @@
           <w:rPr>
             <w:rStyle w:val="Hyperlink"/>
           </w:rPr>
-          <w:t xml:space="preserve">1</w:t>
+          <w:t xml:space="preserve">2</w:t>
         </w:r>
       </w:hyperlink>
       <w:r>
@@ -3978,7 +4318,7 @@
           <w:rPr>
             <w:rStyle w:val="Hyperlink"/>
           </w:rPr>
-          <w:t xml:space="preserve">2</w:t>
+          <w:t xml:space="preserve">3</w:t>
         </w:r>
       </w:hyperlink>
       <w:r>
@@ -3988,7 +4328,7 @@
         <w:t xml:space="preserve">gives the full confusion matrix.</w:t>
       </w:r>
     </w:p>
-    <w:bookmarkStart w:id="35" w:name="fig:training"/>
+    <w:bookmarkStart w:id="36" w:name="fig:training"/>
     <w:p>
       <w:pPr>
         <w:pStyle w:val="CaptionedFigure"/>
@@ -3998,18 +4338,18 @@
           <wp:inline>
             <wp:extent cx="5334000" cy="2115910"/>
             <wp:effectExtent b="0" l="0" r="0" t="0"/>
-            <wp:docPr descr="" title="" id="33" name="Picture"/>
+            <wp:docPr descr="" title="" id="34" name="Picture"/>
             <a:graphic>
               <a:graphicData uri="http://schemas.openxmlformats.org/drawingml/2006/picture">
                 <pic:pic>
                   <pic:nvPicPr>
-                    <pic:cNvPr descr="training_curves_v12.pdf" id="34" name="Picture"/>
+                    <pic:cNvPr descr="training_curves_v12.pdf" id="35" name="Picture"/>
                     <pic:cNvPicPr>
                       <a:picLocks noChangeArrowheads="1" noChangeAspect="1"/>
                     </pic:cNvPicPr>
                   </pic:nvPicPr>
                   <pic:blipFill>
-                    <a:blip r:embed="rId32"/>
+                    <a:blip r:embed="rId33"/>
                     <a:stretch>
                       <a:fillRect/>
                     </a:stretch>
@@ -4068,8 +4408,8 @@
         <w:t xml:space="preserve">checkpoint (98.12 %).</w:t>
       </w:r>
     </w:p>
-    <w:bookmarkEnd w:id="35"/>
-    <w:bookmarkStart w:id="36" w:name="tab:val"/>
+    <w:bookmarkEnd w:id="36"/>
+    <w:bookmarkStart w:id="37" w:name="tab:val"/>
     <w:p>
       <w:pPr>
         <w:pStyle w:val="TableCaption"/>
@@ -4413,8 +4753,8 @@
         </w:tc>
       </w:tr>
     </w:tbl>
-    <w:bookmarkEnd w:id="36"/>
-    <w:bookmarkStart w:id="37" w:name="tab:confusion"/>
+    <w:bookmarkEnd w:id="37"/>
+    <w:bookmarkStart w:id="38" w:name="tab:confusion"/>
     <w:p>
       <w:pPr>
         <w:pStyle w:val="TableCaption"/>
@@ -4780,8 +5120,8 @@
         </w:tc>
       </w:tr>
     </w:tbl>
-    <w:bookmarkEnd w:id="37"/>
-    <w:bookmarkStart w:id="41" w:name="fig:confusion"/>
+    <w:bookmarkEnd w:id="38"/>
+    <w:bookmarkStart w:id="42" w:name="fig:confusion"/>
     <w:p>
       <w:pPr>
         <w:pStyle w:val="CaptionedFigure"/>
@@ -4791,18 +5131,18 @@
           <wp:inline>
             <wp:extent cx="3467100" cy="2929699"/>
             <wp:effectExtent b="0" l="0" r="0" t="0"/>
-            <wp:docPr descr="" title="" id="39" name="Picture"/>
+            <wp:docPr descr="" title="" id="40" name="Picture"/>
             <a:graphic>
               <a:graphicData uri="http://schemas.openxmlformats.org/drawingml/2006/picture">
                 <pic:pic>
                   <pic:nvPicPr>
-                    <pic:cNvPr descr="confusion_matrix_v12.pdf" id="40" name="Picture"/>
+                    <pic:cNvPr descr="confusion_matrix_v12.pdf" id="41" name="Picture"/>
                     <pic:cNvPicPr>
                       <a:picLocks noChangeArrowheads="1" noChangeAspect="1"/>
                     </pic:cNvPicPr>
                   </pic:nvPicPr>
                   <pic:blipFill>
-                    <a:blip r:embed="rId38"/>
+                    <a:blip r:embed="rId39"/>
                     <a:stretch>
                       <a:fillRect/>
                     </a:stretch>
@@ -4882,7 +5222,7 @@
         <w:t xml:space="preserve">is exactly zero.</w:t>
       </w:r>
     </w:p>
-    <w:bookmarkEnd w:id="41"/>
+    <w:bookmarkEnd w:id="42"/>
     <w:p>
       <w:pPr>
         <w:pStyle w:val="BodyText"/>
@@ -5106,8 +5446,8 @@
         <w:t xml:space="preserve">high-frequency shortcut that previously caused Cernic–confuser confusion.</w:t>
       </w:r>
     </w:p>
-    <w:bookmarkEnd w:id="42"/>
-    <w:bookmarkStart w:id="43" w:name="field-deployment."/>
+    <w:bookmarkEnd w:id="43"/>
+    <w:bookmarkStart w:id="44" w:name="field-deployment."/>
     <w:p>
       <w:pPr>
         <w:pStyle w:val="Heading4"/>
@@ -5269,8 +5609,8 @@
         <w:t xml:space="preserve">all stations have been processed.</w:t>
       </w:r>
     </w:p>
-    <w:bookmarkEnd w:id="43"/>
-    <w:bookmarkStart w:id="44" w:name="Xfd7e2a660e56df99e009fb7f8d0a1a9ea97b8e1"/>
+    <w:bookmarkEnd w:id="44"/>
+    <w:bookmarkStart w:id="45" w:name="Xfd7e2a660e56df99e009fb7f8d0a1a9ea97b8e1"/>
     <w:p>
       <w:pPr>
         <w:pStyle w:val="Heading4"/>
@@ -5535,9 +5875,9 @@
         <w:t xml:space="preserve">deployed across all stations.</w:t>
       </w:r>
     </w:p>
-    <w:bookmarkEnd w:id="44"/>
     <w:bookmarkEnd w:id="45"/>
-    <w:bookmarkStart w:id="46" w:name="limitations"/>
+    <w:bookmarkEnd w:id="46"/>
+    <w:bookmarkStart w:id="47" w:name="limitations"/>
     <w:p>
       <w:pPr>
         <w:pStyle w:val="Heading1"/>
@@ -6000,8 +6340,8 @@
         <w:t xml:space="preserve">assumptions.</w:t>
       </w:r>
     </w:p>
-    <w:bookmarkEnd w:id="46"/>
-    <w:bookmarkStart w:id="47" w:name="ethics-statements"/>
+    <w:bookmarkEnd w:id="47"/>
+    <w:bookmarkStart w:id="48" w:name="ethics-statements"/>
     <w:p>
       <w:pPr>
         <w:pStyle w:val="Heading1"/>
@@ -6054,8 +6394,8 @@
         <w:t xml:space="preserve">guidelines for non-invasive field research.]</w:t>
       </w:r>
     </w:p>
-    <w:bookmarkEnd w:id="47"/>
-    <w:bookmarkStart w:id="48" w:name="credit-author-statement"/>
+    <w:bookmarkEnd w:id="48"/>
+    <w:bookmarkStart w:id="49" w:name="credit-author-statement"/>
     <w:p>
       <w:pPr>
         <w:pStyle w:val="Heading1"/>
@@ -6110,8 +6450,8 @@
         <w:t xml:space="preserve">editing, Funding acquisition].</w:t>
       </w:r>
     </w:p>
-    <w:bookmarkEnd w:id="48"/>
-    <w:bookmarkStart w:id="49" w:name="acknowledgments"/>
+    <w:bookmarkEnd w:id="49"/>
+    <w:bookmarkStart w:id="50" w:name="acknowledgments"/>
     <w:p>
       <w:pPr>
         <w:pStyle w:val="Heading1"/>
@@ -6146,8 +6486,8 @@
         <w:t xml:space="preserve">commercial, or not-for-profit sectors.</w:t>
       </w:r>
     </w:p>
-    <w:bookmarkEnd w:id="49"/>
-    <w:bookmarkStart w:id="50" w:name="declaration-of-interests"/>
+    <w:bookmarkEnd w:id="50"/>
+    <w:bookmarkStart w:id="51" w:name="declaration-of-interests"/>
     <w:p>
       <w:pPr>
         <w:pStyle w:val="Heading1"/>
@@ -6212,8 +6552,8 @@
         <w:t xml:space="preserve">competing interests:</w:t>
       </w:r>
     </w:p>
-    <w:bookmarkEnd w:id="50"/>
-    <w:bookmarkStart w:id="51" w:name="data-availability"/>
+    <w:bookmarkEnd w:id="51"/>
+    <w:bookmarkStart w:id="52" w:name="data-availability"/>
     <w:p>
       <w:pPr>
         <w:pStyle w:val="Heading1"/>
@@ -6289,8 +6629,8 @@
         <w:t xml:space="preserve">.]</w:t>
       </w:r>
     </w:p>
-    <w:bookmarkEnd w:id="51"/>
-    <w:bookmarkStart w:id="61" w:name="Xcca0bcaed302a7900b6627b02d68ebe31e9e060"/>
+    <w:bookmarkEnd w:id="52"/>
+    <w:bookmarkStart w:id="62" w:name="Xcca0bcaed302a7900b6627b02d68ebe31e9e060"/>
     <w:p>
       <w:pPr>
         <w:pStyle w:val="Heading1"/>
@@ -6358,7 +6698,7 @@
       <w:r>
         <w:t xml:space="preserve"> </w:t>
       </w:r>
-      <w:hyperlink r:id="rId52">
+      <w:hyperlink r:id="rId53">
         <w:r>
           <w:rPr>
             <w:rStyle w:val="Hyperlink"/>
@@ -6389,7 +6729,7 @@
       <w:r>
         <w:t xml:space="preserve"> </w:t>
       </w:r>
-      <w:hyperlink r:id="rId53">
+      <w:hyperlink r:id="rId54">
         <w:r>
           <w:rPr>
             <w:rStyle w:val="Hyperlink"/>
@@ -6420,7 +6760,7 @@
       <w:r>
         <w:t xml:space="preserve"> </w:t>
       </w:r>
-      <w:hyperlink r:id="rId54">
+      <w:hyperlink r:id="rId55">
         <w:r>
           <w:rPr>
             <w:rStyle w:val="Hyperlink"/>
@@ -6451,7 +6791,7 @@
       <w:r>
         <w:t xml:space="preserve"> </w:t>
       </w:r>
-      <w:hyperlink r:id="rId55">
+      <w:hyperlink r:id="rId56">
         <w:r>
           <w:rPr>
             <w:rStyle w:val="Hyperlink"/>
@@ -6488,7 +6828,7 @@
       <w:r>
         <w:t xml:space="preserve"> </w:t>
       </w:r>
-      <w:hyperlink r:id="rId56">
+      <w:hyperlink r:id="rId57">
         <w:r>
           <w:rPr>
             <w:rStyle w:val="Hyperlink"/>
@@ -6531,7 +6871,7 @@
       <w:r>
         <w:t xml:space="preserve"> </w:t>
       </w:r>
-      <w:hyperlink r:id="rId57">
+      <w:hyperlink r:id="rId58">
         <w:r>
           <w:rPr>
             <w:rStyle w:val="Hyperlink"/>
@@ -6562,7 +6902,7 @@
       <w:r>
         <w:t xml:space="preserve"> </w:t>
       </w:r>
-      <w:hyperlink r:id="rId58">
+      <w:hyperlink r:id="rId59">
         <w:r>
           <w:rPr>
             <w:rStyle w:val="Hyperlink"/>
@@ -6599,7 +6939,7 @@
       <w:r>
         <w:t xml:space="preserve"> </w:t>
       </w:r>
-      <w:hyperlink r:id="rId59">
+      <w:hyperlink r:id="rId60">
         <w:r>
           <w:rPr>
             <w:rStyle w:val="Hyperlink"/>
@@ -6630,7 +6970,7 @@
       <w:r>
         <w:t xml:space="preserve"> </w:t>
       </w:r>
-      <w:hyperlink r:id="rId60">
+      <w:hyperlink r:id="rId61">
         <w:r>
           <w:rPr>
             <w:rStyle w:val="Hyperlink"/>
@@ -6639,7 +6979,7 @@
         </w:r>
       </w:hyperlink>
     </w:p>
-    <w:bookmarkEnd w:id="61"/>
+    <w:bookmarkEnd w:id="62"/>
     <w:sectPr>
       <w:footnotePr>
         <w:numRestart w:val="eachSect"/>

</xml_diff>

<commit_message>
Method details S3: add academic augmentation figure, retire stale one
- Rewrite make_augmentation_figure.py in the academic style (Liberation
  Serif, muted palette) shared with the other manuscript figures
- New figure has two panels: (A) standard 7x augmentation, (B) the V12
  high-frequency nuisance augmentation shown as a mel-spectrogram schematic
  (low-frequency roar kept, >1.5 kHz replaced with random background)
- Correct content: 2 s clips, Colobus-only HF nuisance; drop the stale
  "5 s audio / ~870 clips" footer
- Insert the figure in S3 and reference panels A and B from the text
- Remove the obsolete bright-flowchart augmentation_pipeline.png

https://claude.ai/code/session_01GRhKW3iKJjm2wYYeUd56Hq
</commit_message>
<xml_diff>
--- a/paper/methodsx_manuscript.docx
+++ b/paper/methodsx_manuscript.docx
@@ -969,7 +969,7 @@
       </w:r>
     </w:p>
     <w:bookmarkEnd w:id="13"/>
-    <w:bookmarkStart w:id="32" w:name="method-details"/>
+    <w:bookmarkStart w:id="36" w:name="method-details"/>
     <w:p>
       <w:pPr>
         <w:pStyle w:val="Heading1"/>
@@ -2059,7 +2059,7 @@
       </w:r>
     </w:p>
     <w:bookmarkEnd w:id="16"/>
-    <w:bookmarkStart w:id="18" w:name="data-augmentation"/>
+    <w:bookmarkStart w:id="22" w:name="data-augmentation"/>
     <w:p>
       <w:pPr>
         <w:pStyle w:val="Heading2"/>
@@ -2099,7 +2099,24 @@
         <w:t xml:space="preserve"> </w:t>
       </w:r>
       <w:r>
-        <w:t xml:space="preserve">multiplier): one unaltered copy; three copies mixed with</w:t>
+        <w:t xml:space="preserve">multiplier; Fig. </w:t>
+      </w:r>
+      <w:hyperlink w:anchor="fig:augmentation">
+        <w:r>
+          <w:rPr>
+            <w:rStyle w:val="Hyperlink"/>
+          </w:rPr>
+          <w:t xml:space="preserve">1</w:t>
+        </w:r>
+      </w:hyperlink>
+      <w:r>
+        <w:t xml:space="preserve">A): one unaltered</w:t>
+      </w:r>
+      <w:r>
+        <w:t xml:space="preserve"> </w:t>
+      </w:r>
+      <w:r>
+        <w:t xml:space="preserve">copy; three copies mixed with</w:t>
       </w:r>
       <w:r>
         <w:t xml:space="preserve"> </w:t>
@@ -2187,7 +2204,7 @@
         <w:t xml:space="preserve">.</w:t>
       </w:r>
     </w:p>
-    <w:bookmarkStart w:id="17" w:name="X877d4525f2ce6283914e1771e5b4ee23a60ca6f"/>
+    <w:bookmarkStart w:id="21" w:name="X877d4525f2ce6283914e1771e5b4ee23a60ca6f"/>
     <w:p>
       <w:pPr>
         <w:pStyle w:val="Heading4"/>
@@ -2360,24 +2377,188 @@
         <w:t xml:space="preserve"> </w:t>
       </w:r>
       <w:r>
-        <w:t xml:space="preserve">invariant low-frequency roar. The augmentation is deliberately not applied to</w:t>
-      </w:r>
-      <w:r>
-        <w:t xml:space="preserve"> </w:t>
-      </w:r>
-      <w:r>
-        <w:t xml:space="preserve">Cernic, whose calls genuinely occupy higher frequencies and must keep their</w:t>
-      </w:r>
-      <w:r>
-        <w:t xml:space="preserve"> </w:t>
-      </w:r>
-      <w:r>
-        <w:t xml:space="preserve">high band intact.</w:t>
-      </w:r>
-    </w:p>
-    <w:bookmarkEnd w:id="17"/>
-    <w:bookmarkEnd w:id="18"/>
-    <w:bookmarkStart w:id="20" w:name="model-architecture"/>
+        <w:t xml:space="preserve">invariant low-frequency roar (Fig. </w:t>
+      </w:r>
+      <w:hyperlink w:anchor="fig:augmentation">
+        <w:r>
+          <w:rPr>
+            <w:rStyle w:val="Hyperlink"/>
+          </w:rPr>
+          <w:t xml:space="preserve">1</w:t>
+        </w:r>
+      </w:hyperlink>
+      <w:r>
+        <w:t xml:space="preserve">B). The augmentation</w:t>
+      </w:r>
+      <w:r>
+        <w:t xml:space="preserve"> </w:t>
+      </w:r>
+      <w:r>
+        <w:t xml:space="preserve">is deliberately not applied to Cernic, whose calls genuinely occupy higher</w:t>
+      </w:r>
+      <w:r>
+        <w:t xml:space="preserve"> </w:t>
+      </w:r>
+      <w:r>
+        <w:t xml:space="preserve">frequencies and must keep their high band intact.</w:t>
+      </w:r>
+    </w:p>
+    <w:bookmarkStart w:id="20" w:name="fig:augmentation"/>
+    <w:p>
+      <w:pPr>
+        <w:pStyle w:val="CaptionedFigure"/>
+      </w:pPr>
+      <w:r>
+        <w:drawing>
+          <wp:inline>
+            <wp:extent cx="5334000" cy="3518170"/>
+            <wp:effectExtent b="0" l="0" r="0" t="0"/>
+            <wp:docPr descr="" title="" id="18" name="Picture"/>
+            <a:graphic>
+              <a:graphicData uri="http://schemas.openxmlformats.org/drawingml/2006/picture">
+                <pic:pic>
+                  <pic:nvPicPr>
+                    <pic:cNvPr descr="augmentation_v12.pdf" id="19" name="Picture"/>
+                    <pic:cNvPicPr>
+                      <a:picLocks noChangeArrowheads="1" noChangeAspect="1"/>
+                    </pic:cNvPicPr>
+                  </pic:nvPicPr>
+                  <pic:blipFill>
+                    <a:blip r:embed="rId17"/>
+                    <a:stretch>
+                      <a:fillRect/>
+                    </a:stretch>
+                  </pic:blipFill>
+                  <pic:spPr bwMode="auto">
+                    <a:xfrm>
+                      <a:off x="0" y="0"/>
+                      <a:ext cx="5334000" cy="3518170"/>
+                    </a:xfrm>
+                    <a:prstGeom prst="rect">
+                      <a:avLst/>
+                    </a:prstGeom>
+                    <a:noFill/>
+                    <a:ln w="9525">
+                      <a:noFill/>
+                      <a:headEnd/>
+                      <a:tailEnd/>
+                    </a:ln>
+                  </pic:spPr>
+                </pic:pic>
+              </a:graphicData>
+            </a:graphic>
+          </wp:inline>
+        </w:drawing>
+      </w:r>
+    </w:p>
+    <w:p>
+      <w:pPr>
+        <w:pStyle w:val="ImageCaption"/>
+      </w:pPr>
+      <w:r>
+        <w:t xml:space="preserve">Spectrogram data augmentation. (A) Standard augmentation expands each</w:t>
+      </w:r>
+      <w:r>
+        <w:t xml:space="preserve"> </w:t>
+      </w:r>
+      <w:r>
+        <w:t xml:space="preserve">target-class clip into seven variants (one original, three background mixes at</w:t>
+      </w:r>
+      <w:r>
+        <w:t xml:space="preserve"> </w:t>
+      </w:r>
+      <m:oMath>
+        <m:r>
+          <m:rPr>
+            <m:sty m:val="p"/>
+          </m:rPr>
+          <m:t>−</m:t>
+        </m:r>
+        <m:r>
+          <m:t>5</m:t>
+        </m:r>
+      </m:oMath>
+      <w:r>
+        <w:t xml:space="preserve"> </w:t>
+      </w:r>
+      <w:r>
+        <w:t xml:space="preserve">to 10 dB SNR, a time crop, a frequency crop, and a</w:t>
+      </w:r>
+      <w:r>
+        <w:t xml:space="preserve"> </w:t>
+      </w:r>
+      <m:oMath>
+        <m:r>
+          <m:rPr>
+            <m:sty m:val="p"/>
+          </m:rPr>
+          <m:t>±</m:t>
+        </m:r>
+      </m:oMath>
+      <w:r>
+        <w:t xml:space="preserve">20-mel-bin</w:t>
+      </w:r>
+      <w:r>
+        <w:t xml:space="preserve"> </w:t>
+      </w:r>
+      <w:r>
+        <w:t xml:space="preserve">frequency shift). (B) High-frequency nuisance augmentation adds two further</w:t>
+      </w:r>
+      <w:r>
+        <w:t xml:space="preserve"> </w:t>
+      </w:r>
+      <w:r>
+        <w:t xml:space="preserve">variants for</w:t>
+      </w:r>
+      <w:r>
+        <w:t xml:space="preserve"> </w:t>
+      </w:r>
+      <w:r>
+        <w:rPr>
+          <w:i/>
+          <w:iCs/>
+        </w:rPr>
+        <w:t xml:space="preserve">Colobus guereza</w:t>
+      </w:r>
+      <w:r>
+        <w:t xml:space="preserve"> </w:t>
+      </w:r>
+      <w:r>
+        <w:t xml:space="preserve">only: the mel band above 1.5 kHz is</w:t>
+      </w:r>
+      <w:r>
+        <w:t xml:space="preserve"> </w:t>
+      </w:r>
+      <w:r>
+        <w:t xml:space="preserve">replaced with the high band of a random background clip while the</w:t>
+      </w:r>
+      <w:r>
+        <w:t xml:space="preserve"> </w:t>
+      </w:r>
+      <w:r>
+        <w:t xml:space="preserve">low-frequency roar is kept, decorrelating high-frequency texture from the</w:t>
+      </w:r>
+      <w:r>
+        <w:t xml:space="preserve"> </w:t>
+      </w:r>
+      <w:r>
+        <w:rPr>
+          <w:i/>
+          <w:iCs/>
+        </w:rPr>
+        <w:t xml:space="preserve">Colobus</w:t>
+      </w:r>
+      <w:r>
+        <w:t xml:space="preserve"> </w:t>
+      </w:r>
+      <w:r>
+        <w:t xml:space="preserve">label.</w:t>
+      </w:r>
+    </w:p>
+    <w:bookmarkEnd w:id="20"/>
+    <w:bookmarkEnd w:id="21"/>
+    <w:bookmarkEnd w:id="22"/>
+    <w:bookmarkStart w:id="24" w:name="model-architecture"/>
     <w:p>
       <w:pPr>
         <w:pStyle w:val="Heading2"/>
@@ -2556,7 +2737,7 @@
         <w:t xml:space="preserve"> 28, 512 channels) is extracted before the final VGG19 block.</w:t>
       </w:r>
     </w:p>
-    <w:bookmarkStart w:id="19" w:name="frequency-position-encoding."/>
+    <w:bookmarkStart w:id="23" w:name="frequency-position-encoding."/>
     <w:p>
       <w:pPr>
         <w:pStyle w:val="Heading4"/>
@@ -2937,9 +3118,9 @@
         <w:t xml:space="preserve">Colobus_confuser, Background).</w:t>
       </w:r>
     </w:p>
-    <w:bookmarkEnd w:id="19"/>
-    <w:bookmarkEnd w:id="20"/>
-    <w:bookmarkStart w:id="24" w:name="model-training"/>
+    <w:bookmarkEnd w:id="23"/>
+    <w:bookmarkEnd w:id="24"/>
+    <w:bookmarkStart w:id="28" w:name="model-training"/>
     <w:p>
       <w:pPr>
         <w:pStyle w:val="Heading2"/>
@@ -2962,7 +3143,7 @@
         <w:t xml:space="preserve">protocol of head training followed by partial fine-tuning.</w:t>
       </w:r>
     </w:p>
-    <w:bookmarkStart w:id="21" w:name="stage-1-head-training."/>
+    <w:bookmarkStart w:id="25" w:name="stage-1-head-training."/>
     <w:p>
       <w:pPr>
         <w:pStyle w:val="Heading4"/>
@@ -3020,8 +3201,8 @@
         <w:t xml:space="preserve">, and the loss is sparse categorical cross-entropy.</w:t>
       </w:r>
     </w:p>
-    <w:bookmarkEnd w:id="21"/>
-    <w:bookmarkStart w:id="22" w:name="stage-2-partial-fine-tuning."/>
+    <w:bookmarkEnd w:id="25"/>
+    <w:bookmarkStart w:id="26" w:name="stage-2-partial-fine-tuning."/>
     <w:p>
       <w:pPr>
         <w:pStyle w:val="Heading4"/>
@@ -3112,8 +3293,8 @@
         <w:t xml:space="preserve">avoid catastrophic forgetting.</w:t>
       </w:r>
     </w:p>
-    <w:bookmarkEnd w:id="22"/>
-    <w:bookmarkStart w:id="23" w:name="shared-training-settings."/>
+    <w:bookmarkEnd w:id="26"/>
+    <w:bookmarkStart w:id="27" w:name="shared-training-settings."/>
     <w:p>
       <w:pPr>
         <w:pStyle w:val="Heading4"/>
@@ -3231,9 +3412,9 @@
         <w:t xml:space="preserve">per-class accuracy report and a confusion matrix on the validation set.</w:t>
       </w:r>
     </w:p>
-    <w:bookmarkEnd w:id="23"/>
-    <w:bookmarkEnd w:id="24"/>
-    <w:bookmarkStart w:id="26" w:name="sliding-window-detection"/>
+    <w:bookmarkEnd w:id="27"/>
+    <w:bookmarkEnd w:id="28"/>
+    <w:bookmarkStart w:id="30" w:name="sliding-window-detection"/>
     <w:p>
       <w:pPr>
         <w:pStyle w:val="Heading2"/>
@@ -3406,7 +3587,7 @@
         <w:t xml:space="preserve">non-maximum suppression at an intersection-over-union threshold of 0.5.</w:t>
       </w:r>
     </w:p>
-    <w:bookmarkStart w:id="25" w:name="low-frequency-energy-gate-for-colobus."/>
+    <w:bookmarkStart w:id="29" w:name="low-frequency-energy-gate-for-colobus."/>
     <w:p>
       <w:pPr>
         <w:pStyle w:val="Heading4"/>
@@ -3586,9 +3767,9 @@
         <w:t xml:space="preserve">review and downstream filtering do not require re-reading the long recordings.</w:t>
       </w:r>
     </w:p>
-    <w:bookmarkEnd w:id="25"/>
-    <w:bookmarkEnd w:id="26"/>
-    <w:bookmarkStart w:id="30" w:name="automatic-false-positive-cleanup"/>
+    <w:bookmarkEnd w:id="29"/>
+    <w:bookmarkEnd w:id="30"/>
+    <w:bookmarkStart w:id="34" w:name="automatic-false-positive-cleanup"/>
     <w:p>
       <w:pPr>
         <w:pStyle w:val="Heading2"/>
@@ -3629,7 +3810,7 @@
         <w:t xml:space="preserve">source recording.</w:t>
       </w:r>
     </w:p>
-    <w:bookmarkStart w:id="27" w:name="a-mahalanobis-out-of-distribution-filter"/>
+    <w:bookmarkStart w:id="31" w:name="a-mahalanobis-out-of-distribution-filter"/>
     <w:p>
       <w:pPr>
         <w:pStyle w:val="Heading4"/>
@@ -3725,8 +3906,8 @@
         <w:t xml:space="preserve">relative-outlier detector that is robust to the train-to-field domain shift.</w:t>
       </w:r>
     </w:p>
-    <w:bookmarkEnd w:id="27"/>
-    <w:bookmarkStart w:id="28" w:name="b-yamnet-cross-check"/>
+    <w:bookmarkEnd w:id="31"/>
+    <w:bookmarkStart w:id="32" w:name="b-yamnet-cross-check"/>
     <w:p>
       <w:pPr>
         <w:pStyle w:val="Heading4"/>
@@ -3822,8 +4003,8 @@
         <w:t xml:space="preserve">confirm primates.</w:t>
       </w:r>
     </w:p>
-    <w:bookmarkEnd w:id="28"/>
-    <w:bookmarkStart w:id="29" w:name="c-temporal-isolation-filter"/>
+    <w:bookmarkEnd w:id="32"/>
+    <w:bookmarkStart w:id="33" w:name="c-temporal-isolation-filter"/>
     <w:p>
       <w:pPr>
         <w:pStyle w:val="Heading4"/>
@@ -3969,9 +4150,9 @@
         <w:t xml:space="preserve">exported as labelled WAV clips for the next stage.</w:t>
       </w:r>
     </w:p>
-    <w:bookmarkEnd w:id="29"/>
-    <w:bookmarkEnd w:id="30"/>
-    <w:bookmarkStart w:id="31" w:name="iterative-hard-negative-mining"/>
+    <w:bookmarkEnd w:id="33"/>
+    <w:bookmarkEnd w:id="34"/>
+    <w:bookmarkStart w:id="35" w:name="iterative-hard-negative-mining"/>
     <w:p>
       <w:pPr>
         <w:pStyle w:val="Heading2"/>
@@ -4165,9 +4346,9 @@
         <w:t xml:space="preserve">source recordings have been deleted to save storage.</w:t>
       </w:r>
     </w:p>
-    <w:bookmarkEnd w:id="31"/>
-    <w:bookmarkEnd w:id="32"/>
-    <w:bookmarkStart w:id="46" w:name="method-validation"/>
+    <w:bookmarkEnd w:id="35"/>
+    <w:bookmarkEnd w:id="36"/>
+    <w:bookmarkStart w:id="50" w:name="method-validation"/>
     <w:p>
       <w:pPr>
         <w:pStyle w:val="Heading1"/>
@@ -4218,7 +4399,7 @@
         <w:t xml:space="preserve">false-positive rate.</w:t>
       </w:r>
     </w:p>
-    <w:bookmarkStart w:id="43" w:name="validation-set-performance-v12-model."/>
+    <w:bookmarkStart w:id="47" w:name="validation-set-performance-v12-model."/>
     <w:p>
       <w:pPr>
         <w:pStyle w:val="Heading4"/>
@@ -4257,7 +4438,7 @@
           <w:rPr>
             <w:rStyle w:val="Hyperlink"/>
           </w:rPr>
-          <w:t xml:space="preserve">1</w:t>
+          <w:t xml:space="preserve">2</w:t>
         </w:r>
       </w:hyperlink>
       <w:r>
@@ -4328,7 +4509,7 @@
         <w:t xml:space="preserve">gives the full confusion matrix.</w:t>
       </w:r>
     </w:p>
-    <w:bookmarkStart w:id="36" w:name="fig:training"/>
+    <w:bookmarkStart w:id="40" w:name="fig:training"/>
     <w:p>
       <w:pPr>
         <w:pStyle w:val="CaptionedFigure"/>
@@ -4338,18 +4519,18 @@
           <wp:inline>
             <wp:extent cx="5334000" cy="2115910"/>
             <wp:effectExtent b="0" l="0" r="0" t="0"/>
-            <wp:docPr descr="" title="" id="34" name="Picture"/>
+            <wp:docPr descr="" title="" id="38" name="Picture"/>
             <a:graphic>
               <a:graphicData uri="http://schemas.openxmlformats.org/drawingml/2006/picture">
                 <pic:pic>
                   <pic:nvPicPr>
-                    <pic:cNvPr descr="training_curves_v12.pdf" id="35" name="Picture"/>
+                    <pic:cNvPr descr="training_curves_v12.pdf" id="39" name="Picture"/>
                     <pic:cNvPicPr>
                       <a:picLocks noChangeArrowheads="1" noChangeAspect="1"/>
                     </pic:cNvPicPr>
                   </pic:nvPicPr>
                   <pic:blipFill>
-                    <a:blip r:embed="rId33"/>
+                    <a:blip r:embed="rId37"/>
                     <a:stretch>
                       <a:fillRect/>
                     </a:stretch>
@@ -4408,8 +4589,8 @@
         <w:t xml:space="preserve">checkpoint (98.12 %).</w:t>
       </w:r>
     </w:p>
-    <w:bookmarkEnd w:id="36"/>
-    <w:bookmarkStart w:id="37" w:name="tab:val"/>
+    <w:bookmarkEnd w:id="40"/>
+    <w:bookmarkStart w:id="41" w:name="tab:val"/>
     <w:p>
       <w:pPr>
         <w:pStyle w:val="TableCaption"/>
@@ -4753,8 +4934,8 @@
         </w:tc>
       </w:tr>
     </w:tbl>
-    <w:bookmarkEnd w:id="37"/>
-    <w:bookmarkStart w:id="38" w:name="tab:confusion"/>
+    <w:bookmarkEnd w:id="41"/>
+    <w:bookmarkStart w:id="42" w:name="tab:confusion"/>
     <w:p>
       <w:pPr>
         <w:pStyle w:val="TableCaption"/>
@@ -5120,8 +5301,8 @@
         </w:tc>
       </w:tr>
     </w:tbl>
-    <w:bookmarkEnd w:id="38"/>
-    <w:bookmarkStart w:id="42" w:name="fig:confusion"/>
+    <w:bookmarkEnd w:id="42"/>
+    <w:bookmarkStart w:id="46" w:name="fig:confusion"/>
     <w:p>
       <w:pPr>
         <w:pStyle w:val="CaptionedFigure"/>
@@ -5131,18 +5312,18 @@
           <wp:inline>
             <wp:extent cx="3467100" cy="2929699"/>
             <wp:effectExtent b="0" l="0" r="0" t="0"/>
-            <wp:docPr descr="" title="" id="40" name="Picture"/>
+            <wp:docPr descr="" title="" id="44" name="Picture"/>
             <a:graphic>
               <a:graphicData uri="http://schemas.openxmlformats.org/drawingml/2006/picture">
                 <pic:pic>
                   <pic:nvPicPr>
-                    <pic:cNvPr descr="confusion_matrix_v12.pdf" id="41" name="Picture"/>
+                    <pic:cNvPr descr="confusion_matrix_v12.pdf" id="45" name="Picture"/>
                     <pic:cNvPicPr>
                       <a:picLocks noChangeArrowheads="1" noChangeAspect="1"/>
                     </pic:cNvPicPr>
                   </pic:nvPicPr>
                   <pic:blipFill>
-                    <a:blip r:embed="rId39"/>
+                    <a:blip r:embed="rId43"/>
                     <a:stretch>
                       <a:fillRect/>
                     </a:stretch>
@@ -5222,7 +5403,7 @@
         <w:t xml:space="preserve">is exactly zero.</w:t>
       </w:r>
     </w:p>
-    <w:bookmarkEnd w:id="42"/>
+    <w:bookmarkEnd w:id="46"/>
     <w:p>
       <w:pPr>
         <w:pStyle w:val="BodyText"/>
@@ -5241,7 +5422,7 @@
           <w:rPr>
             <w:rStyle w:val="Hyperlink"/>
           </w:rPr>
-          <w:t xml:space="preserve">2</w:t>
+          <w:t xml:space="preserve">3</w:t>
         </w:r>
       </w:hyperlink>
       <w:r>
@@ -5446,8 +5627,8 @@
         <w:t xml:space="preserve">high-frequency shortcut that previously caused Cernic–confuser confusion.</w:t>
       </w:r>
     </w:p>
-    <w:bookmarkEnd w:id="43"/>
-    <w:bookmarkStart w:id="44" w:name="field-deployment."/>
+    <w:bookmarkEnd w:id="47"/>
+    <w:bookmarkStart w:id="48" w:name="field-deployment."/>
     <w:p>
       <w:pPr>
         <w:pStyle w:val="Heading4"/>
@@ -5609,8 +5790,8 @@
         <w:t xml:space="preserve">all stations have been processed.</w:t>
       </w:r>
     </w:p>
-    <w:bookmarkEnd w:id="44"/>
-    <w:bookmarkStart w:id="45" w:name="Xfd7e2a660e56df99e009fb7f8d0a1a9ea97b8e1"/>
+    <w:bookmarkEnd w:id="48"/>
+    <w:bookmarkStart w:id="49" w:name="Xfd7e2a660e56df99e009fb7f8d0a1a9ea97b8e1"/>
     <w:p>
       <w:pPr>
         <w:pStyle w:val="Heading4"/>
@@ -5875,9 +6056,9 @@
         <w:t xml:space="preserve">deployed across all stations.</w:t>
       </w:r>
     </w:p>
-    <w:bookmarkEnd w:id="45"/>
-    <w:bookmarkEnd w:id="46"/>
-    <w:bookmarkStart w:id="47" w:name="limitations"/>
+    <w:bookmarkEnd w:id="49"/>
+    <w:bookmarkEnd w:id="50"/>
+    <w:bookmarkStart w:id="51" w:name="limitations"/>
     <w:p>
       <w:pPr>
         <w:pStyle w:val="Heading1"/>
@@ -6340,8 +6521,8 @@
         <w:t xml:space="preserve">assumptions.</w:t>
       </w:r>
     </w:p>
-    <w:bookmarkEnd w:id="47"/>
-    <w:bookmarkStart w:id="48" w:name="ethics-statements"/>
+    <w:bookmarkEnd w:id="51"/>
+    <w:bookmarkStart w:id="52" w:name="ethics-statements"/>
     <w:p>
       <w:pPr>
         <w:pStyle w:val="Heading1"/>
@@ -6394,8 +6575,8 @@
         <w:t xml:space="preserve">guidelines for non-invasive field research.]</w:t>
       </w:r>
     </w:p>
-    <w:bookmarkEnd w:id="48"/>
-    <w:bookmarkStart w:id="49" w:name="credit-author-statement"/>
+    <w:bookmarkEnd w:id="52"/>
+    <w:bookmarkStart w:id="53" w:name="credit-author-statement"/>
     <w:p>
       <w:pPr>
         <w:pStyle w:val="Heading1"/>
@@ -6450,8 +6631,8 @@
         <w:t xml:space="preserve">editing, Funding acquisition].</w:t>
       </w:r>
     </w:p>
-    <w:bookmarkEnd w:id="49"/>
-    <w:bookmarkStart w:id="50" w:name="acknowledgments"/>
+    <w:bookmarkEnd w:id="53"/>
+    <w:bookmarkStart w:id="54" w:name="acknowledgments"/>
     <w:p>
       <w:pPr>
         <w:pStyle w:val="Heading1"/>
@@ -6486,8 +6667,8 @@
         <w:t xml:space="preserve">commercial, or not-for-profit sectors.</w:t>
       </w:r>
     </w:p>
-    <w:bookmarkEnd w:id="50"/>
-    <w:bookmarkStart w:id="51" w:name="declaration-of-interests"/>
+    <w:bookmarkEnd w:id="54"/>
+    <w:bookmarkStart w:id="55" w:name="declaration-of-interests"/>
     <w:p>
       <w:pPr>
         <w:pStyle w:val="Heading1"/>
@@ -6552,8 +6733,8 @@
         <w:t xml:space="preserve">competing interests:</w:t>
       </w:r>
     </w:p>
-    <w:bookmarkEnd w:id="51"/>
-    <w:bookmarkStart w:id="52" w:name="data-availability"/>
+    <w:bookmarkEnd w:id="55"/>
+    <w:bookmarkStart w:id="56" w:name="data-availability"/>
     <w:p>
       <w:pPr>
         <w:pStyle w:val="Heading1"/>
@@ -6629,8 +6810,8 @@
         <w:t xml:space="preserve">.]</w:t>
       </w:r>
     </w:p>
-    <w:bookmarkEnd w:id="52"/>
-    <w:bookmarkStart w:id="62" w:name="Xcca0bcaed302a7900b6627b02d68ebe31e9e060"/>
+    <w:bookmarkEnd w:id="56"/>
+    <w:bookmarkStart w:id="66" w:name="Xcca0bcaed302a7900b6627b02d68ebe31e9e060"/>
     <w:p>
       <w:pPr>
         <w:pStyle w:val="Heading1"/>
@@ -6698,7 +6879,7 @@
       <w:r>
         <w:t xml:space="preserve"> </w:t>
       </w:r>
-      <w:hyperlink r:id="rId53">
+      <w:hyperlink r:id="rId57">
         <w:r>
           <w:rPr>
             <w:rStyle w:val="Hyperlink"/>
@@ -6729,7 +6910,7 @@
       <w:r>
         <w:t xml:space="preserve"> </w:t>
       </w:r>
-      <w:hyperlink r:id="rId54">
+      <w:hyperlink r:id="rId58">
         <w:r>
           <w:rPr>
             <w:rStyle w:val="Hyperlink"/>
@@ -6760,7 +6941,7 @@
       <w:r>
         <w:t xml:space="preserve"> </w:t>
       </w:r>
-      <w:hyperlink r:id="rId55">
+      <w:hyperlink r:id="rId59">
         <w:r>
           <w:rPr>
             <w:rStyle w:val="Hyperlink"/>
@@ -6791,7 +6972,7 @@
       <w:r>
         <w:t xml:space="preserve"> </w:t>
       </w:r>
-      <w:hyperlink r:id="rId56">
+      <w:hyperlink r:id="rId60">
         <w:r>
           <w:rPr>
             <w:rStyle w:val="Hyperlink"/>
@@ -6828,7 +7009,7 @@
       <w:r>
         <w:t xml:space="preserve"> </w:t>
       </w:r>
-      <w:hyperlink r:id="rId57">
+      <w:hyperlink r:id="rId61">
         <w:r>
           <w:rPr>
             <w:rStyle w:val="Hyperlink"/>
@@ -6871,7 +7052,7 @@
       <w:r>
         <w:t xml:space="preserve"> </w:t>
       </w:r>
-      <w:hyperlink r:id="rId58">
+      <w:hyperlink r:id="rId62">
         <w:r>
           <w:rPr>
             <w:rStyle w:val="Hyperlink"/>
@@ -6902,7 +7083,7 @@
       <w:r>
         <w:t xml:space="preserve"> </w:t>
       </w:r>
-      <w:hyperlink r:id="rId59">
+      <w:hyperlink r:id="rId63">
         <w:r>
           <w:rPr>
             <w:rStyle w:val="Hyperlink"/>
@@ -6939,7 +7120,7 @@
       <w:r>
         <w:t xml:space="preserve"> </w:t>
       </w:r>
-      <w:hyperlink r:id="rId60">
+      <w:hyperlink r:id="rId64">
         <w:r>
           <w:rPr>
             <w:rStyle w:val="Hyperlink"/>
@@ -6970,7 +7151,7 @@
       <w:r>
         <w:t xml:space="preserve"> </w:t>
       </w:r>
-      <w:hyperlink r:id="rId61">
+      <w:hyperlink r:id="rId65">
         <w:r>
           <w:rPr>
             <w:rStyle w:val="Hyperlink"/>
@@ -6979,7 +7160,7 @@
         </w:r>
       </w:hyperlink>
     </w:p>
-    <w:bookmarkEnd w:id="62"/>
+    <w:bookmarkEnd w:id="66"/>
     <w:sectPr>
       <w:footnotePr>
         <w:numRestart w:val="eachSect"/>

</xml_diff>

<commit_message>
Method details S4: add accurate V12 model-architecture figure
New academic-style (monochrome, Liberation Serif) diagram of the actual V12
head: VGG19 block4_conv4 -> CoordConv frequency-position channel -> four-band
split with per-band and cross-band 1-D convolutions -> bidirectional LSTM ->
global max/avg pooling -> dense -> 4-way softmax, with output tensor shapes and
the two novel components flagged.

- Insert the figure in S4 and reference it from the opening sentence
- The pre-existing pipeline_architecture.png is NOT used: it depicts the old
  V10 simple GAP head with stale numbers (5 s window, 94.3%, ~870 clips)

https://claude.ai/code/session_01GRhKW3iKJjm2wYYeUd56Hq
</commit_message>
<xml_diff>
--- a/paper/methodsx_manuscript.docx
+++ b/paper/methodsx_manuscript.docx
@@ -969,7 +969,7 @@
       </w:r>
     </w:p>
     <w:bookmarkEnd w:id="13"/>
-    <w:bookmarkStart w:id="36" w:name="method-details"/>
+    <w:bookmarkStart w:id="40" w:name="method-details"/>
     <w:p>
       <w:pPr>
         <w:pStyle w:val="Heading1"/>
@@ -2558,7 +2558,7 @@
     <w:bookmarkEnd w:id="20"/>
     <w:bookmarkEnd w:id="21"/>
     <w:bookmarkEnd w:id="22"/>
-    <w:bookmarkStart w:id="24" w:name="model-architecture"/>
+    <w:bookmarkStart w:id="28" w:name="model-architecture"/>
     <w:p>
       <w:pPr>
         <w:pStyle w:val="Heading2"/>
@@ -2596,13 +2596,24 @@
         <w:t xml:space="preserve"> </w:t>
       </w:r>
       <w:r>
-        <w:t xml:space="preserve">head designed to exploit both the spectral location and the temporal rhythm of</w:t>
-      </w:r>
-      <w:r>
-        <w:t xml:space="preserve"> </w:t>
-      </w:r>
-      <w:r>
-        <w:t xml:space="preserve">primate calls. The motivation is that Colobus roars concentrate energy around</w:t>
+        <w:t xml:space="preserve">head (Fig. </w:t>
+      </w:r>
+      <w:hyperlink w:anchor="fig:architecture">
+        <w:r>
+          <w:rPr>
+            <w:rStyle w:val="Hyperlink"/>
+          </w:rPr>
+          <w:t xml:space="preserve">2</w:t>
+        </w:r>
+      </w:hyperlink>
+      <w:r>
+        <w:t xml:space="preserve">) designed to exploit both the spectral</w:t>
+      </w:r>
+      <w:r>
+        <w:t xml:space="preserve"> </w:t>
+      </w:r>
+      <w:r>
+        <w:t xml:space="preserve">location and the temporal rhythm of primate calls. The motivation is that Colobus roars concentrate energy around</w:t>
       </w:r>
       <w:r>
         <w:t xml:space="preserve"> </w:t>
@@ -2737,7 +2748,7 @@
         <w:t xml:space="preserve"> 28, 512 channels) is extracted before the final VGG19 block.</w:t>
       </w:r>
     </w:p>
-    <w:bookmarkStart w:id="23" w:name="frequency-position-encoding."/>
+    <w:bookmarkStart w:id="27" w:name="frequency-position-encoding."/>
     <w:p>
       <w:pPr>
         <w:pStyle w:val="Heading4"/>
@@ -3118,9 +3129,133 @@
         <w:t xml:space="preserve">Colobus_confuser, Background).</w:t>
       </w:r>
     </w:p>
-    <w:bookmarkEnd w:id="23"/>
-    <w:bookmarkEnd w:id="24"/>
-    <w:bookmarkStart w:id="28" w:name="model-training"/>
+    <w:bookmarkStart w:id="26" w:name="fig:architecture"/>
+    <w:p>
+      <w:pPr>
+        <w:pStyle w:val="CaptionedFigure"/>
+      </w:pPr>
+      <w:r>
+        <w:drawing>
+          <wp:inline>
+            <wp:extent cx="3840480" cy="4973121"/>
+            <wp:effectExtent b="0" l="0" r="0" t="0"/>
+            <wp:docPr descr="" title="" id="24" name="Picture"/>
+            <a:graphic>
+              <a:graphicData uri="http://schemas.openxmlformats.org/drawingml/2006/picture">
+                <pic:pic>
+                  <pic:nvPicPr>
+                    <pic:cNvPr descr="model_architecture_v12.pdf" id="25" name="Picture"/>
+                    <pic:cNvPicPr>
+                      <a:picLocks noChangeArrowheads="1" noChangeAspect="1"/>
+                    </pic:cNvPicPr>
+                  </pic:nvPicPr>
+                  <pic:blipFill>
+                    <a:blip r:embed="rId23"/>
+                    <a:stretch>
+                      <a:fillRect/>
+                    </a:stretch>
+                  </pic:blipFill>
+                  <pic:spPr bwMode="auto">
+                    <a:xfrm>
+                      <a:off x="0" y="0"/>
+                      <a:ext cx="3840480" cy="4973121"/>
+                    </a:xfrm>
+                    <a:prstGeom prst="rect">
+                      <a:avLst/>
+                    </a:prstGeom>
+                    <a:noFill/>
+                    <a:ln w="9525">
+                      <a:noFill/>
+                      <a:headEnd/>
+                      <a:tailEnd/>
+                    </a:ln>
+                  </pic:spPr>
+                </pic:pic>
+              </a:graphicData>
+            </a:graphic>
+          </wp:inline>
+        </w:drawing>
+      </w:r>
+    </w:p>
+    <w:p>
+      <w:pPr>
+        <w:pStyle w:val="ImageCaption"/>
+      </w:pPr>
+      <w:r>
+        <w:t xml:space="preserve">Model architecture. A VGG19 backbone (the</w:t>
+      </w:r>
+      <w:r>
+        <w:t xml:space="preserve"> </w:t>
+      </w:r>
+      <w:r>
+        <w:rPr>
+          <w:rStyle w:val="VerbatimChar"/>
+        </w:rPr>
+        <w:t xml:space="preserve">block4_conv4</w:t>
+      </w:r>
+      <w:r>
+        <w:t xml:space="preserve"> </w:t>
+      </w:r>
+      <w:r>
+        <w:t xml:space="preserve">feature map) is augmented with a frequency-coordinate (CoordConv) channel, then</w:t>
+      </w:r>
+      <w:r>
+        <w:t xml:space="preserve"> </w:t>
+      </w:r>
+      <w:r>
+        <w:t xml:space="preserve">split into four mel-frequency bands processed by per-band and cross-band 1-D</w:t>
+      </w:r>
+      <w:r>
+        <w:t xml:space="preserve"> </w:t>
+      </w:r>
+      <w:r>
+        <w:t xml:space="preserve">convolutions, summarized by a bidirectional LSTM with combined global max- and</w:t>
+      </w:r>
+      <w:r>
+        <w:t xml:space="preserve"> </w:t>
+      </w:r>
+      <w:r>
+        <w:t xml:space="preserve">average-pooling, and classified by two dense layers and a four-way softmax. The</w:t>
+      </w:r>
+      <w:r>
+        <w:t xml:space="preserve"> </w:t>
+      </w:r>
+      <w:r>
+        <w:t xml:space="preserve">frequency-position encoding and the per-band split are the components added to</w:t>
+      </w:r>
+      <w:r>
+        <w:t xml:space="preserve"> </w:t>
+      </w:r>
+      <w:r>
+        <w:t xml:space="preserve">suppress</w:t>
+      </w:r>
+      <w:r>
+        <w:t xml:space="preserve"> </w:t>
+      </w:r>
+      <w:r>
+        <w:rPr>
+          <w:i/>
+          <w:iCs/>
+        </w:rPr>
+        <w:t xml:space="preserve">Colobus</w:t>
+      </w:r>
+      <w:r>
+        <w:t xml:space="preserve"> </w:t>
+      </w:r>
+      <w:r>
+        <w:t xml:space="preserve">false positives. Output tensor shapes are shown on</w:t>
+      </w:r>
+      <w:r>
+        <w:t xml:space="preserve"> </w:t>
+      </w:r>
+      <w:r>
+        <w:t xml:space="preserve">the right.</w:t>
+      </w:r>
+    </w:p>
+    <w:bookmarkEnd w:id="26"/>
+    <w:bookmarkEnd w:id="27"/>
+    <w:bookmarkEnd w:id="28"/>
+    <w:bookmarkStart w:id="32" w:name="model-training"/>
     <w:p>
       <w:pPr>
         <w:pStyle w:val="Heading2"/>
@@ -3143,7 +3278,7 @@
         <w:t xml:space="preserve">protocol of head training followed by partial fine-tuning.</w:t>
       </w:r>
     </w:p>
-    <w:bookmarkStart w:id="25" w:name="stage-1-head-training."/>
+    <w:bookmarkStart w:id="29" w:name="stage-1-head-training."/>
     <w:p>
       <w:pPr>
         <w:pStyle w:val="Heading4"/>
@@ -3201,8 +3336,8 @@
         <w:t xml:space="preserve">, and the loss is sparse categorical cross-entropy.</w:t>
       </w:r>
     </w:p>
-    <w:bookmarkEnd w:id="25"/>
-    <w:bookmarkStart w:id="26" w:name="stage-2-partial-fine-tuning."/>
+    <w:bookmarkEnd w:id="29"/>
+    <w:bookmarkStart w:id="30" w:name="stage-2-partial-fine-tuning."/>
     <w:p>
       <w:pPr>
         <w:pStyle w:val="Heading4"/>
@@ -3293,8 +3428,8 @@
         <w:t xml:space="preserve">avoid catastrophic forgetting.</w:t>
       </w:r>
     </w:p>
-    <w:bookmarkEnd w:id="26"/>
-    <w:bookmarkStart w:id="27" w:name="shared-training-settings."/>
+    <w:bookmarkEnd w:id="30"/>
+    <w:bookmarkStart w:id="31" w:name="shared-training-settings."/>
     <w:p>
       <w:pPr>
         <w:pStyle w:val="Heading4"/>
@@ -3412,9 +3547,9 @@
         <w:t xml:space="preserve">per-class accuracy report and a confusion matrix on the validation set.</w:t>
       </w:r>
     </w:p>
-    <w:bookmarkEnd w:id="27"/>
-    <w:bookmarkEnd w:id="28"/>
-    <w:bookmarkStart w:id="30" w:name="sliding-window-detection"/>
+    <w:bookmarkEnd w:id="31"/>
+    <w:bookmarkEnd w:id="32"/>
+    <w:bookmarkStart w:id="34" w:name="sliding-window-detection"/>
     <w:p>
       <w:pPr>
         <w:pStyle w:val="Heading2"/>
@@ -3587,7 +3722,7 @@
         <w:t xml:space="preserve">non-maximum suppression at an intersection-over-union threshold of 0.5.</w:t>
       </w:r>
     </w:p>
-    <w:bookmarkStart w:id="29" w:name="low-frequency-energy-gate-for-colobus."/>
+    <w:bookmarkStart w:id="33" w:name="low-frequency-energy-gate-for-colobus."/>
     <w:p>
       <w:pPr>
         <w:pStyle w:val="Heading4"/>
@@ -3767,9 +3902,9 @@
         <w:t xml:space="preserve">review and downstream filtering do not require re-reading the long recordings.</w:t>
       </w:r>
     </w:p>
-    <w:bookmarkEnd w:id="29"/>
-    <w:bookmarkEnd w:id="30"/>
-    <w:bookmarkStart w:id="34" w:name="automatic-false-positive-cleanup"/>
+    <w:bookmarkEnd w:id="33"/>
+    <w:bookmarkEnd w:id="34"/>
+    <w:bookmarkStart w:id="38" w:name="automatic-false-positive-cleanup"/>
     <w:p>
       <w:pPr>
         <w:pStyle w:val="Heading2"/>
@@ -3810,7 +3945,7 @@
         <w:t xml:space="preserve">source recording.</w:t>
       </w:r>
     </w:p>
-    <w:bookmarkStart w:id="31" w:name="a-mahalanobis-out-of-distribution-filter"/>
+    <w:bookmarkStart w:id="35" w:name="a-mahalanobis-out-of-distribution-filter"/>
     <w:p>
       <w:pPr>
         <w:pStyle w:val="Heading4"/>
@@ -3906,8 +4041,8 @@
         <w:t xml:space="preserve">relative-outlier detector that is robust to the train-to-field domain shift.</w:t>
       </w:r>
     </w:p>
-    <w:bookmarkEnd w:id="31"/>
-    <w:bookmarkStart w:id="32" w:name="b-yamnet-cross-check"/>
+    <w:bookmarkEnd w:id="35"/>
+    <w:bookmarkStart w:id="36" w:name="b-yamnet-cross-check"/>
     <w:p>
       <w:pPr>
         <w:pStyle w:val="Heading4"/>
@@ -4003,8 +4138,8 @@
         <w:t xml:space="preserve">confirm primates.</w:t>
       </w:r>
     </w:p>
-    <w:bookmarkEnd w:id="32"/>
-    <w:bookmarkStart w:id="33" w:name="c-temporal-isolation-filter"/>
+    <w:bookmarkEnd w:id="36"/>
+    <w:bookmarkStart w:id="37" w:name="c-temporal-isolation-filter"/>
     <w:p>
       <w:pPr>
         <w:pStyle w:val="Heading4"/>
@@ -4150,9 +4285,9 @@
         <w:t xml:space="preserve">exported as labelled WAV clips for the next stage.</w:t>
       </w:r>
     </w:p>
-    <w:bookmarkEnd w:id="33"/>
-    <w:bookmarkEnd w:id="34"/>
-    <w:bookmarkStart w:id="35" w:name="iterative-hard-negative-mining"/>
+    <w:bookmarkEnd w:id="37"/>
+    <w:bookmarkEnd w:id="38"/>
+    <w:bookmarkStart w:id="39" w:name="iterative-hard-negative-mining"/>
     <w:p>
       <w:pPr>
         <w:pStyle w:val="Heading2"/>
@@ -4346,9 +4481,9 @@
         <w:t xml:space="preserve">source recordings have been deleted to save storage.</w:t>
       </w:r>
     </w:p>
-    <w:bookmarkEnd w:id="35"/>
-    <w:bookmarkEnd w:id="36"/>
-    <w:bookmarkStart w:id="50" w:name="method-validation"/>
+    <w:bookmarkEnd w:id="39"/>
+    <w:bookmarkEnd w:id="40"/>
+    <w:bookmarkStart w:id="54" w:name="method-validation"/>
     <w:p>
       <w:pPr>
         <w:pStyle w:val="Heading1"/>
@@ -4399,7 +4534,7 @@
         <w:t xml:space="preserve">false-positive rate.</w:t>
       </w:r>
     </w:p>
-    <w:bookmarkStart w:id="47" w:name="validation-set-performance-v12-model."/>
+    <w:bookmarkStart w:id="51" w:name="validation-set-performance-v12-model."/>
     <w:p>
       <w:pPr>
         <w:pStyle w:val="Heading4"/>
@@ -4438,7 +4573,7 @@
           <w:rPr>
             <w:rStyle w:val="Hyperlink"/>
           </w:rPr>
-          <w:t xml:space="preserve">2</w:t>
+          <w:t xml:space="preserve">3</w:t>
         </w:r>
       </w:hyperlink>
       <w:r>
@@ -4509,7 +4644,7 @@
         <w:t xml:space="preserve">gives the full confusion matrix.</w:t>
       </w:r>
     </w:p>
-    <w:bookmarkStart w:id="40" w:name="fig:training"/>
+    <w:bookmarkStart w:id="44" w:name="fig:training"/>
     <w:p>
       <w:pPr>
         <w:pStyle w:val="CaptionedFigure"/>
@@ -4519,18 +4654,18 @@
           <wp:inline>
             <wp:extent cx="5334000" cy="2115910"/>
             <wp:effectExtent b="0" l="0" r="0" t="0"/>
-            <wp:docPr descr="" title="" id="38" name="Picture"/>
+            <wp:docPr descr="" title="" id="42" name="Picture"/>
             <a:graphic>
               <a:graphicData uri="http://schemas.openxmlformats.org/drawingml/2006/picture">
                 <pic:pic>
                   <pic:nvPicPr>
-                    <pic:cNvPr descr="training_curves_v12.pdf" id="39" name="Picture"/>
+                    <pic:cNvPr descr="training_curves_v12.pdf" id="43" name="Picture"/>
                     <pic:cNvPicPr>
                       <a:picLocks noChangeArrowheads="1" noChangeAspect="1"/>
                     </pic:cNvPicPr>
                   </pic:nvPicPr>
                   <pic:blipFill>
-                    <a:blip r:embed="rId37"/>
+                    <a:blip r:embed="rId41"/>
                     <a:stretch>
                       <a:fillRect/>
                     </a:stretch>
@@ -4589,8 +4724,8 @@
         <w:t xml:space="preserve">checkpoint (98.12 %).</w:t>
       </w:r>
     </w:p>
-    <w:bookmarkEnd w:id="40"/>
-    <w:bookmarkStart w:id="41" w:name="tab:val"/>
+    <w:bookmarkEnd w:id="44"/>
+    <w:bookmarkStart w:id="45" w:name="tab:val"/>
     <w:p>
       <w:pPr>
         <w:pStyle w:val="TableCaption"/>
@@ -4934,8 +5069,8 @@
         </w:tc>
       </w:tr>
     </w:tbl>
-    <w:bookmarkEnd w:id="41"/>
-    <w:bookmarkStart w:id="42" w:name="tab:confusion"/>
+    <w:bookmarkEnd w:id="45"/>
+    <w:bookmarkStart w:id="46" w:name="tab:confusion"/>
     <w:p>
       <w:pPr>
         <w:pStyle w:val="TableCaption"/>
@@ -5301,8 +5436,8 @@
         </w:tc>
       </w:tr>
     </w:tbl>
-    <w:bookmarkEnd w:id="42"/>
-    <w:bookmarkStart w:id="46" w:name="fig:confusion"/>
+    <w:bookmarkEnd w:id="46"/>
+    <w:bookmarkStart w:id="50" w:name="fig:confusion"/>
     <w:p>
       <w:pPr>
         <w:pStyle w:val="CaptionedFigure"/>
@@ -5312,18 +5447,18 @@
           <wp:inline>
             <wp:extent cx="3467100" cy="2929699"/>
             <wp:effectExtent b="0" l="0" r="0" t="0"/>
-            <wp:docPr descr="" title="" id="44" name="Picture"/>
+            <wp:docPr descr="" title="" id="48" name="Picture"/>
             <a:graphic>
               <a:graphicData uri="http://schemas.openxmlformats.org/drawingml/2006/picture">
                 <pic:pic>
                   <pic:nvPicPr>
-                    <pic:cNvPr descr="confusion_matrix_v12.pdf" id="45" name="Picture"/>
+                    <pic:cNvPr descr="confusion_matrix_v12.pdf" id="49" name="Picture"/>
                     <pic:cNvPicPr>
                       <a:picLocks noChangeArrowheads="1" noChangeAspect="1"/>
                     </pic:cNvPicPr>
                   </pic:nvPicPr>
                   <pic:blipFill>
-                    <a:blip r:embed="rId43"/>
+                    <a:blip r:embed="rId47"/>
                     <a:stretch>
                       <a:fillRect/>
                     </a:stretch>
@@ -5403,7 +5538,7 @@
         <w:t xml:space="preserve">is exactly zero.</w:t>
       </w:r>
     </w:p>
-    <w:bookmarkEnd w:id="46"/>
+    <w:bookmarkEnd w:id="50"/>
     <w:p>
       <w:pPr>
         <w:pStyle w:val="BodyText"/>
@@ -5422,7 +5557,7 @@
           <w:rPr>
             <w:rStyle w:val="Hyperlink"/>
           </w:rPr>
-          <w:t xml:space="preserve">3</w:t>
+          <w:t xml:space="preserve">4</w:t>
         </w:r>
       </w:hyperlink>
       <w:r>
@@ -5627,8 +5762,8 @@
         <w:t xml:space="preserve">high-frequency shortcut that previously caused Cernic–confuser confusion.</w:t>
       </w:r>
     </w:p>
-    <w:bookmarkEnd w:id="47"/>
-    <w:bookmarkStart w:id="48" w:name="field-deployment."/>
+    <w:bookmarkEnd w:id="51"/>
+    <w:bookmarkStart w:id="52" w:name="field-deployment."/>
     <w:p>
       <w:pPr>
         <w:pStyle w:val="Heading4"/>
@@ -5790,8 +5925,8 @@
         <w:t xml:space="preserve">all stations have been processed.</w:t>
       </w:r>
     </w:p>
-    <w:bookmarkEnd w:id="48"/>
-    <w:bookmarkStart w:id="49" w:name="Xfd7e2a660e56df99e009fb7f8d0a1a9ea97b8e1"/>
+    <w:bookmarkEnd w:id="52"/>
+    <w:bookmarkStart w:id="53" w:name="Xfd7e2a660e56df99e009fb7f8d0a1a9ea97b8e1"/>
     <w:p>
       <w:pPr>
         <w:pStyle w:val="Heading4"/>
@@ -6056,9 +6191,9 @@
         <w:t xml:space="preserve">deployed across all stations.</w:t>
       </w:r>
     </w:p>
-    <w:bookmarkEnd w:id="49"/>
-    <w:bookmarkEnd w:id="50"/>
-    <w:bookmarkStart w:id="51" w:name="limitations"/>
+    <w:bookmarkEnd w:id="53"/>
+    <w:bookmarkEnd w:id="54"/>
+    <w:bookmarkStart w:id="55" w:name="limitations"/>
     <w:p>
       <w:pPr>
         <w:pStyle w:val="Heading1"/>
@@ -6521,8 +6656,8 @@
         <w:t xml:space="preserve">assumptions.</w:t>
       </w:r>
     </w:p>
-    <w:bookmarkEnd w:id="51"/>
-    <w:bookmarkStart w:id="52" w:name="ethics-statements"/>
+    <w:bookmarkEnd w:id="55"/>
+    <w:bookmarkStart w:id="56" w:name="ethics-statements"/>
     <w:p>
       <w:pPr>
         <w:pStyle w:val="Heading1"/>
@@ -6575,8 +6710,8 @@
         <w:t xml:space="preserve">guidelines for non-invasive field research.]</w:t>
       </w:r>
     </w:p>
-    <w:bookmarkEnd w:id="52"/>
-    <w:bookmarkStart w:id="53" w:name="credit-author-statement"/>
+    <w:bookmarkEnd w:id="56"/>
+    <w:bookmarkStart w:id="57" w:name="credit-author-statement"/>
     <w:p>
       <w:pPr>
         <w:pStyle w:val="Heading1"/>
@@ -6631,8 +6766,8 @@
         <w:t xml:space="preserve">editing, Funding acquisition].</w:t>
       </w:r>
     </w:p>
-    <w:bookmarkEnd w:id="53"/>
-    <w:bookmarkStart w:id="54" w:name="acknowledgments"/>
+    <w:bookmarkEnd w:id="57"/>
+    <w:bookmarkStart w:id="58" w:name="acknowledgments"/>
     <w:p>
       <w:pPr>
         <w:pStyle w:val="Heading1"/>
@@ -6667,8 +6802,8 @@
         <w:t xml:space="preserve">commercial, or not-for-profit sectors.</w:t>
       </w:r>
     </w:p>
-    <w:bookmarkEnd w:id="54"/>
-    <w:bookmarkStart w:id="55" w:name="declaration-of-interests"/>
+    <w:bookmarkEnd w:id="58"/>
+    <w:bookmarkStart w:id="59" w:name="declaration-of-interests"/>
     <w:p>
       <w:pPr>
         <w:pStyle w:val="Heading1"/>
@@ -6733,8 +6868,8 @@
         <w:t xml:space="preserve">competing interests:</w:t>
       </w:r>
     </w:p>
-    <w:bookmarkEnd w:id="55"/>
-    <w:bookmarkStart w:id="56" w:name="data-availability"/>
+    <w:bookmarkEnd w:id="59"/>
+    <w:bookmarkStart w:id="60" w:name="data-availability"/>
     <w:p>
       <w:pPr>
         <w:pStyle w:val="Heading1"/>
@@ -6810,8 +6945,8 @@
         <w:t xml:space="preserve">.]</w:t>
       </w:r>
     </w:p>
-    <w:bookmarkEnd w:id="56"/>
-    <w:bookmarkStart w:id="66" w:name="Xcca0bcaed302a7900b6627b02d68ebe31e9e060"/>
+    <w:bookmarkEnd w:id="60"/>
+    <w:bookmarkStart w:id="70" w:name="Xcca0bcaed302a7900b6627b02d68ebe31e9e060"/>
     <w:p>
       <w:pPr>
         <w:pStyle w:val="Heading1"/>
@@ -6879,7 +7014,7 @@
       <w:r>
         <w:t xml:space="preserve"> </w:t>
       </w:r>
-      <w:hyperlink r:id="rId57">
+      <w:hyperlink r:id="rId61">
         <w:r>
           <w:rPr>
             <w:rStyle w:val="Hyperlink"/>
@@ -6910,7 +7045,7 @@
       <w:r>
         <w:t xml:space="preserve"> </w:t>
       </w:r>
-      <w:hyperlink r:id="rId58">
+      <w:hyperlink r:id="rId62">
         <w:r>
           <w:rPr>
             <w:rStyle w:val="Hyperlink"/>
@@ -6941,7 +7076,7 @@
       <w:r>
         <w:t xml:space="preserve"> </w:t>
       </w:r>
-      <w:hyperlink r:id="rId59">
+      <w:hyperlink r:id="rId63">
         <w:r>
           <w:rPr>
             <w:rStyle w:val="Hyperlink"/>
@@ -6972,7 +7107,7 @@
       <w:r>
         <w:t xml:space="preserve"> </w:t>
       </w:r>
-      <w:hyperlink r:id="rId60">
+      <w:hyperlink r:id="rId64">
         <w:r>
           <w:rPr>
             <w:rStyle w:val="Hyperlink"/>
@@ -7009,7 +7144,7 @@
       <w:r>
         <w:t xml:space="preserve"> </w:t>
       </w:r>
-      <w:hyperlink r:id="rId61">
+      <w:hyperlink r:id="rId65">
         <w:r>
           <w:rPr>
             <w:rStyle w:val="Hyperlink"/>
@@ -7052,7 +7187,7 @@
       <w:r>
         <w:t xml:space="preserve"> </w:t>
       </w:r>
-      <w:hyperlink r:id="rId62">
+      <w:hyperlink r:id="rId66">
         <w:r>
           <w:rPr>
             <w:rStyle w:val="Hyperlink"/>
@@ -7083,7 +7218,7 @@
       <w:r>
         <w:t xml:space="preserve"> </w:t>
       </w:r>
-      <w:hyperlink r:id="rId63">
+      <w:hyperlink r:id="rId67">
         <w:r>
           <w:rPr>
             <w:rStyle w:val="Hyperlink"/>
@@ -7120,7 +7255,7 @@
       <w:r>
         <w:t xml:space="preserve"> </w:t>
       </w:r>
-      <w:hyperlink r:id="rId64">
+      <w:hyperlink r:id="rId68">
         <w:r>
           <w:rPr>
             <w:rStyle w:val="Hyperlink"/>
@@ -7151,7 +7286,7 @@
       <w:r>
         <w:t xml:space="preserve"> </w:t>
       </w:r>
-      <w:hyperlink r:id="rId65">
+      <w:hyperlink r:id="rId69">
         <w:r>
           <w:rPr>
             <w:rStyle w:val="Hyperlink"/>
@@ -7160,7 +7295,7 @@
         </w:r>
       </w:hyperlink>
     </w:p>
-    <w:bookmarkEnd w:id="66"/>
+    <w:bookmarkEnd w:id="70"/>
     <w:sectPr>
       <w:footnotePr>
         <w:numRestart w:val="eachSect"/>

</xml_diff>

<commit_message>
Method details S5: correct early-stopping monitor and model filename
Verified against src/model.py get_callbacks and src/config.py:
- EarlyStopping monitors val_loss (not val_accuracy); config.PATIENCE=10 and
  its comment confirms "validation loss". Fix the text accordingly.
- ModelCheckpoint monitors val_accuracy (unchanged, correct).
- The deployed checkpoint is best_model_v12.h5, matching the V12 training log
  (train.py's default best_model.h5 was overridden for the V12 run).
All other S5 numbers (80/20 split, batch 32, 50 epochs, 1e-4->1e-5, ReduceLR
factor 0.5/patience 5/floor 1e-7) verified correct.

https://claude.ai/code/session_01GRhKW3iKJjm2wYYeUd56Hq
</commit_message>
<xml_diff>
--- a/paper/methodsx_manuscript.docx
+++ b/paper/methodsx_manuscript.docx
@@ -3473,7 +3473,7 @@
         <w:t xml:space="preserve"> </w:t>
       </w:r>
       <w:r>
-        <w:t xml:space="preserve">early stopping on validation accuracy (patience 10, best weights restored),</w:t>
+        <w:t xml:space="preserve">early stopping on validation loss (patience 10, best weights restored),</w:t>
       </w:r>
       <w:r>
         <w:t xml:space="preserve"> </w:t>
@@ -3535,7 +3535,7 @@
         <w:rPr>
           <w:rStyle w:val="VerbatimChar"/>
         </w:rPr>
-        <w:t xml:space="preserve">best_model.h5</w:t>
+        <w:t xml:space="preserve">best_model_v12.h5</w:t>
       </w:r>
       <w:r>
         <w:t xml:space="preserve">. Training concludes with a</w:t>

</xml_diff>

<commit_message>
Method details S5: fix fine-tuning description (block3+block4, not block4+5)
Verified against src/model.py (tap='block4_conv4', unfreeze_base_model) and
the V12 training log ("Unfrozen from layer: block2_pool", 12,297,732 trainable):
- The VGG19 base is truncated at block4_conv4, so block5 is NOT in the model.
- The V12 run unfroze the last 2 blocks of the truncated base = block3 and
  block4 convolutional layers (~12.3 M trainable params); block1-block2 stay
  frozen.
Previous "block4 and block5" was doubly wrong; corrected.

https://claude.ai/code/session_01GRhKW3iKJjm2wYYeUd56Hq
</commit_message>
<xml_diff>
--- a/paper/methodsx_manuscript.docx
+++ b/paper/methodsx_manuscript.docx
@@ -3351,18 +3351,78 @@
         <w:pStyle w:val="FirstParagraph"/>
       </w:pPr>
       <w:r>
-        <w:t xml:space="preserve">The last two convolutional blocks of VGG19 (</w:t>
+        <w:t xml:space="preserve">Because the VGG19 base is truncated at</w:t>
+      </w:r>
+      <w:r>
+        <w:t xml:space="preserve"> </w:t>
       </w:r>
       <w:r>
         <w:rPr>
           <w:rStyle w:val="VerbatimChar"/>
         </w:rPr>
+        <w:t xml:space="preserve">block4_conv4</w:t>
+      </w:r>
+      <w:r>
+        <w:t xml:space="preserve"> </w:t>
+      </w:r>
+      <w:r>
+        <w:t xml:space="preserve">(Section 4), its trainable portion spans blocks 1–4. The last two of these</w:t>
+      </w:r>
+      <w:r>
+        <w:t xml:space="preserve"> </w:t>
+      </w:r>
+      <w:r>
+        <w:t xml:space="preserve">blocks — the</w:t>
+      </w:r>
+      <w:r>
+        <w:t xml:space="preserve"> </w:t>
+      </w:r>
+      <w:r>
+        <w:rPr>
+          <w:rStyle w:val="VerbatimChar"/>
+        </w:rPr>
+        <w:t xml:space="preserve">block3</w:t>
+      </w:r>
+      <w:r>
+        <w:t xml:space="preserve"> </w:t>
+      </w:r>
+      <w:r>
+        <w:t xml:space="preserve">and</w:t>
+      </w:r>
+      <w:r>
+        <w:t xml:space="preserve"> </w:t>
+      </w:r>
+      <w:r>
+        <w:rPr>
+          <w:rStyle w:val="VerbatimChar"/>
+        </w:rPr>
         <w:t xml:space="preserve">block4</w:t>
       </w:r>
       <w:r>
         <w:t xml:space="preserve"> </w:t>
       </w:r>
       <w:r>
+        <w:t xml:space="preserve">convolutional layers — are</w:t>
+      </w:r>
+      <w:r>
+        <w:t xml:space="preserve"> </w:t>
+      </w:r>
+      <w:r>
+        <w:t xml:space="preserve">unfrozen, while</w:t>
+      </w:r>
+      <w:r>
+        <w:t xml:space="preserve"> </w:t>
+      </w:r>
+      <w:r>
+        <w:rPr>
+          <w:rStyle w:val="VerbatimChar"/>
+        </w:rPr>
+        <w:t xml:space="preserve">block1</w:t>
+      </w:r>
+      <w:r>
+        <w:t xml:space="preserve"> </w:t>
+      </w:r>
+      <w:r>
         <w:t xml:space="preserve">and</w:t>
       </w:r>
       <w:r>
@@ -3372,16 +3432,39 @@
         <w:rPr>
           <w:rStyle w:val="VerbatimChar"/>
         </w:rPr>
-        <w:t xml:space="preserve">block5</w:t>
-      </w:r>
-      <w:r>
-        <w:t xml:space="preserve">) are unfrozen while earlier blocks remain frozen to preserve</w:t>
-      </w:r>
-      <w:r>
-        <w:t xml:space="preserve"> </w:t>
-      </w:r>
-      <w:r>
-        <w:t xml:space="preserve">low-level features. The learning rate is reduced to</w:t>
+        <w:t xml:space="preserve">block2</w:t>
+      </w:r>
+      <w:r>
+        <w:t xml:space="preserve"> </w:t>
+      </w:r>
+      <w:r>
+        <w:t xml:space="preserve">remain frozen to preserve</w:t>
+      </w:r>
+      <w:r>
+        <w:t xml:space="preserve"> </w:t>
+      </w:r>
+      <w:r>
+        <w:t xml:space="preserve">low-level features; this makes</w:t>
+      </w:r>
+      <w:r>
+        <w:t xml:space="preserve"> </w:t>
+      </w:r>
+      <m:oMath>
+        <m:r>
+          <m:rPr>
+            <m:sty m:val="p"/>
+          </m:rPr>
+          <m:t>≈</m:t>
+        </m:r>
+      </m:oMath>
+      <w:r>
+        <w:t xml:space="preserve">12.3 M parameters trainable. The</w:t>
+      </w:r>
+      <w:r>
+        <w:t xml:space="preserve"> </w:t>
+      </w:r>
+      <w:r>
+        <w:t xml:space="preserve">learning rate is reduced to</w:t>
       </w:r>
       <w:r>
         <w:t xml:space="preserve"> </w:t>
@@ -3419,13 +3502,13 @@
         <w:t xml:space="preserve"> </w:t>
       </w:r>
       <w:r>
-        <w:t xml:space="preserve">to</w:t>
-      </w:r>
-      <w:r>
-        <w:t xml:space="preserve"> </w:t>
-      </w:r>
-      <w:r>
-        <w:t xml:space="preserve">avoid catastrophic forgetting.</w:t>
+        <w:t xml:space="preserve">to avoid catastrophic</w:t>
+      </w:r>
+      <w:r>
+        <w:t xml:space="preserve"> </w:t>
+      </w:r>
+      <w:r>
+        <w:t xml:space="preserve">forgetting.</w:t>
       </w:r>
     </w:p>
     <w:bookmarkEnd w:id="30"/>

</xml_diff>

<commit_message>
Method details S6: correct low-freq gate wording vs detection.py
Verified against src/detection.py (detect pipeline, apply_lowfreq_gate,
annotate_lowfreq_ratio) and config:
- The gate DROPS failing Colobus detections (detections_df[keep]); it does
  not relabel them as Background rows. "reclassified as Background" ->
  "dropped from the detection list (treated as non-target Background)".
- annotate_lowfreq_ratio records the low-frequency ratio as a CSV column for
  retained detections (for ranking/inspection); the dropped detections are
  not in the CSV. Fix the inaccurate "audit which detections were removed".
All other S6 claims verified: 2.0/1.0 s window + end-anchored tail window,
confuser->Background grouping with probability summing, threshold 0.4,
per-species NMS at IoU 0.5, gate cutoff 1.5 kHz / threshold 0.20, and the
calibration margin (FP max 0.092, Colobus p05 0.261).

https://claude.ai/code/session_01GRhKW3iKJjm2wYYeUd56Hq
</commit_message>
<xml_diff>
--- a/paper/methodsx_manuscript.docx
+++ b/paper/methodsx_manuscript.docx
@@ -3922,13 +3922,19 @@
         </m:r>
       </m:oMath>
       <w:r>
-        <w:t xml:space="preserve"> 0.20). Detections falling below the threshold are reclassified as</w:t>
-      </w:r>
-      <w:r>
-        <w:t xml:space="preserve"> </w:t>
-      </w:r>
-      <w:r>
-        <w:t xml:space="preserve">Background. The threshold was calibrated against the curated</w:t>
+        <w:t xml:space="preserve"> 0.20). Detections falling below the threshold are dropped from</w:t>
+      </w:r>
+      <w:r>
+        <w:t xml:space="preserve"> </w:t>
+      </w:r>
+      <w:r>
+        <w:t xml:space="preserve">the detection list (i.e. treated as non-target Background). The threshold was</w:t>
+      </w:r>
+      <w:r>
+        <w:t xml:space="preserve"> </w:t>
+      </w:r>
+      <w:r>
+        <w:t xml:space="preserve">calibrated against the curated</w:t>
       </w:r>
       <w:r>
         <w:t xml:space="preserve"> </w:t>
@@ -3956,13 +3962,19 @@
         <w:t xml:space="preserve"> </w:t>
       </w:r>
       <w:r>
-        <w:t xml:space="preserve">providing a safe margin. The gate is recorded in the output CSV so that</w:t>
-      </w:r>
-      <w:r>
-        <w:t xml:space="preserve"> </w:t>
-      </w:r>
-      <w:r>
-        <w:t xml:space="preserve">downstream analysis can audit which detections were removed and why.</w:t>
+        <w:t xml:space="preserve">providing a safe margin. The low-frequency ratio is also written as a column</w:t>
+      </w:r>
+      <w:r>
+        <w:t xml:space="preserve"> </w:t>
+      </w:r>
+      <w:r>
+        <w:t xml:space="preserve">in the output CSV for every retained detection, so detections can be ranked or</w:t>
+      </w:r>
+      <w:r>
+        <w:t xml:space="preserve"> </w:t>
+      </w:r>
+      <w:r>
+        <w:t xml:space="preserve">re-inspected by it.</w:t>
       </w:r>
     </w:p>
     <w:p>

</xml_diff>

<commit_message>
Method details S1: present time-of-day filter as optional + flag actual run
The time-of-day filter is a configurable option (get_ipa_station_files
time_filter), and the latest detection run did not apply it. Reword from
"only recordings within 05:30-10:30 are processed" to an optional filter, and
add a TODO placeholder to confirm the final pipeline setting.

https://claude.ai/code/session_01GRhKW3iKJjm2wYYeUd56Hq
</commit_message>
<xml_diff>
--- a/paper/methodsx_manuscript.docx
+++ b/paper/methodsx_manuscript.docx
@@ -1116,37 +1116,55 @@
         <w:t xml:space="preserve"> </w:t>
       </w:r>
       <w:r>
-        <w:t xml:space="preserve">rainforest near Makokou, Gabon. Because the target species are diurnal and</w:t>
-      </w:r>
-      <w:r>
-        <w:t xml:space="preserve"> </w:t>
-      </w:r>
-      <w:r>
-        <w:t xml:space="preserve">most vocally active in the morning, only recordings whose start time falls</w:t>
-      </w:r>
-      <w:r>
-        <w:t xml:space="preserve"> </w:t>
-      </w:r>
-      <w:r>
-        <w:t xml:space="preserve">within a configurable window (default 05:30–10:30 local time, parsed from the</w:t>
-      </w:r>
-      <w:r>
-        <w:t xml:space="preserve"> </w:t>
-      </w:r>
-      <w:r>
-        <w:t xml:space="preserve">timestamp in each filename) are processed; this removes large stretches of</w:t>
-      </w:r>
-      <w:r>
-        <w:t xml:space="preserve"> </w:t>
-      </w:r>
-      <w:r>
-        <w:t xml:space="preserve">audio in which the species are unlikely to call and reduces both compute and</w:t>
-      </w:r>
-      <w:r>
-        <w:t xml:space="preserve"> </w:t>
-      </w:r>
-      <w:r>
-        <w:t xml:space="preserve">false positives.</w:t>
+        <w:t xml:space="preserve">rainforest near Makokou, Gabon. An optional time-of-day filter can restrict</w:t>
+      </w:r>
+      <w:r>
+        <w:t xml:space="preserve"> </w:t>
+      </w:r>
+      <w:r>
+        <w:t xml:space="preserve">processing to recordings whose start time falls within a configurable morning</w:t>
+      </w:r>
+      <w:r>
+        <w:t xml:space="preserve"> </w:t>
+      </w:r>
+      <w:r>
+        <w:t xml:space="preserve">window (default 05:30–10:30 local time, parsed from the filename timestamp),</w:t>
+      </w:r>
+      <w:r>
+        <w:t xml:space="preserve"> </w:t>
+      </w:r>
+      <w:r>
+        <w:t xml:space="preserve">when the diurnal target species are most vocally active, reducing both compute</w:t>
+      </w:r>
+      <w:r>
+        <w:t xml:space="preserve"> </w:t>
+      </w:r>
+      <w:r>
+        <w:t xml:space="preserve">and false positives.</w:t>
+      </w:r>
+      <w:r>
+        <w:t xml:space="preserve"> </w:t>
+      </w:r>
+      <w:r>
+        <w:rPr>
+          <w:b/>
+          <w:bCs/>
+        </w:rPr>
+        <w:t xml:space="preserve">[TODO: the latest detection run did not apply this time-of-day filter;</w:t>
+      </w:r>
+      <w:r>
+        <w:rPr>
+          <w:b/>
+          <w:bCs/>
+        </w:rPr>
+        <w:t xml:space="preserve"> </w:t>
+      </w:r>
+      <w:r>
+        <w:rPr>
+          <w:b/>
+          <w:bCs/>
+        </w:rPr>
+        <w:t xml:space="preserve">confirm the final pipeline setting and reconcile this paragraph.]</w:t>
       </w:r>
     </w:p>
     <w:p>

</xml_diff>

<commit_message>
Manuscript-wide cleanup: remove code/file symbols, reduce em-dashes
Per review (font uniformity + fewer em-dashes + drop filenames):
- Remove all \texttt{} code/file identifiers (20 -> 0): genericize filenames
  (config.py -> "configuration file", best_model_v12.h5 -> "the best
  checkpoint", graphical_abstract.pdf -> "a separate file") and internal
  symbols (find_loudest_window, config.SPECIES_FOLDERS, DETECTION_GROUPS,
  flag_reason, field_confirmed) into plain language; de-monospace the kept
  method terms (VGG19 block names, the Colobus_confuser class label). This
  also fixes the mixed-font look in the Word render.
- Reduce em-dashes 31 -> 3 (kept: two Santi placeholders + one "n/a" table
  cell): parenthetical asides -> parentheses/commas, term-definition and
  stage headers -> colons.

https://claude.ai/code/session_01GRhKW3iKJjm2wYYeUd56Hq
</commit_message>
<xml_diff>
--- a/paper/methodsx_manuscript.docx
+++ b/paper/methodsx_manuscript.docx
@@ -299,16 +299,7 @@
         <w:pStyle w:val="FirstParagraph"/>
       </w:pPr>
       <w:r>
-        <w:t xml:space="preserve">Submitted as a separate file (</w:t>
-      </w:r>
-      <w:r>
-        <w:rPr>
-          <w:rStyle w:val="VerbatimChar"/>
-        </w:rPr>
-        <w:t xml:space="preserve">graphical_abstract.pdf</w:t>
-      </w:r>
-      <w:r>
-        <w:t xml:space="preserve">). The figure</w:t>
+        <w:t xml:space="preserve">Submitted as a separate file. The figure</w:t>
       </w:r>
       <w:r>
         <w:t xml:space="preserve"> </w:t>
@@ -636,10 +627,7 @@
               </w:r>
             </w:hyperlink>
             <w:r>
-              <w:t xml:space="preserve"> </w:t>
-            </w:r>
-            <w:r>
-              <w:t xml:space="preserve">— Python 3,</w:t>
+              <w:t xml:space="preserve">. Python 3,</w:t>
             </w:r>
             <w:r>
               <w:t xml:space="preserve"> </w:t>
@@ -770,13 +758,13 @@
         <w:t xml:space="preserve"> </w:t>
       </w:r>
       <w:r>
-        <w:t xml:space="preserve">sounds that dominate a rainforest soundscape — insects, birds, wind, rain,</w:t>
-      </w:r>
-      <w:r>
-        <w:t xml:space="preserve"> </w:t>
-      </w:r>
-      <w:r>
-        <w:t xml:space="preserve">and the calls of non-target animals — none of which are well represented in</w:t>
+        <w:t xml:space="preserve">sounds that dominate a rainforest soundscape (insects, birds, wind, rain,</w:t>
+      </w:r>
+      <w:r>
+        <w:t xml:space="preserve"> </w:t>
+      </w:r>
+      <w:r>
+        <w:t xml:space="preserve">and the calls of non-target animals), none of which are well represented in</w:t>
       </w:r>
       <w:r>
         <w:t xml:space="preserve"> </w:t>
@@ -983,13 +971,13 @@
         <w:pStyle w:val="FirstParagraph"/>
       </w:pPr>
       <w:r>
-        <w:t xml:space="preserve">The pipeline has five stages — preprocessing, training, detection, automatic</w:t>
-      </w:r>
-      <w:r>
-        <w:t xml:space="preserve"> </w:t>
-      </w:r>
-      <w:r>
-        <w:t xml:space="preserve">cleanup, and iterative retraining — augmented by three targeted</w:t>
+        <w:t xml:space="preserve">The pipeline has five stages (preprocessing, training, detection, automatic</w:t>
+      </w:r>
+      <w:r>
+        <w:t xml:space="preserve"> </w:t>
+      </w:r>
+      <w:r>
+        <w:t xml:space="preserve">cleanup, and iterative retraining), augmented by three targeted</w:t>
       </w:r>
       <w:r>
         <w:t xml:space="preserve"> </w:t>
@@ -1060,22 +1048,7 @@
         <w:t xml:space="preserve"> </w:t>
       </w:r>
       <w:r>
-        <w:t xml:space="preserve">species definitions, and hyperparameters live in a single</w:t>
-      </w:r>
-      <w:r>
-        <w:t xml:space="preserve"> </w:t>
-      </w:r>
-      <w:r>
-        <w:rPr>
-          <w:rStyle w:val="VerbatimChar"/>
-        </w:rPr>
-        <w:t xml:space="preserve">config.py</w:t>
-      </w:r>
-      <w:r>
-        <w:t xml:space="preserve"> </w:t>
-      </w:r>
-      <w:r>
-        <w:t xml:space="preserve">so</w:t>
+        <w:t xml:space="preserve">species definitions, and hyperparameters live in a single configuration file so</w:t>
       </w:r>
       <w:r>
         <w:t xml:space="preserve"> </w:t>
@@ -1207,10 +1180,7 @@
         <w:t xml:space="preserve">Cernic</w:t>
       </w:r>
       <w:r>
-        <w:t xml:space="preserve"> </w:t>
-      </w:r>
-      <w:r>
-        <w:t xml:space="preserve">— all putty-nosed monkey call types (putty-nose, hack,</w:t>
+        <w:t xml:space="preserve">: all putty-nosed monkey call types (putty-nose, hack,</w:t>
       </w:r>
       <w:r>
         <w:t xml:space="preserve"> </w:t>
@@ -1222,22 +1192,7 @@
         <w:t xml:space="preserve"> </w:t>
       </w:r>
       <w:r>
-        <w:t xml:space="preserve">plus a</w:t>
-      </w:r>
-      <w:r>
-        <w:t xml:space="preserve"> </w:t>
-      </w:r>
-      <w:r>
-        <w:rPr>
-          <w:rStyle w:val="VerbatimChar"/>
-        </w:rPr>
-        <w:t xml:space="preserve">field_confirmed</w:t>
-      </w:r>
-      <w:r>
-        <w:t xml:space="preserve"> </w:t>
-      </w:r>
-      <w:r>
-        <w:t xml:space="preserve">folder of recovered field calls) are mapped to</w:t>
+        <w:t xml:space="preserve">plus a folder of recovered field calls) are mapped to</w:t>
       </w:r>
       <w:r>
         <w:t xml:space="preserve"> </w:t>
@@ -1255,19 +1210,7 @@
         <w:t xml:space="preserve"> </w:t>
       </w:r>
       <w:r>
-        <w:t xml:space="preserve">label via</w:t>
-      </w:r>
-      <w:r>
-        <w:t xml:space="preserve"> </w:t>
-      </w:r>
-      <w:r>
-        <w:rPr>
-          <w:rStyle w:val="VerbatimChar"/>
-        </w:rPr>
-        <w:t xml:space="preserve">config.SPECIES_FOLDERS</w:t>
-      </w:r>
-      <w:r>
-        <w:t xml:space="preserve">, so that</w:t>
+        <w:t xml:space="preserve">label, so that</w:t>
       </w:r>
       <w:r>
         <w:t xml:space="preserve"> </w:t>
@@ -1297,10 +1240,7 @@
         <w:t xml:space="preserve">Colobus_guereza</w:t>
       </w:r>
       <w:r>
-        <w:t xml:space="preserve"> </w:t>
-      </w:r>
-      <w:r>
-        <w:t xml:space="preserve">—</w:t>
+        <w:t xml:space="preserve">:</w:t>
       </w:r>
       <w:r>
         <w:t xml:space="preserve"> </w:t>
@@ -1334,10 +1274,7 @@
         <w:t xml:space="preserve">Colobus_confuser</w:t>
       </w:r>
       <w:r>
-        <w:t xml:space="preserve"> </w:t>
-      </w:r>
-      <w:r>
-        <w:t xml:space="preserve">— a dedicated hard-negative class containing</w:t>
+        <w:t xml:space="preserve">: a dedicated hard-negative class containing</w:t>
       </w:r>
       <w:r>
         <w:t xml:space="preserve"> </w:t>
@@ -1423,10 +1360,7 @@
         <w:t xml:space="preserve">Background</w:t>
       </w:r>
       <w:r>
-        <w:t xml:space="preserve"> </w:t>
-      </w:r>
-      <w:r>
-        <w:t xml:space="preserve">— a pooled negative class assembled from ambient</w:t>
+        <w:t xml:space="preserve">: a pooled negative class assembled from ambient</w:t>
       </w:r>
       <w:r>
         <w:t xml:space="preserve"> </w:t>
@@ -1816,13 +1750,13 @@
         <w:t xml:space="preserve"> </w:t>
       </w:r>
       <w:r>
-        <w:t xml:space="preserve">Background class is loaded as a single pooled negative — with no internal</w:t>
-      </w:r>
-      <w:r>
-        <w:t xml:space="preserve"> </w:t>
-      </w:r>
-      <w:r>
-        <w:t xml:space="preserve">sub-labels — any genuine target call accidentally present in a false-positive</w:t>
+        <w:t xml:space="preserve">Background class is loaded as a single pooled negative (with no internal</w:t>
+      </w:r>
+      <w:r>
+        <w:t xml:space="preserve"> </w:t>
+      </w:r>
+      <w:r>
+        <w:t xml:space="preserve">sub-labels), any genuine target call accidentally present in a false-positive</w:t>
       </w:r>
       <w:r>
         <w:t xml:space="preserve"> </w:t>
@@ -1852,22 +1786,7 @@
         <w:t xml:space="preserve"> </w:t>
       </w:r>
       <w:r>
-        <w:t xml:space="preserve">the dedicated</w:t>
-      </w:r>
-      <w:r>
-        <w:t xml:space="preserve"> </w:t>
-      </w:r>
-      <w:r>
-        <w:rPr>
-          <w:rStyle w:val="VerbatimChar"/>
-        </w:rPr>
-        <w:t xml:space="preserve">field_confirmed</w:t>
-      </w:r>
-      <w:r>
-        <w:t xml:space="preserve"> </w:t>
-      </w:r>
-      <w:r>
-        <w:t xml:space="preserve">Cernic folder; the</w:t>
+        <w:t xml:space="preserve">the Cernic class; the</w:t>
       </w:r>
       <w:r>
         <w:t xml:space="preserve"> </w:t>
@@ -1889,22 +1808,13 @@
         <w:t xml:space="preserve"> </w:t>
       </w:r>
       <w:r>
-        <w:rPr>
-          <w:rStyle w:val="VerbatimChar"/>
-        </w:rPr>
-        <w:t xml:space="preserve">Colobus_confuser</w:t>
-      </w:r>
-      <w:r>
-        <w:t xml:space="preserve"> </w:t>
-      </w:r>
-      <w:r>
-        <w:t xml:space="preserve">class. Content-duplicate clips — the same field</w:t>
-      </w:r>
-      <w:r>
-        <w:t xml:space="preserve"> </w:t>
-      </w:r>
-      <w:r>
-        <w:t xml:space="preserve">detection stored more than once by different mining passes — were removed by</w:t>
+        <w:t xml:space="preserve">Colobus_confuser class. Content-duplicate clips (the same field</w:t>
+      </w:r>
+      <w:r>
+        <w:t xml:space="preserve"> </w:t>
+      </w:r>
+      <w:r>
+        <w:t xml:space="preserve">detection stored more than once by different mining passes) were removed by</w:t>
       </w:r>
       <w:r>
         <w:t xml:space="preserve"> </w:t>
@@ -1984,22 +1894,7 @@
         <w:t xml:space="preserve"> </w:t>
       </w:r>
       <w:r>
-        <w:t xml:space="preserve">deterministic 2 s window with the highest short-time energy</w:t>
-      </w:r>
-      <w:r>
-        <w:t xml:space="preserve"> </w:t>
-      </w:r>
-      <w:r>
-        <w:t xml:space="preserve">(</w:t>
-      </w:r>
-      <w:r>
-        <w:rPr>
-          <w:rStyle w:val="VerbatimChar"/>
-        </w:rPr>
-        <w:t xml:space="preserve">find_loudest_window</w:t>
-      </w:r>
-      <w:r>
-        <w:t xml:space="preserve">), ensuring that the segment reviewed by a</w:t>
+        <w:t xml:space="preserve">deterministic 2 s window with the highest short-time energy, ensuring that the segment reviewed by a</w:t>
       </w:r>
       <w:r>
         <w:t xml:space="preserve"> </w:t>
@@ -2293,7 +2188,7 @@
         <w:t xml:space="preserve"> </w:t>
       </w:r>
       <w:r>
-        <w:t xml:space="preserve">classifier trained on them can therefore take a shortcut — keying on</w:t>
+        <w:t xml:space="preserve">classifier trained on them can therefore take a shortcut (keying on</w:t>
       </w:r>
       <w:r>
         <w:t xml:space="preserve"> </w:t>
@@ -2315,7 +2210,7 @@
         <w:t xml:space="preserve"> </w:t>
       </w:r>
       <w:r>
-        <w:t xml:space="preserve">signature — and consequently mis-fire on forest insects and</w:t>
+        <w:t xml:space="preserve">signature) and consequently mis-fire on forest insects and</w:t>
       </w:r>
       <w:r>
         <w:t xml:space="preserve"> </w:t>
@@ -2731,22 +2626,7 @@
         <w:pStyle w:val="BodyText"/>
       </w:pPr>
       <w:r>
-        <w:t xml:space="preserve">The feature map from</w:t>
-      </w:r>
-      <w:r>
-        <w:t xml:space="preserve"> </w:t>
-      </w:r>
-      <w:r>
-        <w:rPr>
-          <w:rStyle w:val="VerbatimChar"/>
-        </w:rPr>
-        <w:t xml:space="preserve">block4_conv4</w:t>
-      </w:r>
-      <w:r>
-        <w:t xml:space="preserve"> </w:t>
-      </w:r>
-      <w:r>
-        <w:t xml:space="preserve">of VGG19 (spatial size</w:t>
+        <w:t xml:space="preserve">The feature map from block4_conv4 of VGG19 (spatial size</w:t>
       </w:r>
       <w:r>
         <w:t xml:space="preserve"> </w:t>
@@ -2846,7 +2726,7 @@
         <w:t xml:space="preserve"> </w:t>
       </w:r>
       <w:r>
-        <w:t xml:space="preserve">in frequency it occurred — exactly the cue a human uses to tell a</w:t>
+        <w:t xml:space="preserve">in frequency it occurred, exactly the cue a human uses to tell a</w:t>
       </w:r>
       <w:r>
         <w:t xml:space="preserve"> </w:t>
@@ -3013,7 +2893,7 @@
         <w:t xml:space="preserve"> </w:t>
       </w:r>
       <w:r>
-        <w:t xml:space="preserve">band is then processed by its own one-dimensional convolutional stream —</w:t>
+        <w:t xml:space="preserve">band is then processed by its own one-dimensional convolutional stream:</w:t>
       </w:r>
       <w:r>
         <w:t xml:space="preserve"> </w:t>
@@ -3025,7 +2905,7 @@
         <w:t xml:space="preserve"> </w:t>
       </w:r>
       <w:r>
-        <w:t xml:space="preserve">normalization and ReLU — producing four sequences of shape</w:t>
+        <w:t xml:space="preserve">normalization and ReLU, producing four sequences of shape</w:t>
       </w:r>
       <w:r>
         <w:t xml:space="preserve"> </w:t>
@@ -3200,16 +3080,7 @@
         <w:pStyle w:val="ImageCaption"/>
       </w:pPr>
       <w:r>
-        <w:t xml:space="preserve">Model architecture. A VGG19 backbone (the</w:t>
-      </w:r>
-      <w:r>
-        <w:t xml:space="preserve"> </w:t>
-      </w:r>
-      <w:r>
-        <w:rPr>
-          <w:rStyle w:val="VerbatimChar"/>
-        </w:rPr>
-        <w:t xml:space="preserve">block4_conv4</w:t>
+        <w:t xml:space="preserve">Model architecture. A VGG19 backbone (the block4_conv4</w:t>
       </w:r>
       <w:r>
         <w:t xml:space="preserve"> </w:t>
@@ -3302,7 +3173,7 @@
         <w:pStyle w:val="Heading4"/>
       </w:pPr>
       <w:r>
-        <w:t xml:space="preserve">Stage 1 — Head training.</w:t>
+        <w:t xml:space="preserve">Stage 1: Head training.</w:t>
       </w:r>
     </w:p>
     <w:p>
@@ -3361,7 +3232,7 @@
         <w:pStyle w:val="Heading4"/>
       </w:pPr>
       <w:r>
-        <w:t xml:space="preserve">Stage 2 — Partial fine-tuning.</w:t>
+        <w:t xml:space="preserve">Stage 2: Partial fine-tuning.</w:t>
       </w:r>
     </w:p>
     <w:p>
@@ -3369,16 +3240,7 @@
         <w:pStyle w:val="FirstParagraph"/>
       </w:pPr>
       <w:r>
-        <w:t xml:space="preserve">Because the VGG19 base is truncated at</w:t>
-      </w:r>
-      <w:r>
-        <w:t xml:space="preserve"> </w:t>
-      </w:r>
-      <w:r>
-        <w:rPr>
-          <w:rStyle w:val="VerbatimChar"/>
-        </w:rPr>
-        <w:t xml:space="preserve">block4_conv4</w:t>
+        <w:t xml:space="preserve">Because the VGG19 base is truncated at block4_conv4</w:t>
       </w:r>
       <w:r>
         <w:t xml:space="preserve"> </w:t>
@@ -3390,73 +3252,13 @@
         <w:t xml:space="preserve"> </w:t>
       </w:r>
       <w:r>
-        <w:t xml:space="preserve">blocks — the</w:t>
-      </w:r>
-      <w:r>
-        <w:t xml:space="preserve"> </w:t>
-      </w:r>
-      <w:r>
-        <w:rPr>
-          <w:rStyle w:val="VerbatimChar"/>
-        </w:rPr>
-        <w:t xml:space="preserve">block3</w:t>
-      </w:r>
-      <w:r>
-        <w:t xml:space="preserve"> </w:t>
-      </w:r>
-      <w:r>
-        <w:t xml:space="preserve">and</w:t>
-      </w:r>
-      <w:r>
-        <w:t xml:space="preserve"> </w:t>
-      </w:r>
-      <w:r>
-        <w:rPr>
-          <w:rStyle w:val="VerbatimChar"/>
-        </w:rPr>
-        <w:t xml:space="preserve">block4</w:t>
-      </w:r>
-      <w:r>
-        <w:t xml:space="preserve"> </w:t>
-      </w:r>
-      <w:r>
-        <w:t xml:space="preserve">convolutional layers — are</w:t>
-      </w:r>
-      <w:r>
-        <w:t xml:space="preserve"> </w:t>
-      </w:r>
-      <w:r>
-        <w:t xml:space="preserve">unfrozen, while</w:t>
-      </w:r>
-      <w:r>
-        <w:t xml:space="preserve"> </w:t>
-      </w:r>
-      <w:r>
-        <w:rPr>
-          <w:rStyle w:val="VerbatimChar"/>
-        </w:rPr>
-        <w:t xml:space="preserve">block1</w:t>
-      </w:r>
-      <w:r>
-        <w:t xml:space="preserve"> </w:t>
-      </w:r>
-      <w:r>
-        <w:t xml:space="preserve">and</w:t>
-      </w:r>
-      <w:r>
-        <w:t xml:space="preserve"> </w:t>
-      </w:r>
-      <w:r>
-        <w:rPr>
-          <w:rStyle w:val="VerbatimChar"/>
-        </w:rPr>
-        <w:t xml:space="preserve">block2</w:t>
-      </w:r>
-      <w:r>
-        <w:t xml:space="preserve"> </w:t>
-      </w:r>
-      <w:r>
-        <w:t xml:space="preserve">remain frozen to preserve</w:t>
+        <w:t xml:space="preserve">blocks (the block3 and block4 convolutional layers) are</w:t>
+      </w:r>
+      <w:r>
+        <w:t xml:space="preserve"> </w:t>
+      </w:r>
+      <w:r>
+        <w:t xml:space="preserve">unfrozen, while block1 and block2 remain frozen to preserve</w:t>
       </w:r>
       <w:r>
         <w:t xml:space="preserve"> </w:t>
@@ -3627,19 +3429,7 @@
         <w:t xml:space="preserve"> </w:t>
       </w:r>
       <w:r>
-        <w:t xml:space="preserve">checkpoint is saved as</w:t>
-      </w:r>
-      <w:r>
-        <w:t xml:space="preserve"> </w:t>
-      </w:r>
-      <w:r>
-        <w:rPr>
-          <w:rStyle w:val="VerbatimChar"/>
-        </w:rPr>
-        <w:t xml:space="preserve">best_model_v12.h5</w:t>
-      </w:r>
-      <w:r>
-        <w:t xml:space="preserve">. Training concludes with a</w:t>
+        <w:t xml:space="preserve">checkpoint is saved. Training concludes with a</w:t>
       </w:r>
       <w:r>
         <w:t xml:space="preserve"> </w:t>
@@ -3701,21 +3491,6 @@
         <w:t xml:space="preserve">groups</w:t>
       </w:r>
       <w:r>
-        <w:t xml:space="preserve"> </w:t>
-      </w:r>
-      <w:r>
-        <w:t xml:space="preserve">through</w:t>
-      </w:r>
-      <w:r>
-        <w:t xml:space="preserve"> </w:t>
-      </w:r>
-      <w:r>
-        <w:rPr>
-          <w:rStyle w:val="VerbatimChar"/>
-        </w:rPr>
-        <w:t xml:space="preserve">DETECTION_GROUPS</w:t>
-      </w:r>
-      <w:r>
         <w:t xml:space="preserve">: the</w:t>
       </w:r>
       <w:r>
@@ -3758,7 +3533,7 @@
         <w:t xml:space="preserve"> </w:t>
       </w:r>
       <w:r>
-        <w:t xml:space="preserve">detections exactly like Background, and — equally important — the confuser</w:t>
+        <w:t xml:space="preserve">detections exactly like Background, and, equally important, the confuser</w:t>
       </w:r>
       <w:r>
         <w:t xml:space="preserve"> </w:t>
@@ -4374,22 +4149,7 @@
         <w:t xml:space="preserve"> </w:t>
       </w:r>
       <w:r>
-        <w:t xml:space="preserve">human-readable</w:t>
-      </w:r>
-      <w:r>
-        <w:t xml:space="preserve"> </w:t>
-      </w:r>
-      <w:r>
-        <w:rPr>
-          <w:rStyle w:val="VerbatimChar"/>
-        </w:rPr>
-        <w:t xml:space="preserve">flag_reason</w:t>
-      </w:r>
-      <w:r>
-        <w:t xml:space="preserve"> </w:t>
-      </w:r>
-      <w:r>
-        <w:t xml:space="preserve">column), and strong false positives are</w:t>
+        <w:t xml:space="preserve">human-readable flag-reason column), and strong false positives are</w:t>
       </w:r>
       <w:r>
         <w:t xml:space="preserve"> </w:t>
@@ -4527,19 +4287,7 @@
         <w:t xml:space="preserve"> </w:t>
       </w:r>
       <w:r>
-        <w:t xml:space="preserve">to its own softmax class (here,</w:t>
-      </w:r>
-      <w:r>
-        <w:t xml:space="preserve"> </w:t>
-      </w:r>
-      <w:r>
-        <w:rPr>
-          <w:rStyle w:val="VerbatimChar"/>
-        </w:rPr>
-        <w:t xml:space="preserve">Colobus_confuser</w:t>
-      </w:r>
-      <w:r>
-        <w:t xml:space="preserve">) and route it back</w:t>
+        <w:t xml:space="preserve">to its own softmax class (here, Colobus_confuser) and route it back</w:t>
       </w:r>
       <w:r>
         <w:t xml:space="preserve"> </w:t>
@@ -4661,13 +4409,13 @@
         <w:pStyle w:val="FirstParagraph"/>
       </w:pPr>
       <w:r>
-        <w:t xml:space="preserve">The four-class V12 model — the frequency-position-aware head with</w:t>
-      </w:r>
-      <w:r>
-        <w:t xml:space="preserve"> </w:t>
-      </w:r>
-      <w:r>
-        <w:t xml:space="preserve">high-frequency nuisance augmentation — was evaluated on a stratified</w:t>
+        <w:t xml:space="preserve">The four-class V12 model (the frequency-position-aware head with</w:t>
+      </w:r>
+      <w:r>
+        <w:t xml:space="preserve"> </w:t>
+      </w:r>
+      <w:r>
+        <w:t xml:space="preserve">high-frequency nuisance augmentation) was evaluated on a stratified</w:t>
       </w:r>
       <w:r>
         <w:t xml:space="preserve"> </w:t>
@@ -6142,22 +5890,7 @@
         <w:t xml:space="preserve"> </w:t>
       </w:r>
       <w:r>
-        <w:t xml:space="preserve">sound to a dedicated</w:t>
-      </w:r>
-      <w:r>
-        <w:t xml:space="preserve"> </w:t>
-      </w:r>
-      <w:r>
-        <w:rPr>
-          <w:rStyle w:val="VerbatimChar"/>
-        </w:rPr>
-        <w:t xml:space="preserve">Colobus_confuser</w:t>
-      </w:r>
-      <w:r>
-        <w:t xml:space="preserve"> </w:t>
-      </w:r>
-      <w:r>
-        <w:t xml:space="preserve">class (V10) addressed this</w:t>
+        <w:t xml:space="preserve">sound to a dedicated Colobus_confuser class (V10) addressed this</w:t>
       </w:r>
       <w:r>
         <w:t xml:space="preserve"> </w:t>
@@ -6597,13 +6330,13 @@
         <w:t xml:space="preserve"> </w:t>
       </w:r>
       <w:r>
-        <w:t xml:space="preserve">set, Cernic recall is 96.1 %; the misclassified Cernic clips — mostly brief</w:t>
-      </w:r>
-      <w:r>
-        <w:t xml:space="preserve"> </w:t>
-      </w:r>
-      <w:r>
-        <w:t xml:space="preserve">hacks and pyows embedded in loud ambient noise — are split between the</w:t>
+        <w:t xml:space="preserve">set, Cernic recall is 96.1 %; the misclassified Cernic clips (mostly brief</w:t>
+      </w:r>
+      <w:r>
+        <w:t xml:space="preserve"> </w:t>
+      </w:r>
+      <w:r>
+        <w:t xml:space="preserve">hacks and pyows embedded in loud ambient noise) are split between the</w:t>
       </w:r>
       <w:r>
         <w:t xml:space="preserve"> </w:t>
@@ -7079,22 +6812,7 @@
         <w:t xml:space="preserve"> </w:t>
       </w:r>
       <w:r>
-        <w:t xml:space="preserve">the</w:t>
-      </w:r>
-      <w:r>
-        <w:t xml:space="preserve"> </w:t>
-      </w:r>
-      <w:r>
-        <w:rPr>
-          <w:rStyle w:val="VerbatimChar"/>
-        </w:rPr>
-        <w:t xml:space="preserve">config.py</w:t>
-      </w:r>
-      <w:r>
-        <w:t xml:space="preserve"> </w:t>
-      </w:r>
-      <w:r>
-        <w:t xml:space="preserve">used, or sample detection CSVs. Delete this section if</w:t>
+        <w:t xml:space="preserve">the configuration used, or sample detection CSVs. Delete this section if</w:t>
       </w:r>
       <w:r>
         <w:t xml:space="preserve"> </w:t>

</xml_diff>

<commit_message>
Embed the graphical abstract image instead of describing it in prose
A graphical abstract is a figure, not a prose description. Replace the
text walkthrough of the pipeline with the actual graphical_abstract.pdf
embedded in the section, plus a note that it is also submitted as a
separate file (per MethodsX requirements).

https://claude.ai/code/session_01GRhKW3iKJjm2wYYeUd56Hq
</commit_message>
<xml_diff>
--- a/paper/methodsx_manuscript.docx
+++ b/paper/methodsx_manuscript.docx
@@ -285,7 +285,7 @@
       </w:r>
     </w:p>
     <w:bookmarkEnd w:id="9"/>
-    <w:bookmarkStart w:id="10" w:name="graphical-abstract"/>
+    <w:bookmarkStart w:id="13" w:name="graphical-abstract"/>
     <w:p>
       <w:pPr>
         <w:pStyle w:val="Heading1"/>
@@ -299,114 +299,76 @@
         <w:pStyle w:val="FirstParagraph"/>
       </w:pPr>
       <w:r>
-        <w:t xml:space="preserve">Submitted as a separate file. The figure</w:t>
-      </w:r>
-      <w:r>
-        <w:t xml:space="preserve"> </w:t>
-      </w:r>
-      <w:r>
-        <w:t xml:space="preserve">summarises the six-stage pipeline: reference clips</w:t>
-      </w:r>
-      <w:r>
-        <w:t xml:space="preserve"> </w:t>
-      </w:r>
-      <m:oMath>
-        <m:r>
-          <m:rPr>
-            <m:sty m:val="p"/>
-          </m:rPr>
-          <m:t>→</m:t>
-        </m:r>
-      </m:oMath>
-      <w:r>
-        <w:t xml:space="preserve"> </w:t>
-      </w:r>
-      <w:r>
-        <w:t xml:space="preserve">mel-spectrogram &amp; augmentation</w:t>
-      </w:r>
-      <w:r>
-        <w:t xml:space="preserve"> </w:t>
-      </w:r>
-      <m:oMath>
-        <m:r>
-          <m:rPr>
-            <m:sty m:val="p"/>
-          </m:rPr>
-          <m:t>→</m:t>
-        </m:r>
-      </m:oMath>
-      <w:r>
-        <w:t xml:space="preserve"> </w:t>
-      </w:r>
-      <w:r>
-        <w:t xml:space="preserve">VGG19 frequency-position CRNN</w:t>
-      </w:r>
-      <w:r>
-        <w:t xml:space="preserve"> </w:t>
-      </w:r>
-      <w:r>
-        <w:t xml:space="preserve">classifier</w:t>
-      </w:r>
-      <w:r>
-        <w:t xml:space="preserve"> </w:t>
-      </w:r>
-      <m:oMath>
-        <m:r>
-          <m:rPr>
-            <m:sty m:val="p"/>
-          </m:rPr>
-          <m:t>→</m:t>
-        </m:r>
-      </m:oMath>
-      <w:r>
-        <w:t xml:space="preserve"> </w:t>
-      </w:r>
-      <w:r>
-        <w:t xml:space="preserve">sliding-window detection with low-frequency gate</w:t>
-      </w:r>
-      <w:r>
-        <w:t xml:space="preserve"> </w:t>
-      </w:r>
-      <m:oMath>
-        <m:r>
-          <m:rPr>
-            <m:sty m:val="p"/>
-          </m:rPr>
-          <m:t>→</m:t>
-        </m:r>
-      </m:oMath>
-      <w:r>
-        <w:t xml:space="preserve"> </w:t>
-      </w:r>
-      <w:r>
-        <w:t xml:space="preserve">three-filter automatic cleanup</w:t>
-      </w:r>
-      <w:r>
-        <w:t xml:space="preserve"> </w:t>
-      </w:r>
-      <m:oMath>
-        <m:r>
-          <m:rPr>
-            <m:sty m:val="p"/>
-          </m:rPr>
-          <m:t>→</m:t>
-        </m:r>
-      </m:oMath>
-      <w:r>
-        <w:t xml:space="preserve"> </w:t>
-      </w:r>
-      <w:r>
-        <w:t xml:space="preserve">hard-negative</w:t>
-      </w:r>
-      <w:r>
-        <w:t xml:space="preserve"> </w:t>
-      </w:r>
-      <w:r>
-        <w:t xml:space="preserve">mining (iterative feedback loop).</w:t>
-      </w:r>
-    </w:p>
-    <w:bookmarkEnd w:id="10"/>
-    <w:bookmarkStart w:id="12" w:name="specifications-table"/>
+        <w:drawing>
+          <wp:inline>
+            <wp:extent cx="5334000" cy="2131368"/>
+            <wp:effectExtent b="0" l="0" r="0" t="0"/>
+            <wp:docPr descr="image" title="" id="11" name="Picture"/>
+            <a:graphic>
+              <a:graphicData uri="http://schemas.openxmlformats.org/drawingml/2006/picture">
+                <pic:pic>
+                  <pic:nvPicPr>
+                    <pic:cNvPr descr="graphical_abstract.pdf" id="12" name="Picture"/>
+                    <pic:cNvPicPr>
+                      <a:picLocks noChangeArrowheads="1" noChangeAspect="1"/>
+                    </pic:cNvPicPr>
+                  </pic:nvPicPr>
+                  <pic:blipFill>
+                    <a:blip r:embed="rId10"/>
+                    <a:stretch>
+                      <a:fillRect/>
+                    </a:stretch>
+                  </pic:blipFill>
+                  <pic:spPr bwMode="auto">
+                    <a:xfrm>
+                      <a:off x="0" y="0"/>
+                      <a:ext cx="5334000" cy="2131368"/>
+                    </a:xfrm>
+                    <a:prstGeom prst="rect">
+                      <a:avLst/>
+                    </a:prstGeom>
+                    <a:noFill/>
+                    <a:ln w="9525">
+                      <a:noFill/>
+                      <a:headEnd/>
+                      <a:tailEnd/>
+                    </a:ln>
+                  </pic:spPr>
+                </pic:pic>
+              </a:graphicData>
+            </a:graphic>
+          </wp:inline>
+        </w:drawing>
+      </w:r>
+    </w:p>
+    <w:p>
+      <w:pPr>
+        <w:pStyle w:val="BodyText"/>
+      </w:pPr>
+      <w:r>
+        <w:rPr>
+          <w:i/>
+          <w:iCs/>
+        </w:rPr>
+        <w:t xml:space="preserve">(Also submitted as a separate image file, per the MethodsX</w:t>
+      </w:r>
+      <w:r>
+        <w:rPr>
+          <w:i/>
+          <w:iCs/>
+        </w:rPr>
+        <w:t xml:space="preserve"> </w:t>
+      </w:r>
+      <w:r>
+        <w:rPr>
+          <w:i/>
+          <w:iCs/>
+        </w:rPr>
+        <w:t xml:space="preserve">graphical-abstract requirements.)</w:t>
+      </w:r>
+    </w:p>
+    <w:bookmarkEnd w:id="13"/>
+    <w:bookmarkStart w:id="15" w:name="specifications-table"/>
     <w:p>
       <w:pPr>
         <w:pStyle w:val="Heading1"/>
@@ -618,7 +580,7 @@
             <w:r>
               <w:t xml:space="preserve"> </w:t>
             </w:r>
-            <w:hyperlink r:id="rId11">
+            <w:hyperlink r:id="rId14">
               <w:r>
                 <w:rPr>
                   <w:rStyle w:val="Hyperlink"/>
@@ -651,8 +613,8 @@
         </w:tc>
       </w:tr>
     </w:tbl>
-    <w:bookmarkEnd w:id="12"/>
-    <w:bookmarkStart w:id="13" w:name="background"/>
+    <w:bookmarkEnd w:id="15"/>
+    <w:bookmarkStart w:id="16" w:name="background"/>
     <w:p>
       <w:pPr>
         <w:pStyle w:val="Heading1"/>
@@ -956,8 +918,8 @@
         <w:t xml:space="preserve">new reference clips and editing a single configuration file.</w:t>
       </w:r>
     </w:p>
-    <w:bookmarkEnd w:id="13"/>
-    <w:bookmarkStart w:id="40" w:name="method-details"/>
+    <w:bookmarkEnd w:id="16"/>
+    <w:bookmarkStart w:id="43" w:name="method-details"/>
     <w:p>
       <w:pPr>
         <w:pStyle w:val="Heading1"/>
@@ -1063,7 +1025,7 @@
         <w:t xml:space="preserve">code.</w:t>
       </w:r>
     </w:p>
-    <w:bookmarkStart w:id="15" w:name="Xba94fc53b659dddb044208ab9692b361fd2e00f"/>
+    <w:bookmarkStart w:id="18" w:name="Xba94fc53b659dddb044208ab9692b361fd2e00f"/>
     <w:p>
       <w:pPr>
         <w:pStyle w:val="Heading2"/>
@@ -1398,7 +1360,7 @@
         <w:t xml:space="preserve">misclassified clips recycled through the hard-negative mining loop.</w:t>
       </w:r>
     </w:p>
-    <w:bookmarkStart w:id="14" w:name="tab:traindata"/>
+    <w:bookmarkStart w:id="17" w:name="tab:traindata"/>
     <w:p>
       <w:pPr>
         <w:pStyle w:val="TableCaption"/>
@@ -1707,7 +1669,7 @@
         </w:tc>
       </w:tr>
     </w:tbl>
-    <w:bookmarkEnd w:id="14"/>
+    <w:bookmarkEnd w:id="17"/>
     <w:p>
       <w:pPr>
         <w:pStyle w:val="BodyText"/>
@@ -1823,8 +1785,8 @@
         <w:t xml:space="preserve">hashing before training.</w:t>
       </w:r>
     </w:p>
-    <w:bookmarkEnd w:id="15"/>
-    <w:bookmarkStart w:id="16" w:name="Xe4b4dadc612911fc6b270728495411981661639"/>
+    <w:bookmarkEnd w:id="18"/>
+    <w:bookmarkStart w:id="19" w:name="Xe4b4dadc612911fc6b270728495411981661639"/>
     <w:p>
       <w:pPr>
         <w:pStyle w:val="Heading2"/>
@@ -1971,8 +1933,8 @@
         <w:t xml:space="preserve">two feature distributions comparable.</w:t>
       </w:r>
     </w:p>
-    <w:bookmarkEnd w:id="16"/>
-    <w:bookmarkStart w:id="22" w:name="data-augmentation"/>
+    <w:bookmarkEnd w:id="19"/>
+    <w:bookmarkStart w:id="25" w:name="data-augmentation"/>
     <w:p>
       <w:pPr>
         <w:pStyle w:val="Heading2"/>
@@ -2117,7 +2079,7 @@
         <w:t xml:space="preserve">.</w:t>
       </w:r>
     </w:p>
-    <w:bookmarkStart w:id="21" w:name="X877d4525f2ce6283914e1771e5b4ee23a60ca6f"/>
+    <w:bookmarkStart w:id="24" w:name="X877d4525f2ce6283914e1771e5b4ee23a60ca6f"/>
     <w:p>
       <w:pPr>
         <w:pStyle w:val="Heading4"/>
@@ -2316,7 +2278,7 @@
         <w:t xml:space="preserve">frequencies and must keep their high band intact.</w:t>
       </w:r>
     </w:p>
-    <w:bookmarkStart w:id="20" w:name="fig:augmentation"/>
+    <w:bookmarkStart w:id="23" w:name="fig:augmentation"/>
     <w:p>
       <w:pPr>
         <w:pStyle w:val="CaptionedFigure"/>
@@ -2326,18 +2288,18 @@
           <wp:inline>
             <wp:extent cx="5334000" cy="3518170"/>
             <wp:effectExtent b="0" l="0" r="0" t="0"/>
-            <wp:docPr descr="" title="" id="18" name="Picture"/>
+            <wp:docPr descr="" title="" id="21" name="Picture"/>
             <a:graphic>
               <a:graphicData uri="http://schemas.openxmlformats.org/drawingml/2006/picture">
                 <pic:pic>
                   <pic:nvPicPr>
-                    <pic:cNvPr descr="augmentation_v12.pdf" id="19" name="Picture"/>
+                    <pic:cNvPr descr="augmentation_v12.pdf" id="22" name="Picture"/>
                     <pic:cNvPicPr>
                       <a:picLocks noChangeArrowheads="1" noChangeAspect="1"/>
                     </pic:cNvPicPr>
                   </pic:nvPicPr>
                   <pic:blipFill>
-                    <a:blip r:embed="rId17"/>
+                    <a:blip r:embed="rId20"/>
                     <a:stretch>
                       <a:fillRect/>
                     </a:stretch>
@@ -2468,10 +2430,10 @@
         <w:t xml:space="preserve">label.</w:t>
       </w:r>
     </w:p>
-    <w:bookmarkEnd w:id="20"/>
-    <w:bookmarkEnd w:id="21"/>
-    <w:bookmarkEnd w:id="22"/>
-    <w:bookmarkStart w:id="28" w:name="model-architecture"/>
+    <w:bookmarkEnd w:id="23"/>
+    <w:bookmarkEnd w:id="24"/>
+    <w:bookmarkEnd w:id="25"/>
+    <w:bookmarkStart w:id="31" w:name="model-architecture"/>
     <w:p>
       <w:pPr>
         <w:pStyle w:val="Heading2"/>
@@ -2646,7 +2608,7 @@
         <w:t xml:space="preserve"> 28, 512 channels) is extracted before the final VGG19 block.</w:t>
       </w:r>
     </w:p>
-    <w:bookmarkStart w:id="27" w:name="frequency-position-encoding."/>
+    <w:bookmarkStart w:id="30" w:name="frequency-position-encoding."/>
     <w:p>
       <w:pPr>
         <w:pStyle w:val="Heading4"/>
@@ -3027,7 +2989,7 @@
         <w:t xml:space="preserve">Colobus_confuser, Background).</w:t>
       </w:r>
     </w:p>
-    <w:bookmarkStart w:id="26" w:name="fig:architecture"/>
+    <w:bookmarkStart w:id="29" w:name="fig:architecture"/>
     <w:p>
       <w:pPr>
         <w:pStyle w:val="CaptionedFigure"/>
@@ -3037,18 +2999,18 @@
           <wp:inline>
             <wp:extent cx="3840480" cy="4973121"/>
             <wp:effectExtent b="0" l="0" r="0" t="0"/>
-            <wp:docPr descr="" title="" id="24" name="Picture"/>
+            <wp:docPr descr="" title="" id="27" name="Picture"/>
             <a:graphic>
               <a:graphicData uri="http://schemas.openxmlformats.org/drawingml/2006/picture">
                 <pic:pic>
                   <pic:nvPicPr>
-                    <pic:cNvPr descr="model_architecture_v12.pdf" id="25" name="Picture"/>
+                    <pic:cNvPr descr="model_architecture_v12.pdf" id="28" name="Picture"/>
                     <pic:cNvPicPr>
                       <a:picLocks noChangeArrowheads="1" noChangeAspect="1"/>
                     </pic:cNvPicPr>
                   </pic:nvPicPr>
                   <pic:blipFill>
-                    <a:blip r:embed="rId23"/>
+                    <a:blip r:embed="rId26"/>
                     <a:stretch>
                       <a:fillRect/>
                     </a:stretch>
@@ -3141,10 +3103,10 @@
         <w:t xml:space="preserve">the right.</w:t>
       </w:r>
     </w:p>
-    <w:bookmarkEnd w:id="26"/>
-    <w:bookmarkEnd w:id="27"/>
-    <w:bookmarkEnd w:id="28"/>
-    <w:bookmarkStart w:id="32" w:name="model-training"/>
+    <w:bookmarkEnd w:id="29"/>
+    <w:bookmarkEnd w:id="30"/>
+    <w:bookmarkEnd w:id="31"/>
+    <w:bookmarkStart w:id="35" w:name="model-training"/>
     <w:p>
       <w:pPr>
         <w:pStyle w:val="Heading2"/>
@@ -3167,7 +3129,7 @@
         <w:t xml:space="preserve">protocol of head training followed by partial fine-tuning.</w:t>
       </w:r>
     </w:p>
-    <w:bookmarkStart w:id="29" w:name="stage-1-head-training."/>
+    <w:bookmarkStart w:id="32" w:name="stage-1-head-training."/>
     <w:p>
       <w:pPr>
         <w:pStyle w:val="Heading4"/>
@@ -3225,8 +3187,8 @@
         <w:t xml:space="preserve">, and the loss is sparse categorical cross-entropy.</w:t>
       </w:r>
     </w:p>
-    <w:bookmarkEnd w:id="29"/>
-    <w:bookmarkStart w:id="30" w:name="stage-2-partial-fine-tuning."/>
+    <w:bookmarkEnd w:id="32"/>
+    <w:bookmarkStart w:id="33" w:name="stage-2-partial-fine-tuning."/>
     <w:p>
       <w:pPr>
         <w:pStyle w:val="Heading4"/>
@@ -3331,8 +3293,8 @@
         <w:t xml:space="preserve">forgetting.</w:t>
       </w:r>
     </w:p>
-    <w:bookmarkEnd w:id="30"/>
-    <w:bookmarkStart w:id="31" w:name="shared-training-settings."/>
+    <w:bookmarkEnd w:id="33"/>
+    <w:bookmarkStart w:id="34" w:name="shared-training-settings."/>
     <w:p>
       <w:pPr>
         <w:pStyle w:val="Heading4"/>
@@ -3438,9 +3400,9 @@
         <w:t xml:space="preserve">per-class accuracy report and a confusion matrix on the validation set.</w:t>
       </w:r>
     </w:p>
-    <w:bookmarkEnd w:id="31"/>
-    <w:bookmarkEnd w:id="32"/>
-    <w:bookmarkStart w:id="34" w:name="sliding-window-detection"/>
+    <w:bookmarkEnd w:id="34"/>
+    <w:bookmarkEnd w:id="35"/>
+    <w:bookmarkStart w:id="37" w:name="sliding-window-detection"/>
     <w:p>
       <w:pPr>
         <w:pStyle w:val="Heading2"/>
@@ -3598,7 +3560,7 @@
         <w:t xml:space="preserve">non-maximum suppression at an intersection-over-union threshold of 0.5.</w:t>
       </w:r>
     </w:p>
-    <w:bookmarkStart w:id="33" w:name="low-frequency-energy-gate-for-colobus."/>
+    <w:bookmarkStart w:id="36" w:name="low-frequency-energy-gate-for-colobus."/>
     <w:p>
       <w:pPr>
         <w:pStyle w:val="Heading4"/>
@@ -3790,9 +3752,9 @@
         <w:t xml:space="preserve">review and downstream filtering do not require re-reading the long recordings.</w:t>
       </w:r>
     </w:p>
-    <w:bookmarkEnd w:id="33"/>
-    <w:bookmarkEnd w:id="34"/>
-    <w:bookmarkStart w:id="38" w:name="automatic-false-positive-cleanup"/>
+    <w:bookmarkEnd w:id="36"/>
+    <w:bookmarkEnd w:id="37"/>
+    <w:bookmarkStart w:id="41" w:name="automatic-false-positive-cleanup"/>
     <w:p>
       <w:pPr>
         <w:pStyle w:val="Heading2"/>
@@ -3833,7 +3795,7 @@
         <w:t xml:space="preserve">source recording.</w:t>
       </w:r>
     </w:p>
-    <w:bookmarkStart w:id="35" w:name="a-mahalanobis-out-of-distribution-filter"/>
+    <w:bookmarkStart w:id="38" w:name="a-mahalanobis-out-of-distribution-filter"/>
     <w:p>
       <w:pPr>
         <w:pStyle w:val="Heading4"/>
@@ -3929,8 +3891,8 @@
         <w:t xml:space="preserve">relative-outlier detector that is robust to the train-to-field domain shift.</w:t>
       </w:r>
     </w:p>
-    <w:bookmarkEnd w:id="35"/>
-    <w:bookmarkStart w:id="36" w:name="b-yamnet-cross-check"/>
+    <w:bookmarkEnd w:id="38"/>
+    <w:bookmarkStart w:id="39" w:name="b-yamnet-cross-check"/>
     <w:p>
       <w:pPr>
         <w:pStyle w:val="Heading4"/>
@@ -4026,8 +3988,8 @@
         <w:t xml:space="preserve">confirm primates.</w:t>
       </w:r>
     </w:p>
-    <w:bookmarkEnd w:id="36"/>
-    <w:bookmarkStart w:id="37" w:name="c-temporal-isolation-filter"/>
+    <w:bookmarkEnd w:id="39"/>
+    <w:bookmarkStart w:id="40" w:name="c-temporal-isolation-filter"/>
     <w:p>
       <w:pPr>
         <w:pStyle w:val="Heading4"/>
@@ -4158,9 +4120,9 @@
         <w:t xml:space="preserve">exported as labelled WAV clips for the next stage.</w:t>
       </w:r>
     </w:p>
-    <w:bookmarkEnd w:id="37"/>
-    <w:bookmarkEnd w:id="38"/>
-    <w:bookmarkStart w:id="39" w:name="iterative-hard-negative-mining"/>
+    <w:bookmarkEnd w:id="40"/>
+    <w:bookmarkEnd w:id="41"/>
+    <w:bookmarkStart w:id="42" w:name="iterative-hard-negative-mining"/>
     <w:p>
       <w:pPr>
         <w:pStyle w:val="Heading2"/>
@@ -4342,9 +4304,9 @@
         <w:t xml:space="preserve">source recordings have been deleted to save storage.</w:t>
       </w:r>
     </w:p>
-    <w:bookmarkEnd w:id="39"/>
-    <w:bookmarkEnd w:id="40"/>
-    <w:bookmarkStart w:id="54" w:name="method-validation"/>
+    <w:bookmarkEnd w:id="42"/>
+    <w:bookmarkEnd w:id="43"/>
+    <w:bookmarkStart w:id="57" w:name="method-validation"/>
     <w:p>
       <w:pPr>
         <w:pStyle w:val="Heading1"/>
@@ -4395,7 +4357,7 @@
         <w:t xml:space="preserve">false-positive rate.</w:t>
       </w:r>
     </w:p>
-    <w:bookmarkStart w:id="51" w:name="validation-set-performance-v12-model."/>
+    <w:bookmarkStart w:id="54" w:name="validation-set-performance-v12-model."/>
     <w:p>
       <w:pPr>
         <w:pStyle w:val="Heading4"/>
@@ -4505,7 +4467,7 @@
         <w:t xml:space="preserve">gives the full confusion matrix.</w:t>
       </w:r>
     </w:p>
-    <w:bookmarkStart w:id="44" w:name="fig:training"/>
+    <w:bookmarkStart w:id="47" w:name="fig:training"/>
     <w:p>
       <w:pPr>
         <w:pStyle w:val="CaptionedFigure"/>
@@ -4515,18 +4477,18 @@
           <wp:inline>
             <wp:extent cx="5334000" cy="2115910"/>
             <wp:effectExtent b="0" l="0" r="0" t="0"/>
-            <wp:docPr descr="" title="" id="42" name="Picture"/>
+            <wp:docPr descr="" title="" id="45" name="Picture"/>
             <a:graphic>
               <a:graphicData uri="http://schemas.openxmlformats.org/drawingml/2006/picture">
                 <pic:pic>
                   <pic:nvPicPr>
-                    <pic:cNvPr descr="training_curves_v12.pdf" id="43" name="Picture"/>
+                    <pic:cNvPr descr="training_curves_v12.pdf" id="46" name="Picture"/>
                     <pic:cNvPicPr>
                       <a:picLocks noChangeArrowheads="1" noChangeAspect="1"/>
                     </pic:cNvPicPr>
                   </pic:nvPicPr>
                   <pic:blipFill>
-                    <a:blip r:embed="rId41"/>
+                    <a:blip r:embed="rId44"/>
                     <a:stretch>
                       <a:fillRect/>
                     </a:stretch>
@@ -4585,8 +4547,8 @@
         <w:t xml:space="preserve">checkpoint (98.12 %).</w:t>
       </w:r>
     </w:p>
-    <w:bookmarkEnd w:id="44"/>
-    <w:bookmarkStart w:id="45" w:name="tab:val"/>
+    <w:bookmarkEnd w:id="47"/>
+    <w:bookmarkStart w:id="48" w:name="tab:val"/>
     <w:p>
       <w:pPr>
         <w:pStyle w:val="TableCaption"/>
@@ -4930,8 +4892,8 @@
         </w:tc>
       </w:tr>
     </w:tbl>
-    <w:bookmarkEnd w:id="45"/>
-    <w:bookmarkStart w:id="46" w:name="tab:confusion"/>
+    <w:bookmarkEnd w:id="48"/>
+    <w:bookmarkStart w:id="49" w:name="tab:confusion"/>
     <w:p>
       <w:pPr>
         <w:pStyle w:val="TableCaption"/>
@@ -5297,8 +5259,8 @@
         </w:tc>
       </w:tr>
     </w:tbl>
-    <w:bookmarkEnd w:id="46"/>
-    <w:bookmarkStart w:id="50" w:name="fig:confusion"/>
+    <w:bookmarkEnd w:id="49"/>
+    <w:bookmarkStart w:id="53" w:name="fig:confusion"/>
     <w:p>
       <w:pPr>
         <w:pStyle w:val="CaptionedFigure"/>
@@ -5308,18 +5270,18 @@
           <wp:inline>
             <wp:extent cx="3467100" cy="2929699"/>
             <wp:effectExtent b="0" l="0" r="0" t="0"/>
-            <wp:docPr descr="" title="" id="48" name="Picture"/>
+            <wp:docPr descr="" title="" id="51" name="Picture"/>
             <a:graphic>
               <a:graphicData uri="http://schemas.openxmlformats.org/drawingml/2006/picture">
                 <pic:pic>
                   <pic:nvPicPr>
-                    <pic:cNvPr descr="confusion_matrix_v12.pdf" id="49" name="Picture"/>
+                    <pic:cNvPr descr="confusion_matrix_v12.pdf" id="52" name="Picture"/>
                     <pic:cNvPicPr>
                       <a:picLocks noChangeArrowheads="1" noChangeAspect="1"/>
                     </pic:cNvPicPr>
                   </pic:nvPicPr>
                   <pic:blipFill>
-                    <a:blip r:embed="rId47"/>
+                    <a:blip r:embed="rId50"/>
                     <a:stretch>
                       <a:fillRect/>
                     </a:stretch>
@@ -5399,7 +5361,7 @@
         <w:t xml:space="preserve">is exactly zero.</w:t>
       </w:r>
     </w:p>
-    <w:bookmarkEnd w:id="50"/>
+    <w:bookmarkEnd w:id="53"/>
     <w:p>
       <w:pPr>
         <w:pStyle w:val="BodyText"/>
@@ -5623,8 +5585,8 @@
         <w:t xml:space="preserve">high-frequency shortcut that previously caused Cernic–confuser confusion.</w:t>
       </w:r>
     </w:p>
-    <w:bookmarkEnd w:id="51"/>
-    <w:bookmarkStart w:id="52" w:name="field-deployment."/>
+    <w:bookmarkEnd w:id="54"/>
+    <w:bookmarkStart w:id="55" w:name="field-deployment."/>
     <w:p>
       <w:pPr>
         <w:pStyle w:val="Heading4"/>
@@ -5786,8 +5748,8 @@
         <w:t xml:space="preserve">all stations have been processed.</w:t>
       </w:r>
     </w:p>
-    <w:bookmarkEnd w:id="52"/>
-    <w:bookmarkStart w:id="53" w:name="Xfd7e2a660e56df99e009fb7f8d0a1a9ea97b8e1"/>
+    <w:bookmarkEnd w:id="55"/>
+    <w:bookmarkStart w:id="56" w:name="Xfd7e2a660e56df99e009fb7f8d0a1a9ea97b8e1"/>
     <w:p>
       <w:pPr>
         <w:pStyle w:val="Heading4"/>
@@ -6037,9 +5999,9 @@
         <w:t xml:space="preserve">deployed across all stations.</w:t>
       </w:r>
     </w:p>
-    <w:bookmarkEnd w:id="53"/>
-    <w:bookmarkEnd w:id="54"/>
-    <w:bookmarkStart w:id="55" w:name="limitations"/>
+    <w:bookmarkEnd w:id="56"/>
+    <w:bookmarkEnd w:id="57"/>
+    <w:bookmarkStart w:id="58" w:name="limitations"/>
     <w:p>
       <w:pPr>
         <w:pStyle w:val="Heading1"/>
@@ -6502,8 +6464,8 @@
         <w:t xml:space="preserve">assumptions.</w:t>
       </w:r>
     </w:p>
-    <w:bookmarkEnd w:id="55"/>
-    <w:bookmarkStart w:id="56" w:name="ethics-statements"/>
+    <w:bookmarkEnd w:id="58"/>
+    <w:bookmarkStart w:id="59" w:name="ethics-statements"/>
     <w:p>
       <w:pPr>
         <w:pStyle w:val="Heading1"/>
@@ -6556,8 +6518,8 @@
         <w:t xml:space="preserve">guidelines for non-invasive field research.]</w:t>
       </w:r>
     </w:p>
-    <w:bookmarkEnd w:id="56"/>
-    <w:bookmarkStart w:id="57" w:name="credit-author-statement"/>
+    <w:bookmarkEnd w:id="59"/>
+    <w:bookmarkStart w:id="60" w:name="credit-author-statement"/>
     <w:p>
       <w:pPr>
         <w:pStyle w:val="Heading1"/>
@@ -6612,8 +6574,8 @@
         <w:t xml:space="preserve">editing, Funding acquisition].</w:t>
       </w:r>
     </w:p>
-    <w:bookmarkEnd w:id="57"/>
-    <w:bookmarkStart w:id="58" w:name="acknowledgments"/>
+    <w:bookmarkEnd w:id="60"/>
+    <w:bookmarkStart w:id="61" w:name="acknowledgments"/>
     <w:p>
       <w:pPr>
         <w:pStyle w:val="Heading1"/>
@@ -6648,8 +6610,8 @@
         <w:t xml:space="preserve">commercial, or not-for-profit sectors.</w:t>
       </w:r>
     </w:p>
-    <w:bookmarkEnd w:id="58"/>
-    <w:bookmarkStart w:id="59" w:name="declaration-of-interests"/>
+    <w:bookmarkEnd w:id="61"/>
+    <w:bookmarkStart w:id="62" w:name="declaration-of-interests"/>
     <w:p>
       <w:pPr>
         <w:pStyle w:val="Heading1"/>
@@ -6714,8 +6676,8 @@
         <w:t xml:space="preserve">competing interests:</w:t>
       </w:r>
     </w:p>
-    <w:bookmarkEnd w:id="59"/>
-    <w:bookmarkStart w:id="60" w:name="data-availability"/>
+    <w:bookmarkEnd w:id="62"/>
+    <w:bookmarkStart w:id="63" w:name="data-availability"/>
     <w:p>
       <w:pPr>
         <w:pStyle w:val="Heading1"/>
@@ -6734,7 +6696,7 @@
       <w:r>
         <w:t xml:space="preserve"> </w:t>
       </w:r>
-      <w:hyperlink r:id="rId11">
+      <w:hyperlink r:id="rId14">
         <w:r>
           <w:rPr>
             <w:rStyle w:val="Hyperlink"/>
@@ -6791,8 +6753,8 @@
         <w:t xml:space="preserve">.]</w:t>
       </w:r>
     </w:p>
-    <w:bookmarkEnd w:id="60"/>
-    <w:bookmarkStart w:id="70" w:name="Xcca0bcaed302a7900b6627b02d68ebe31e9e060"/>
+    <w:bookmarkEnd w:id="63"/>
+    <w:bookmarkStart w:id="73" w:name="Xcca0bcaed302a7900b6627b02d68ebe31e9e060"/>
     <w:p>
       <w:pPr>
         <w:pStyle w:val="Heading1"/>
@@ -6845,7 +6807,7 @@
       <w:r>
         <w:t xml:space="preserve"> </w:t>
       </w:r>
-      <w:hyperlink r:id="rId61">
+      <w:hyperlink r:id="rId64">
         <w:r>
           <w:rPr>
             <w:rStyle w:val="Hyperlink"/>
@@ -6876,7 +6838,7 @@
       <w:r>
         <w:t xml:space="preserve"> </w:t>
       </w:r>
-      <w:hyperlink r:id="rId62">
+      <w:hyperlink r:id="rId65">
         <w:r>
           <w:rPr>
             <w:rStyle w:val="Hyperlink"/>
@@ -6907,7 +6869,7 @@
       <w:r>
         <w:t xml:space="preserve"> </w:t>
       </w:r>
-      <w:hyperlink r:id="rId63">
+      <w:hyperlink r:id="rId66">
         <w:r>
           <w:rPr>
             <w:rStyle w:val="Hyperlink"/>
@@ -6938,7 +6900,7 @@
       <w:r>
         <w:t xml:space="preserve"> </w:t>
       </w:r>
-      <w:hyperlink r:id="rId64">
+      <w:hyperlink r:id="rId67">
         <w:r>
           <w:rPr>
             <w:rStyle w:val="Hyperlink"/>
@@ -6975,7 +6937,7 @@
       <w:r>
         <w:t xml:space="preserve"> </w:t>
       </w:r>
-      <w:hyperlink r:id="rId65">
+      <w:hyperlink r:id="rId68">
         <w:r>
           <w:rPr>
             <w:rStyle w:val="Hyperlink"/>
@@ -7018,7 +6980,7 @@
       <w:r>
         <w:t xml:space="preserve"> </w:t>
       </w:r>
-      <w:hyperlink r:id="rId66">
+      <w:hyperlink r:id="rId69">
         <w:r>
           <w:rPr>
             <w:rStyle w:val="Hyperlink"/>
@@ -7049,7 +7011,7 @@
       <w:r>
         <w:t xml:space="preserve"> </w:t>
       </w:r>
-      <w:hyperlink r:id="rId67">
+      <w:hyperlink r:id="rId70">
         <w:r>
           <w:rPr>
             <w:rStyle w:val="Hyperlink"/>
@@ -7086,7 +7048,7 @@
       <w:r>
         <w:t xml:space="preserve"> </w:t>
       </w:r>
-      <w:hyperlink r:id="rId68">
+      <w:hyperlink r:id="rId71">
         <w:r>
           <w:rPr>
             <w:rStyle w:val="Hyperlink"/>
@@ -7117,7 +7079,7 @@
       <w:r>
         <w:t xml:space="preserve"> </w:t>
       </w:r>
-      <w:hyperlink r:id="rId69">
+      <w:hyperlink r:id="rId72">
         <w:r>
           <w:rPr>
             <w:rStyle w:val="Hyperlink"/>
@@ -7126,7 +7088,7 @@
         </w:r>
       </w:hyperlink>
     </w:p>
-    <w:bookmarkEnd w:id="70"/>
+    <w:bookmarkEnd w:id="73"/>
     <w:sectPr>
       <w:footnotePr>
         <w:numRestart w:val="eachSect"/>

</xml_diff>

<commit_message>
Graphical abstract: follow spec (separate file, not in body)
Per the MethodsX requirement and the published examples (which show no
graphical-abstract section in the PDF body), reduce the section to a note
that the graphical abstract is provided as a separate file. The
graphical_abstract.pdf is kept in paper/ as the separate-upload deliverable.

https://claude.ai/code/session_01GRhKW3iKJjm2wYYeUd56Hq
</commit_message>
<xml_diff>
--- a/paper/methodsx_manuscript.docx
+++ b/paper/methodsx_manuscript.docx
@@ -285,7 +285,7 @@
       </w:r>
     </w:p>
     <w:bookmarkEnd w:id="9"/>
-    <w:bookmarkStart w:id="13" w:name="graphical-abstract"/>
+    <w:bookmarkStart w:id="10" w:name="graphical-abstract"/>
     <w:p>
       <w:pPr>
         <w:pStyle w:val="Heading1"/>
@@ -299,76 +299,11 @@
         <w:pStyle w:val="FirstParagraph"/>
       </w:pPr>
       <w:r>
-        <w:drawing>
-          <wp:inline>
-            <wp:extent cx="5334000" cy="2131368"/>
-            <wp:effectExtent b="0" l="0" r="0" t="0"/>
-            <wp:docPr descr="image" title="" id="11" name="Picture"/>
-            <a:graphic>
-              <a:graphicData uri="http://schemas.openxmlformats.org/drawingml/2006/picture">
-                <pic:pic>
-                  <pic:nvPicPr>
-                    <pic:cNvPr descr="graphical_abstract.pdf" id="12" name="Picture"/>
-                    <pic:cNvPicPr>
-                      <a:picLocks noChangeArrowheads="1" noChangeAspect="1"/>
-                    </pic:cNvPicPr>
-                  </pic:nvPicPr>
-                  <pic:blipFill>
-                    <a:blip r:embed="rId10"/>
-                    <a:stretch>
-                      <a:fillRect/>
-                    </a:stretch>
-                  </pic:blipFill>
-                  <pic:spPr bwMode="auto">
-                    <a:xfrm>
-                      <a:off x="0" y="0"/>
-                      <a:ext cx="5334000" cy="2131368"/>
-                    </a:xfrm>
-                    <a:prstGeom prst="rect">
-                      <a:avLst/>
-                    </a:prstGeom>
-                    <a:noFill/>
-                    <a:ln w="9525">
-                      <a:noFill/>
-                      <a:headEnd/>
-                      <a:tailEnd/>
-                    </a:ln>
-                  </pic:spPr>
-                </pic:pic>
-              </a:graphicData>
-            </a:graphic>
-          </wp:inline>
-        </w:drawing>
-      </w:r>
-    </w:p>
-    <w:p>
-      <w:pPr>
-        <w:pStyle w:val="BodyText"/>
-      </w:pPr>
-      <w:r>
-        <w:rPr>
-          <w:i/>
-          <w:iCs/>
-        </w:rPr>
-        <w:t xml:space="preserve">(Also submitted as a separate image file, per the MethodsX</w:t>
-      </w:r>
-      <w:r>
-        <w:rPr>
-          <w:i/>
-          <w:iCs/>
-        </w:rPr>
-        <w:t xml:space="preserve"> </w:t>
-      </w:r>
-      <w:r>
-        <w:rPr>
-          <w:i/>
-          <w:iCs/>
-        </w:rPr>
-        <w:t xml:space="preserve">graphical-abstract requirements.)</w:t>
-      </w:r>
-    </w:p>
-    <w:bookmarkEnd w:id="13"/>
-    <w:bookmarkStart w:id="15" w:name="specifications-table"/>
+        <w:t xml:space="preserve">Provided as a separate image file, per the MethodsX submission requirements.</w:t>
+      </w:r>
+    </w:p>
+    <w:bookmarkEnd w:id="10"/>
+    <w:bookmarkStart w:id="12" w:name="specifications-table"/>
     <w:p>
       <w:pPr>
         <w:pStyle w:val="Heading1"/>
@@ -580,7 +515,7 @@
             <w:r>
               <w:t xml:space="preserve"> </w:t>
             </w:r>
-            <w:hyperlink r:id="rId14">
+            <w:hyperlink r:id="rId11">
               <w:r>
                 <w:rPr>
                   <w:rStyle w:val="Hyperlink"/>
@@ -613,8 +548,8 @@
         </w:tc>
       </w:tr>
     </w:tbl>
-    <w:bookmarkEnd w:id="15"/>
-    <w:bookmarkStart w:id="16" w:name="background"/>
+    <w:bookmarkEnd w:id="12"/>
+    <w:bookmarkStart w:id="13" w:name="background"/>
     <w:p>
       <w:pPr>
         <w:pStyle w:val="Heading1"/>
@@ -918,8 +853,8 @@
         <w:t xml:space="preserve">new reference clips and editing a single configuration file.</w:t>
       </w:r>
     </w:p>
-    <w:bookmarkEnd w:id="16"/>
-    <w:bookmarkStart w:id="43" w:name="method-details"/>
+    <w:bookmarkEnd w:id="13"/>
+    <w:bookmarkStart w:id="40" w:name="method-details"/>
     <w:p>
       <w:pPr>
         <w:pStyle w:val="Heading1"/>
@@ -1025,7 +960,7 @@
         <w:t xml:space="preserve">code.</w:t>
       </w:r>
     </w:p>
-    <w:bookmarkStart w:id="18" w:name="Xba94fc53b659dddb044208ab9692b361fd2e00f"/>
+    <w:bookmarkStart w:id="15" w:name="Xba94fc53b659dddb044208ab9692b361fd2e00f"/>
     <w:p>
       <w:pPr>
         <w:pStyle w:val="Heading2"/>
@@ -1360,7 +1295,7 @@
         <w:t xml:space="preserve">misclassified clips recycled through the hard-negative mining loop.</w:t>
       </w:r>
     </w:p>
-    <w:bookmarkStart w:id="17" w:name="tab:traindata"/>
+    <w:bookmarkStart w:id="14" w:name="tab:traindata"/>
     <w:p>
       <w:pPr>
         <w:pStyle w:val="TableCaption"/>
@@ -1669,7 +1604,7 @@
         </w:tc>
       </w:tr>
     </w:tbl>
-    <w:bookmarkEnd w:id="17"/>
+    <w:bookmarkEnd w:id="14"/>
     <w:p>
       <w:pPr>
         <w:pStyle w:val="BodyText"/>
@@ -1785,8 +1720,8 @@
         <w:t xml:space="preserve">hashing before training.</w:t>
       </w:r>
     </w:p>
-    <w:bookmarkEnd w:id="18"/>
-    <w:bookmarkStart w:id="19" w:name="Xe4b4dadc612911fc6b270728495411981661639"/>
+    <w:bookmarkEnd w:id="15"/>
+    <w:bookmarkStart w:id="16" w:name="Xe4b4dadc612911fc6b270728495411981661639"/>
     <w:p>
       <w:pPr>
         <w:pStyle w:val="Heading2"/>
@@ -1933,8 +1868,8 @@
         <w:t xml:space="preserve">two feature distributions comparable.</w:t>
       </w:r>
     </w:p>
-    <w:bookmarkEnd w:id="19"/>
-    <w:bookmarkStart w:id="25" w:name="data-augmentation"/>
+    <w:bookmarkEnd w:id="16"/>
+    <w:bookmarkStart w:id="22" w:name="data-augmentation"/>
     <w:p>
       <w:pPr>
         <w:pStyle w:val="Heading2"/>
@@ -2079,7 +2014,7 @@
         <w:t xml:space="preserve">.</w:t>
       </w:r>
     </w:p>
-    <w:bookmarkStart w:id="24" w:name="X877d4525f2ce6283914e1771e5b4ee23a60ca6f"/>
+    <w:bookmarkStart w:id="21" w:name="X877d4525f2ce6283914e1771e5b4ee23a60ca6f"/>
     <w:p>
       <w:pPr>
         <w:pStyle w:val="Heading4"/>
@@ -2278,7 +2213,7 @@
         <w:t xml:space="preserve">frequencies and must keep their high band intact.</w:t>
       </w:r>
     </w:p>
-    <w:bookmarkStart w:id="23" w:name="fig:augmentation"/>
+    <w:bookmarkStart w:id="20" w:name="fig:augmentation"/>
     <w:p>
       <w:pPr>
         <w:pStyle w:val="CaptionedFigure"/>
@@ -2288,18 +2223,18 @@
           <wp:inline>
             <wp:extent cx="5334000" cy="3518170"/>
             <wp:effectExtent b="0" l="0" r="0" t="0"/>
-            <wp:docPr descr="" title="" id="21" name="Picture"/>
+            <wp:docPr descr="" title="" id="18" name="Picture"/>
             <a:graphic>
               <a:graphicData uri="http://schemas.openxmlformats.org/drawingml/2006/picture">
                 <pic:pic>
                   <pic:nvPicPr>
-                    <pic:cNvPr descr="augmentation_v12.pdf" id="22" name="Picture"/>
+                    <pic:cNvPr descr="augmentation_v12.pdf" id="19" name="Picture"/>
                     <pic:cNvPicPr>
                       <a:picLocks noChangeArrowheads="1" noChangeAspect="1"/>
                     </pic:cNvPicPr>
                   </pic:nvPicPr>
                   <pic:blipFill>
-                    <a:blip r:embed="rId20"/>
+                    <a:blip r:embed="rId17"/>
                     <a:stretch>
                       <a:fillRect/>
                     </a:stretch>
@@ -2430,10 +2365,10 @@
         <w:t xml:space="preserve">label.</w:t>
       </w:r>
     </w:p>
-    <w:bookmarkEnd w:id="23"/>
-    <w:bookmarkEnd w:id="24"/>
-    <w:bookmarkEnd w:id="25"/>
-    <w:bookmarkStart w:id="31" w:name="model-architecture"/>
+    <w:bookmarkEnd w:id="20"/>
+    <w:bookmarkEnd w:id="21"/>
+    <w:bookmarkEnd w:id="22"/>
+    <w:bookmarkStart w:id="28" w:name="model-architecture"/>
     <w:p>
       <w:pPr>
         <w:pStyle w:val="Heading2"/>
@@ -2608,7 +2543,7 @@
         <w:t xml:space="preserve"> 28, 512 channels) is extracted before the final VGG19 block.</w:t>
       </w:r>
     </w:p>
-    <w:bookmarkStart w:id="30" w:name="frequency-position-encoding."/>
+    <w:bookmarkStart w:id="27" w:name="frequency-position-encoding."/>
     <w:p>
       <w:pPr>
         <w:pStyle w:val="Heading4"/>
@@ -2989,7 +2924,7 @@
         <w:t xml:space="preserve">Colobus_confuser, Background).</w:t>
       </w:r>
     </w:p>
-    <w:bookmarkStart w:id="29" w:name="fig:architecture"/>
+    <w:bookmarkStart w:id="26" w:name="fig:architecture"/>
     <w:p>
       <w:pPr>
         <w:pStyle w:val="CaptionedFigure"/>
@@ -2999,18 +2934,18 @@
           <wp:inline>
             <wp:extent cx="3840480" cy="4973121"/>
             <wp:effectExtent b="0" l="0" r="0" t="0"/>
-            <wp:docPr descr="" title="" id="27" name="Picture"/>
+            <wp:docPr descr="" title="" id="24" name="Picture"/>
             <a:graphic>
               <a:graphicData uri="http://schemas.openxmlformats.org/drawingml/2006/picture">
                 <pic:pic>
                   <pic:nvPicPr>
-                    <pic:cNvPr descr="model_architecture_v12.pdf" id="28" name="Picture"/>
+                    <pic:cNvPr descr="model_architecture_v12.pdf" id="25" name="Picture"/>
                     <pic:cNvPicPr>
                       <a:picLocks noChangeArrowheads="1" noChangeAspect="1"/>
                     </pic:cNvPicPr>
                   </pic:nvPicPr>
                   <pic:blipFill>
-                    <a:blip r:embed="rId26"/>
+                    <a:blip r:embed="rId23"/>
                     <a:stretch>
                       <a:fillRect/>
                     </a:stretch>
@@ -3103,10 +3038,10 @@
         <w:t xml:space="preserve">the right.</w:t>
       </w:r>
     </w:p>
-    <w:bookmarkEnd w:id="29"/>
-    <w:bookmarkEnd w:id="30"/>
-    <w:bookmarkEnd w:id="31"/>
-    <w:bookmarkStart w:id="35" w:name="model-training"/>
+    <w:bookmarkEnd w:id="26"/>
+    <w:bookmarkEnd w:id="27"/>
+    <w:bookmarkEnd w:id="28"/>
+    <w:bookmarkStart w:id="32" w:name="model-training"/>
     <w:p>
       <w:pPr>
         <w:pStyle w:val="Heading2"/>
@@ -3129,7 +3064,7 @@
         <w:t xml:space="preserve">protocol of head training followed by partial fine-tuning.</w:t>
       </w:r>
     </w:p>
-    <w:bookmarkStart w:id="32" w:name="stage-1-head-training."/>
+    <w:bookmarkStart w:id="29" w:name="stage-1-head-training."/>
     <w:p>
       <w:pPr>
         <w:pStyle w:val="Heading4"/>
@@ -3187,8 +3122,8 @@
         <w:t xml:space="preserve">, and the loss is sparse categorical cross-entropy.</w:t>
       </w:r>
     </w:p>
-    <w:bookmarkEnd w:id="32"/>
-    <w:bookmarkStart w:id="33" w:name="stage-2-partial-fine-tuning."/>
+    <w:bookmarkEnd w:id="29"/>
+    <w:bookmarkStart w:id="30" w:name="stage-2-partial-fine-tuning."/>
     <w:p>
       <w:pPr>
         <w:pStyle w:val="Heading4"/>
@@ -3293,8 +3228,8 @@
         <w:t xml:space="preserve">forgetting.</w:t>
       </w:r>
     </w:p>
-    <w:bookmarkEnd w:id="33"/>
-    <w:bookmarkStart w:id="34" w:name="shared-training-settings."/>
+    <w:bookmarkEnd w:id="30"/>
+    <w:bookmarkStart w:id="31" w:name="shared-training-settings."/>
     <w:p>
       <w:pPr>
         <w:pStyle w:val="Heading4"/>
@@ -3400,9 +3335,9 @@
         <w:t xml:space="preserve">per-class accuracy report and a confusion matrix on the validation set.</w:t>
       </w:r>
     </w:p>
-    <w:bookmarkEnd w:id="34"/>
-    <w:bookmarkEnd w:id="35"/>
-    <w:bookmarkStart w:id="37" w:name="sliding-window-detection"/>
+    <w:bookmarkEnd w:id="31"/>
+    <w:bookmarkEnd w:id="32"/>
+    <w:bookmarkStart w:id="34" w:name="sliding-window-detection"/>
     <w:p>
       <w:pPr>
         <w:pStyle w:val="Heading2"/>
@@ -3560,7 +3495,7 @@
         <w:t xml:space="preserve">non-maximum suppression at an intersection-over-union threshold of 0.5.</w:t>
       </w:r>
     </w:p>
-    <w:bookmarkStart w:id="36" w:name="low-frequency-energy-gate-for-colobus."/>
+    <w:bookmarkStart w:id="33" w:name="low-frequency-energy-gate-for-colobus."/>
     <w:p>
       <w:pPr>
         <w:pStyle w:val="Heading4"/>
@@ -3752,9 +3687,9 @@
         <w:t xml:space="preserve">review and downstream filtering do not require re-reading the long recordings.</w:t>
       </w:r>
     </w:p>
-    <w:bookmarkEnd w:id="36"/>
-    <w:bookmarkEnd w:id="37"/>
-    <w:bookmarkStart w:id="41" w:name="automatic-false-positive-cleanup"/>
+    <w:bookmarkEnd w:id="33"/>
+    <w:bookmarkEnd w:id="34"/>
+    <w:bookmarkStart w:id="38" w:name="automatic-false-positive-cleanup"/>
     <w:p>
       <w:pPr>
         <w:pStyle w:val="Heading2"/>
@@ -3795,7 +3730,7 @@
         <w:t xml:space="preserve">source recording.</w:t>
       </w:r>
     </w:p>
-    <w:bookmarkStart w:id="38" w:name="a-mahalanobis-out-of-distribution-filter"/>
+    <w:bookmarkStart w:id="35" w:name="a-mahalanobis-out-of-distribution-filter"/>
     <w:p>
       <w:pPr>
         <w:pStyle w:val="Heading4"/>
@@ -3891,8 +3826,8 @@
         <w:t xml:space="preserve">relative-outlier detector that is robust to the train-to-field domain shift.</w:t>
       </w:r>
     </w:p>
-    <w:bookmarkEnd w:id="38"/>
-    <w:bookmarkStart w:id="39" w:name="b-yamnet-cross-check"/>
+    <w:bookmarkEnd w:id="35"/>
+    <w:bookmarkStart w:id="36" w:name="b-yamnet-cross-check"/>
     <w:p>
       <w:pPr>
         <w:pStyle w:val="Heading4"/>
@@ -3988,8 +3923,8 @@
         <w:t xml:space="preserve">confirm primates.</w:t>
       </w:r>
     </w:p>
-    <w:bookmarkEnd w:id="39"/>
-    <w:bookmarkStart w:id="40" w:name="c-temporal-isolation-filter"/>
+    <w:bookmarkEnd w:id="36"/>
+    <w:bookmarkStart w:id="37" w:name="c-temporal-isolation-filter"/>
     <w:p>
       <w:pPr>
         <w:pStyle w:val="Heading4"/>
@@ -4120,9 +4055,9 @@
         <w:t xml:space="preserve">exported as labelled WAV clips for the next stage.</w:t>
       </w:r>
     </w:p>
-    <w:bookmarkEnd w:id="40"/>
-    <w:bookmarkEnd w:id="41"/>
-    <w:bookmarkStart w:id="42" w:name="iterative-hard-negative-mining"/>
+    <w:bookmarkEnd w:id="37"/>
+    <w:bookmarkEnd w:id="38"/>
+    <w:bookmarkStart w:id="39" w:name="iterative-hard-negative-mining"/>
     <w:p>
       <w:pPr>
         <w:pStyle w:val="Heading2"/>
@@ -4304,9 +4239,9 @@
         <w:t xml:space="preserve">source recordings have been deleted to save storage.</w:t>
       </w:r>
     </w:p>
-    <w:bookmarkEnd w:id="42"/>
-    <w:bookmarkEnd w:id="43"/>
-    <w:bookmarkStart w:id="57" w:name="method-validation"/>
+    <w:bookmarkEnd w:id="39"/>
+    <w:bookmarkEnd w:id="40"/>
+    <w:bookmarkStart w:id="54" w:name="method-validation"/>
     <w:p>
       <w:pPr>
         <w:pStyle w:val="Heading1"/>
@@ -4357,7 +4292,7 @@
         <w:t xml:space="preserve">false-positive rate.</w:t>
       </w:r>
     </w:p>
-    <w:bookmarkStart w:id="54" w:name="validation-set-performance-v12-model."/>
+    <w:bookmarkStart w:id="51" w:name="validation-set-performance-v12-model."/>
     <w:p>
       <w:pPr>
         <w:pStyle w:val="Heading4"/>
@@ -4467,7 +4402,7 @@
         <w:t xml:space="preserve">gives the full confusion matrix.</w:t>
       </w:r>
     </w:p>
-    <w:bookmarkStart w:id="47" w:name="fig:training"/>
+    <w:bookmarkStart w:id="44" w:name="fig:training"/>
     <w:p>
       <w:pPr>
         <w:pStyle w:val="CaptionedFigure"/>
@@ -4477,18 +4412,18 @@
           <wp:inline>
             <wp:extent cx="5334000" cy="2115910"/>
             <wp:effectExtent b="0" l="0" r="0" t="0"/>
-            <wp:docPr descr="" title="" id="45" name="Picture"/>
+            <wp:docPr descr="" title="" id="42" name="Picture"/>
             <a:graphic>
               <a:graphicData uri="http://schemas.openxmlformats.org/drawingml/2006/picture">
                 <pic:pic>
                   <pic:nvPicPr>
-                    <pic:cNvPr descr="training_curves_v12.pdf" id="46" name="Picture"/>
+                    <pic:cNvPr descr="training_curves_v12.pdf" id="43" name="Picture"/>
                     <pic:cNvPicPr>
                       <a:picLocks noChangeArrowheads="1" noChangeAspect="1"/>
                     </pic:cNvPicPr>
                   </pic:nvPicPr>
                   <pic:blipFill>
-                    <a:blip r:embed="rId44"/>
+                    <a:blip r:embed="rId41"/>
                     <a:stretch>
                       <a:fillRect/>
                     </a:stretch>
@@ -4547,8 +4482,8 @@
         <w:t xml:space="preserve">checkpoint (98.12 %).</w:t>
       </w:r>
     </w:p>
-    <w:bookmarkEnd w:id="47"/>
-    <w:bookmarkStart w:id="48" w:name="tab:val"/>
+    <w:bookmarkEnd w:id="44"/>
+    <w:bookmarkStart w:id="45" w:name="tab:val"/>
     <w:p>
       <w:pPr>
         <w:pStyle w:val="TableCaption"/>
@@ -4892,8 +4827,8 @@
         </w:tc>
       </w:tr>
     </w:tbl>
-    <w:bookmarkEnd w:id="48"/>
-    <w:bookmarkStart w:id="49" w:name="tab:confusion"/>
+    <w:bookmarkEnd w:id="45"/>
+    <w:bookmarkStart w:id="46" w:name="tab:confusion"/>
     <w:p>
       <w:pPr>
         <w:pStyle w:val="TableCaption"/>
@@ -5259,8 +5194,8 @@
         </w:tc>
       </w:tr>
     </w:tbl>
-    <w:bookmarkEnd w:id="49"/>
-    <w:bookmarkStart w:id="53" w:name="fig:confusion"/>
+    <w:bookmarkEnd w:id="46"/>
+    <w:bookmarkStart w:id="50" w:name="fig:confusion"/>
     <w:p>
       <w:pPr>
         <w:pStyle w:val="CaptionedFigure"/>
@@ -5270,18 +5205,18 @@
           <wp:inline>
             <wp:extent cx="3467100" cy="2929699"/>
             <wp:effectExtent b="0" l="0" r="0" t="0"/>
-            <wp:docPr descr="" title="" id="51" name="Picture"/>
+            <wp:docPr descr="" title="" id="48" name="Picture"/>
             <a:graphic>
               <a:graphicData uri="http://schemas.openxmlformats.org/drawingml/2006/picture">
                 <pic:pic>
                   <pic:nvPicPr>
-                    <pic:cNvPr descr="confusion_matrix_v12.pdf" id="52" name="Picture"/>
+                    <pic:cNvPr descr="confusion_matrix_v12.pdf" id="49" name="Picture"/>
                     <pic:cNvPicPr>
                       <a:picLocks noChangeArrowheads="1" noChangeAspect="1"/>
                     </pic:cNvPicPr>
                   </pic:nvPicPr>
                   <pic:blipFill>
-                    <a:blip r:embed="rId50"/>
+                    <a:blip r:embed="rId47"/>
                     <a:stretch>
                       <a:fillRect/>
                     </a:stretch>
@@ -5361,7 +5296,7 @@
         <w:t xml:space="preserve">is exactly zero.</w:t>
       </w:r>
     </w:p>
-    <w:bookmarkEnd w:id="53"/>
+    <w:bookmarkEnd w:id="50"/>
     <w:p>
       <w:pPr>
         <w:pStyle w:val="BodyText"/>
@@ -5585,8 +5520,8 @@
         <w:t xml:space="preserve">high-frequency shortcut that previously caused Cernic–confuser confusion.</w:t>
       </w:r>
     </w:p>
-    <w:bookmarkEnd w:id="54"/>
-    <w:bookmarkStart w:id="55" w:name="field-deployment."/>
+    <w:bookmarkEnd w:id="51"/>
+    <w:bookmarkStart w:id="52" w:name="field-deployment."/>
     <w:p>
       <w:pPr>
         <w:pStyle w:val="Heading4"/>
@@ -5748,8 +5683,8 @@
         <w:t xml:space="preserve">all stations have been processed.</w:t>
       </w:r>
     </w:p>
-    <w:bookmarkEnd w:id="55"/>
-    <w:bookmarkStart w:id="56" w:name="Xfd7e2a660e56df99e009fb7f8d0a1a9ea97b8e1"/>
+    <w:bookmarkEnd w:id="52"/>
+    <w:bookmarkStart w:id="53" w:name="Xfd7e2a660e56df99e009fb7f8d0a1a9ea97b8e1"/>
     <w:p>
       <w:pPr>
         <w:pStyle w:val="Heading4"/>
@@ -5999,9 +5934,9 @@
         <w:t xml:space="preserve">deployed across all stations.</w:t>
       </w:r>
     </w:p>
-    <w:bookmarkEnd w:id="56"/>
-    <w:bookmarkEnd w:id="57"/>
-    <w:bookmarkStart w:id="58" w:name="limitations"/>
+    <w:bookmarkEnd w:id="53"/>
+    <w:bookmarkEnd w:id="54"/>
+    <w:bookmarkStart w:id="55" w:name="limitations"/>
     <w:p>
       <w:pPr>
         <w:pStyle w:val="Heading1"/>
@@ -6464,8 +6399,8 @@
         <w:t xml:space="preserve">assumptions.</w:t>
       </w:r>
     </w:p>
-    <w:bookmarkEnd w:id="58"/>
-    <w:bookmarkStart w:id="59" w:name="ethics-statements"/>
+    <w:bookmarkEnd w:id="55"/>
+    <w:bookmarkStart w:id="56" w:name="ethics-statements"/>
     <w:p>
       <w:pPr>
         <w:pStyle w:val="Heading1"/>
@@ -6518,8 +6453,8 @@
         <w:t xml:space="preserve">guidelines for non-invasive field research.]</w:t>
       </w:r>
     </w:p>
-    <w:bookmarkEnd w:id="59"/>
-    <w:bookmarkStart w:id="60" w:name="credit-author-statement"/>
+    <w:bookmarkEnd w:id="56"/>
+    <w:bookmarkStart w:id="57" w:name="credit-author-statement"/>
     <w:p>
       <w:pPr>
         <w:pStyle w:val="Heading1"/>
@@ -6574,8 +6509,8 @@
         <w:t xml:space="preserve">editing, Funding acquisition].</w:t>
       </w:r>
     </w:p>
-    <w:bookmarkEnd w:id="60"/>
-    <w:bookmarkStart w:id="61" w:name="acknowledgments"/>
+    <w:bookmarkEnd w:id="57"/>
+    <w:bookmarkStart w:id="58" w:name="acknowledgments"/>
     <w:p>
       <w:pPr>
         <w:pStyle w:val="Heading1"/>
@@ -6610,8 +6545,8 @@
         <w:t xml:space="preserve">commercial, or not-for-profit sectors.</w:t>
       </w:r>
     </w:p>
-    <w:bookmarkEnd w:id="61"/>
-    <w:bookmarkStart w:id="62" w:name="declaration-of-interests"/>
+    <w:bookmarkEnd w:id="58"/>
+    <w:bookmarkStart w:id="59" w:name="declaration-of-interests"/>
     <w:p>
       <w:pPr>
         <w:pStyle w:val="Heading1"/>
@@ -6676,8 +6611,8 @@
         <w:t xml:space="preserve">competing interests:</w:t>
       </w:r>
     </w:p>
-    <w:bookmarkEnd w:id="62"/>
-    <w:bookmarkStart w:id="63" w:name="data-availability"/>
+    <w:bookmarkEnd w:id="59"/>
+    <w:bookmarkStart w:id="60" w:name="data-availability"/>
     <w:p>
       <w:pPr>
         <w:pStyle w:val="Heading1"/>
@@ -6696,7 +6631,7 @@
       <w:r>
         <w:t xml:space="preserve"> </w:t>
       </w:r>
-      <w:hyperlink r:id="rId14">
+      <w:hyperlink r:id="rId11">
         <w:r>
           <w:rPr>
             <w:rStyle w:val="Hyperlink"/>
@@ -6753,8 +6688,8 @@
         <w:t xml:space="preserve">.]</w:t>
       </w:r>
     </w:p>
-    <w:bookmarkEnd w:id="63"/>
-    <w:bookmarkStart w:id="73" w:name="Xcca0bcaed302a7900b6627b02d68ebe31e9e060"/>
+    <w:bookmarkEnd w:id="60"/>
+    <w:bookmarkStart w:id="70" w:name="Xcca0bcaed302a7900b6627b02d68ebe31e9e060"/>
     <w:p>
       <w:pPr>
         <w:pStyle w:val="Heading1"/>
@@ -6807,7 +6742,7 @@
       <w:r>
         <w:t xml:space="preserve"> </w:t>
       </w:r>
-      <w:hyperlink r:id="rId64">
+      <w:hyperlink r:id="rId61">
         <w:r>
           <w:rPr>
             <w:rStyle w:val="Hyperlink"/>
@@ -6838,7 +6773,7 @@
       <w:r>
         <w:t xml:space="preserve"> </w:t>
       </w:r>
-      <w:hyperlink r:id="rId65">
+      <w:hyperlink r:id="rId62">
         <w:r>
           <w:rPr>
             <w:rStyle w:val="Hyperlink"/>
@@ -6869,7 +6804,7 @@
       <w:r>
         <w:t xml:space="preserve"> </w:t>
       </w:r>
-      <w:hyperlink r:id="rId66">
+      <w:hyperlink r:id="rId63">
         <w:r>
           <w:rPr>
             <w:rStyle w:val="Hyperlink"/>
@@ -6900,7 +6835,7 @@
       <w:r>
         <w:t xml:space="preserve"> </w:t>
       </w:r>
-      <w:hyperlink r:id="rId67">
+      <w:hyperlink r:id="rId64">
         <w:r>
           <w:rPr>
             <w:rStyle w:val="Hyperlink"/>
@@ -6937,7 +6872,7 @@
       <w:r>
         <w:t xml:space="preserve"> </w:t>
       </w:r>
-      <w:hyperlink r:id="rId68">
+      <w:hyperlink r:id="rId65">
         <w:r>
           <w:rPr>
             <w:rStyle w:val="Hyperlink"/>
@@ -6980,7 +6915,7 @@
       <w:r>
         <w:t xml:space="preserve"> </w:t>
       </w:r>
-      <w:hyperlink r:id="rId69">
+      <w:hyperlink r:id="rId66">
         <w:r>
           <w:rPr>
             <w:rStyle w:val="Hyperlink"/>
@@ -7011,7 +6946,7 @@
       <w:r>
         <w:t xml:space="preserve"> </w:t>
       </w:r>
-      <w:hyperlink r:id="rId70">
+      <w:hyperlink r:id="rId67">
         <w:r>
           <w:rPr>
             <w:rStyle w:val="Hyperlink"/>
@@ -7048,7 +6983,7 @@
       <w:r>
         <w:t xml:space="preserve"> </w:t>
       </w:r>
-      <w:hyperlink r:id="rId71">
+      <w:hyperlink r:id="rId68">
         <w:r>
           <w:rPr>
             <w:rStyle w:val="Hyperlink"/>
@@ -7079,7 +7014,7 @@
       <w:r>
         <w:t xml:space="preserve"> </w:t>
       </w:r>
-      <w:hyperlink r:id="rId72">
+      <w:hyperlink r:id="rId69">
         <w:r>
           <w:rPr>
             <w:rStyle w:val="Hyperlink"/>
@@ -7088,7 +7023,7 @@
         </w:r>
       </w:hyperlink>
     </w:p>
-    <w:bookmarkEnd w:id="73"/>
+    <w:bookmarkEnd w:id="70"/>
     <w:sectPr>
       <w:footnotePr>
         <w:numRestart w:val="eachSect"/>

</xml_diff>

<commit_message>
Word preview: embed figures as PNG (Word can't display PDF images)
Pandoc embedded the figures as PDF, which Word renders as a blank box with
the filename (and the unrenderable objects pushed layout around). Add
paper/make_docx.py, which swaps \includegraphics{X.pdf} -> {X.png} on a temp
copy before pandoc, so the Word preview shows the figures inline. The .tex
keeps the vector PDFs for the LaTeX/submission compile. Ship the figure PNGs
in paper/ and regenerate the docx.

https://claude.ai/code/session_01GRhKW3iKJjm2wYYeUd56Hq
</commit_message>
<xml_diff>
--- a/paper/methodsx_manuscript.docx
+++ b/paper/methodsx_manuscript.docx
@@ -2221,14 +2221,14 @@
       <w:r>
         <w:drawing>
           <wp:inline>
-            <wp:extent cx="5334000" cy="3518170"/>
+            <wp:extent cx="5334000" cy="3521528"/>
             <wp:effectExtent b="0" l="0" r="0" t="0"/>
             <wp:docPr descr="" title="" id="18" name="Picture"/>
             <a:graphic>
               <a:graphicData uri="http://schemas.openxmlformats.org/drawingml/2006/picture">
                 <pic:pic>
                   <pic:nvPicPr>
-                    <pic:cNvPr descr="augmentation_v12.pdf" id="19" name="Picture"/>
+                    <pic:cNvPr descr="augmentation_v12.png" id="19" name="Picture"/>
                     <pic:cNvPicPr>
                       <a:picLocks noChangeArrowheads="1" noChangeAspect="1"/>
                     </pic:cNvPicPr>
@@ -2242,7 +2242,7 @@
                   <pic:spPr bwMode="auto">
                     <a:xfrm>
                       <a:off x="0" y="0"/>
-                      <a:ext cx="5334000" cy="3518170"/>
+                      <a:ext cx="5334000" cy="3521528"/>
                     </a:xfrm>
                     <a:prstGeom prst="rect">
                       <a:avLst/>
@@ -2932,14 +2932,14 @@
       <w:r>
         <w:drawing>
           <wp:inline>
-            <wp:extent cx="3840480" cy="4973121"/>
+            <wp:extent cx="3840480" cy="4976599"/>
             <wp:effectExtent b="0" l="0" r="0" t="0"/>
             <wp:docPr descr="" title="" id="24" name="Picture"/>
             <a:graphic>
               <a:graphicData uri="http://schemas.openxmlformats.org/drawingml/2006/picture">
                 <pic:pic>
                   <pic:nvPicPr>
-                    <pic:cNvPr descr="model_architecture_v12.pdf" id="25" name="Picture"/>
+                    <pic:cNvPr descr="model_architecture_v12.png" id="25" name="Picture"/>
                     <pic:cNvPicPr>
                       <a:picLocks noChangeArrowheads="1" noChangeAspect="1"/>
                     </pic:cNvPicPr>
@@ -2953,7 +2953,7 @@
                   <pic:spPr bwMode="auto">
                     <a:xfrm>
                       <a:off x="0" y="0"/>
-                      <a:ext cx="3840480" cy="4973121"/>
+                      <a:ext cx="3840480" cy="4976599"/>
                     </a:xfrm>
                     <a:prstGeom prst="rect">
                       <a:avLst/>
@@ -4410,14 +4410,14 @@
       <w:r>
         <w:drawing>
           <wp:inline>
-            <wp:extent cx="5334000" cy="2115910"/>
+            <wp:extent cx="5334000" cy="2121199"/>
             <wp:effectExtent b="0" l="0" r="0" t="0"/>
             <wp:docPr descr="" title="" id="42" name="Picture"/>
             <a:graphic>
               <a:graphicData uri="http://schemas.openxmlformats.org/drawingml/2006/picture">
                 <pic:pic>
                   <pic:nvPicPr>
-                    <pic:cNvPr descr="training_curves_v12.pdf" id="43" name="Picture"/>
+                    <pic:cNvPr descr="training_curves_v12.png" id="43" name="Picture"/>
                     <pic:cNvPicPr>
                       <a:picLocks noChangeArrowheads="1" noChangeAspect="1"/>
                     </pic:cNvPicPr>
@@ -4431,7 +4431,7 @@
                   <pic:spPr bwMode="auto">
                     <a:xfrm>
                       <a:off x="0" y="0"/>
-                      <a:ext cx="5334000" cy="2115910"/>
+                      <a:ext cx="5334000" cy="2121199"/>
                     </a:xfrm>
                     <a:prstGeom prst="rect">
                       <a:avLst/>
@@ -5203,14 +5203,14 @@
       <w:r>
         <w:drawing>
           <wp:inline>
-            <wp:extent cx="3467100" cy="2929699"/>
+            <wp:extent cx="3467100" cy="2923485"/>
             <wp:effectExtent b="0" l="0" r="0" t="0"/>
             <wp:docPr descr="" title="" id="48" name="Picture"/>
             <a:graphic>
               <a:graphicData uri="http://schemas.openxmlformats.org/drawingml/2006/picture">
                 <pic:pic>
                   <pic:nvPicPr>
-                    <pic:cNvPr descr="confusion_matrix_v12.pdf" id="49" name="Picture"/>
+                    <pic:cNvPr descr="confusion_matrix_v12.png" id="49" name="Picture"/>
                     <pic:cNvPicPr>
                       <a:picLocks noChangeArrowheads="1" noChangeAspect="1"/>
                     </pic:cNvPicPr>
@@ -5224,7 +5224,7 @@
                   <pic:spPr bwMode="auto">
                     <a:xfrm>
                       <a:off x="0" y="0"/>
-                      <a:ext cx="3467100" cy="2929699"/>
+                      <a:ext cx="3467100" cy="2923485"/>
                     </a:xfrm>
                     <a:prstGeom prst="rect">
                       <a:avLst/>

</xml_diff>

<commit_message>
Shrink the model-architecture figure (0.72 -> 0.6 linewidth)
The tall vertical architecture diagram was taking up nearly a full page.
Reduce its width so it occupies less of the page while staying legible.

https://claude.ai/code/session_01GRhKW3iKJjm2wYYeUd56Hq
</commit_message>
<xml_diff>
--- a/paper/methodsx_manuscript.docx
+++ b/paper/methodsx_manuscript.docx
@@ -2932,7 +2932,7 @@
       <w:r>
         <w:drawing>
           <wp:inline>
-            <wp:extent cx="3840480" cy="4976599"/>
+            <wp:extent cx="3200400" cy="4147166"/>
             <wp:effectExtent b="0" l="0" r="0" t="0"/>
             <wp:docPr descr="" title="" id="24" name="Picture"/>
             <a:graphic>
@@ -2953,7 +2953,7 @@
                   <pic:spPr bwMode="auto">
                     <a:xfrm>
                       <a:off x="0" y="0"/>
-                      <a:ext cx="3840480" cy="4976599"/>
+                      <a:ext cx="3200400" cy="4147166"/>
                     </a:xfrm>
                     <a:prstGeom prst="rect">
                       <a:avLst/>

</xml_diff>

<commit_message>
Method validation: drop the unverified V11 ablation comparison
Remove the "compared with the preceding V11 model (97.29%)... 93.8% to 96.1%
..." sentence and its dependent interpretation. Those V11 numbers were not
documented in the repo (fabrication risk), internal version labels carry no
meaning to readers, and the comparison is not needed -- the validation section
now reports only the verified V12 results (98.12%, zero cross-species
confusion, confuser separation). The design rationale for the HF augmentation
remains in the architecture-progression paragraph.

https://claude.ai/code/session_01GRhKW3iKJjm2wYYeUd56Hq
</commit_message>
<xml_diff>
--- a/paper/methodsx_manuscript.docx
+++ b/paper/methodsx_manuscript.docx
@@ -5451,73 +5451,7 @@
         <w:t xml:space="preserve"> </w:t>
       </w:r>
       <w:r>
-        <w:t xml:space="preserve">detections. Compared with the preceding V11 model</w:t>
-      </w:r>
-      <w:r>
-        <w:t xml:space="preserve"> </w:t>
-      </w:r>
-      <w:r>
-        <w:t xml:space="preserve">(97.29 % overall), the V12 high-frequency nuisance augmentation raised</w:t>
-      </w:r>
-      <w:r>
-        <w:t xml:space="preserve"> </w:t>
-      </w:r>
-      <w:r>
-        <w:t xml:space="preserve">Cernic recall from 93.8 % to 96.1 % and</w:t>
-      </w:r>
-      <w:r>
-        <w:t xml:space="preserve"> </w:t>
-      </w:r>
-      <w:r>
-        <w:rPr>
-          <w:i/>
-          <w:iCs/>
-        </w:rPr>
-        <w:t xml:space="preserve">Colobus</w:t>
-      </w:r>
-      <w:r>
-        <w:t xml:space="preserve"> </w:t>
-      </w:r>
-      <w:r>
-        <w:t xml:space="preserve">accuracy from</w:t>
-      </w:r>
-      <w:r>
-        <w:t xml:space="preserve"> </w:t>
-      </w:r>
-      <w:r>
-        <w:t xml:space="preserve">98.96 % to 99.0 %, while confuser and Background accuracy both improved</w:t>
-      </w:r>
-      <w:r>
-        <w:t xml:space="preserve"> </w:t>
-      </w:r>
-      <w:r>
-        <w:t xml:space="preserve">by</w:t>
-      </w:r>
-      <w:r>
-        <w:t xml:space="preserve"> </w:t>
-      </w:r>
-      <m:oMath>
-        <m:r>
-          <m:rPr>
-            <m:sty m:val="p"/>
-          </m:rPr>
-          <m:t>∼</m:t>
-        </m:r>
-      </m:oMath>
-      <w:r>
-        <w:t xml:space="preserve">0.5 percentage points. The gain in Cernic recall indicates that the</w:t>
-      </w:r>
-      <w:r>
-        <w:t xml:space="preserve"> </w:t>
-      </w:r>
-      <w:r>
-        <w:t xml:space="preserve">augmentation indirectly benefits Cernic by freeing the model from the</w:t>
-      </w:r>
-      <w:r>
-        <w:t xml:space="preserve"> </w:t>
-      </w:r>
-      <w:r>
-        <w:t xml:space="preserve">high-frequency shortcut that previously caused Cernic–confuser confusion.</w:t>
+        <w:t xml:space="preserve">detections.</w:t>
       </w:r>
     </w:p>
     <w:bookmarkEnd w:id="51"/>

</xml_diff>

<commit_message>
Strip internal version labels (V6-V11) from the development narrative
Internal version numbers carry no meaning to readers. Rewrite the
architecture-progression and field-deployment paragraphs to describe the
design progression by what changed, not by version number:
- "(V6)/(V7)/(V8)/(V10)/(V11)" labels removed; the failure->fix narrative kept.
- The dev-time architecture check now says "position-aware head" vs "earlier
  position-blind head" instead of V11 vs V10.
- The final model is still called V12 (consistent with the figure/table
  captions and Table 1's "final (V12)" anchor).
- Drop a redundant "The V12 model is the version deployed" closing sentence.

https://claude.ai/code/session_01GRhKW3iKJjm2wYYeUd56Hq
</commit_message>
<xml_diff>
--- a/paper/methodsx_manuscript.docx
+++ b/paper/methodsx_manuscript.docx
@@ -5487,13 +5487,13 @@
         <w:t xml:space="preserve"> </w:t>
       </w:r>
       <w:r>
-        <w:t xml:space="preserve">the V11 head (frequency-position encoding, before HF augmentation) was compared</w:t>
-      </w:r>
-      <w:r>
-        <w:t xml:space="preserve"> </w:t>
-      </w:r>
-      <w:r>
-        <w:t xml:space="preserve">against V10 on a set of</w:t>
+        <w:t xml:space="preserve">the position-aware head (with the frequency-position encoding) was compared</w:t>
+      </w:r>
+      <w:r>
+        <w:t xml:space="preserve"> </w:t>
+      </w:r>
+      <w:r>
+        <w:t xml:space="preserve">against the earlier position-blind head on a set of</w:t>
       </w:r>
       <w:r>
         <w:t xml:space="preserve"> </w:t>
@@ -5509,13 +5509,19 @@
         <w:t xml:space="preserve"> </w:t>
       </w:r>
       <w:r>
-        <w:t xml:space="preserve">detection clips: of six high-frequency</w:t>
-      </w:r>
-      <w:r>
-        <w:t xml:space="preserve"> </w:t>
-      </w:r>
-      <w:r>
-        <w:t xml:space="preserve">bird false positives that V10 had labelled</w:t>
+        <w:t xml:space="preserve">detection</w:t>
+      </w:r>
+      <w:r>
+        <w:t xml:space="preserve"> </w:t>
+      </w:r>
+      <w:r>
+        <w:t xml:space="preserve">clips: of six high-frequency bird false positives that the position-blind head</w:t>
+      </w:r>
+      <w:r>
+        <w:t xml:space="preserve"> </w:t>
+      </w:r>
+      <w:r>
+        <w:t xml:space="preserve">had labelled</w:t>
       </w:r>
       <w:r>
         <w:t xml:space="preserve"> </w:t>
@@ -5528,7 +5534,7 @@
         <w:t xml:space="preserve">Colobus</w:t>
       </w:r>
       <w:r>
-        <w:t xml:space="preserve">, V11 reclassified</w:t>
+        <w:t xml:space="preserve">, the position-aware head reclassified</w:t>
       </w:r>
       <w:r>
         <w:t xml:space="preserve"> </w:t>
@@ -5562,19 +5568,19 @@
         <w:t xml:space="preserve"> </w:t>
       </w:r>
       <w:r>
-        <w:t xml:space="preserve">positives. V12 adds the high-frequency nuisance augmentation and the calibrated</w:t>
-      </w:r>
-      <w:r>
-        <w:t xml:space="preserve"> </w:t>
-      </w:r>
-      <w:r>
-        <w:t xml:space="preserve">low-frequency gate on top of V11 and is the version deployed across all</w:t>
-      </w:r>
-      <w:r>
-        <w:t xml:space="preserve"> </w:t>
-      </w:r>
-      <w:r>
-        <w:t xml:space="preserve">stations.</w:t>
+        <w:t xml:space="preserve">positives. The final (V12) model adds the high-frequency nuisance augmentation</w:t>
+      </w:r>
+      <w:r>
+        <w:t xml:space="preserve"> </w:t>
+      </w:r>
+      <w:r>
+        <w:t xml:space="preserve">and the calibrated low-frequency gate on top of this encoding and is the</w:t>
+      </w:r>
+      <w:r>
+        <w:t xml:space="preserve"> </w:t>
+      </w:r>
+      <w:r>
+        <w:t xml:space="preserve">version deployed across all stations.</w:t>
       </w:r>
       <w:r>
         <w:t xml:space="preserve"> </w:t>
@@ -5686,13 +5692,13 @@
         <w:t xml:space="preserve"> </w:t>
       </w:r>
       <w:r>
-        <w:t xml:space="preserve">frequency-band pooling head (V6) fired on essentially every loud non-target</w:t>
-      </w:r>
-      <w:r>
-        <w:t xml:space="preserve"> </w:t>
-      </w:r>
-      <w:r>
-        <w:t xml:space="preserve">sound; adding a temporal CRNN head with Conv1D and a bidirectional LSTM (V7)</w:t>
+        <w:t xml:space="preserve">frequency-band pooling head fired on essentially every loud non-target</w:t>
+      </w:r>
+      <w:r>
+        <w:t xml:space="preserve"> </w:t>
+      </w:r>
+      <w:r>
+        <w:t xml:space="preserve">sound; adding a temporal CRNN head with Conv1D and a bidirectional LSTM</w:t>
       </w:r>
       <w:r>
         <w:t xml:space="preserve"> </w:t>
@@ -5710,7 +5716,7 @@
         <w:t xml:space="preserve"> </w:t>
       </w:r>
       <w:r>
-        <w:t xml:space="preserve">head, V8) restored Cernic recall while keeping false positives low. The</w:t>
+        <w:t xml:space="preserve">head) restored Cernic recall while keeping false positives low. The</w:t>
       </w:r>
       <w:r>
         <w:t xml:space="preserve"> </w:t>
@@ -5763,7 +5769,7 @@
         <w:t xml:space="preserve"> </w:t>
       </w:r>
       <w:r>
-        <w:t xml:space="preserve">sound to a dedicated Colobus_confuser class (V10) addressed this</w:t>
+        <w:t xml:space="preserve">sound to a dedicated Colobus_confuser class addressed this</w:t>
       </w:r>
       <w:r>
         <w:t xml:space="preserve"> </w:t>
@@ -5797,7 +5803,7 @@
         <w:t xml:space="preserve"> </w:t>
       </w:r>
       <w:r>
-        <w:t xml:space="preserve">while ignoring its frequency. The frequency-position encoding (V11) resolves</w:t>
+        <w:t xml:space="preserve">while ignoring its frequency. The frequency-position encoding resolves</w:t>
       </w:r>
       <w:r>
         <w:t xml:space="preserve"> </w:t>
@@ -5901,13 +5907,7 @@
         <w:t xml:space="preserve"> </w:t>
       </w:r>
       <w:r>
-        <w:t xml:space="preserve">lowest ratio observed among reference clips. The V12 model is the version</w:t>
-      </w:r>
-      <w:r>
-        <w:t xml:space="preserve"> </w:t>
-      </w:r>
-      <w:r>
-        <w:t xml:space="preserve">deployed across all stations.</w:t>
+        <w:t xml:space="preserve">lowest ratio observed among reference clips.</w:t>
       </w:r>
     </w:p>
     <w:bookmarkEnd w:id="53"/>

</xml_diff>

<commit_message>
Reconcile the optional time-of-day filter (not applied in reported runs)
The final detection runs do not apply the time-of-day filter. Make §1 and the
Limitations consistent:
- §1: state the filter was not applied in the reported runs, with a visible
  "[to be confirmed before submission]" note (the author will re-confirm).
- Limitations: frame the time-of-day filter as "optional ... if enabled" so the
  site-specificity caveat applies to re-users, not to the runs reported here.
Per the author's decision, do NOT add an in-distribution-validation limitation:
the field runs are deployment/background-mining, and 98.12% is clearly labelled
as validation accuracy (no field-test-accuracy claim is made).

https://claude.ai/code/session_01GRhKW3iKJjm2wYYeUd56Hq
</commit_message>
<xml_diff>
--- a/paper/methodsx_manuscript.docx
+++ b/paper/methodsx_manuscript.docx
@@ -1010,7 +1010,7 @@
         <w:t xml:space="preserve"> </w:t>
       </w:r>
       <w:r>
-        <w:t xml:space="preserve">and false positives.</w:t>
+        <w:t xml:space="preserve">and false positives. In the runs reported here this filter was not applied</w:t>
       </w:r>
       <w:r>
         <w:t xml:space="preserve"> </w:t>
@@ -1020,21 +1020,10 @@
           <w:b/>
           <w:bCs/>
         </w:rPr>
-        <w:t xml:space="preserve">[TODO: the latest detection run did not apply this time-of-day filter;</w:t>
-      </w:r>
-      <w:r>
-        <w:rPr>
-          <w:b/>
-          <w:bCs/>
-        </w:rPr>
-        <w:t xml:space="preserve"> </w:t>
-      </w:r>
-      <w:r>
-        <w:rPr>
-          <w:b/>
-          <w:bCs/>
-        </w:rPr>
-        <w:t xml:space="preserve">confirm the final pipeline setting and reconcile this paragraph.]</w:t>
+        <w:t xml:space="preserve">[to be confirmed before submission]</w:t>
+      </w:r>
+      <w:r>
+        <w:t xml:space="preserve">.</w:t>
       </w:r>
     </w:p>
     <w:p>
@@ -6343,13 +6332,13 @@
         <w:t xml:space="preserve"> </w:t>
       </w:r>
       <w:r>
-        <w:t xml:space="preserve">roars), and the time-of-day filter (05:30–10:30) is</w:t>
-      </w:r>
-      <w:r>
-        <w:t xml:space="preserve"> </w:t>
-      </w:r>
-      <w:r>
-        <w:t xml:space="preserve">site- and species-specific and must be adjusted elsewhere.</w:t>
+        <w:t xml:space="preserve">roars), and the optional time-of-day filter, if</w:t>
+      </w:r>
+      <w:r>
+        <w:t xml:space="preserve"> </w:t>
+      </w:r>
+      <w:r>
+        <w:t xml:space="preserve">enabled, is site- and species-specific and must be adjusted elsewhere.</w:t>
       </w:r>
     </w:p>
     <w:p>

</xml_diff>

<commit_message>
Ethics: add explicit non-invasive exemption statement
The MethodsX/Elsevier guide asks for an explicit statement when a study did
not require ethics approval. Add "As a non-invasive, observational study it
did not require animal-research ethics-committee approval." Keep the field-
recording permit as a visible bracketed placeholder (pending confirmation of
whether a permit applies). Funding confirmed as none; CRediT co-author roles
pending; generative-AI declaration intentionally deferred.

https://claude.ai/code/session_01GRhKW3iKJjm2wYYeUd56Hq
</commit_message>
<xml_diff>
--- a/paper/methodsx_manuscript.docx
+++ b/paper/methodsx_manuscript.docx
@@ -6391,31 +6391,63 @@
         <w:t xml:space="preserve"> </w:t>
       </w:r>
       <w:r>
-        <w:t xml:space="preserve">animal experiments and no capture, handling, or manipulation of animals; no</w:t>
-      </w:r>
-      <w:r>
-        <w:t xml:space="preserve"> </w:t>
-      </w:r>
-      <w:r>
-        <w:t xml:space="preserve">human subjects; and no data collected from social-media platforms. [If</w:t>
-      </w:r>
-      <w:r>
-        <w:t xml:space="preserve"> </w:t>
-      </w:r>
-      <w:r>
-        <w:t xml:space="preserve">applicable, add: field recordings were collected under permit [number] issued</w:t>
-      </w:r>
-      <w:r>
-        <w:t xml:space="preserve"> </w:t>
-      </w:r>
-      <w:r>
-        <w:t xml:space="preserve">by [authority], in accordance with the relevant institutional and national</w:t>
-      </w:r>
-      <w:r>
-        <w:t xml:space="preserve"> </w:t>
-      </w:r>
-      <w:r>
-        <w:t xml:space="preserve">guidelines for non-invasive field research.]</w:t>
+        <w:t xml:space="preserve">animal experiments and no capture, handling, or manipulation of animals, no</w:t>
+      </w:r>
+      <w:r>
+        <w:t xml:space="preserve"> </w:t>
+      </w:r>
+      <w:r>
+        <w:t xml:space="preserve">human subjects, and no data collected from social-media platforms. As a</w:t>
+      </w:r>
+      <w:r>
+        <w:t xml:space="preserve"> </w:t>
+      </w:r>
+      <w:r>
+        <w:t xml:space="preserve">non-invasive, observational study it did not require animal-research</w:t>
+      </w:r>
+      <w:r>
+        <w:t xml:space="preserve"> </w:t>
+      </w:r>
+      <w:r>
+        <w:t xml:space="preserve">ethics-committee approval.</w:t>
+      </w:r>
+      <w:r>
+        <w:t xml:space="preserve"> </w:t>
+      </w:r>
+      <w:r>
+        <w:rPr>
+          <w:b/>
+          <w:bCs/>
+        </w:rPr>
+        <w:t xml:space="preserve">[If a permit was required to collect the</w:t>
+      </w:r>
+      <w:r>
+        <w:rPr>
+          <w:b/>
+          <w:bCs/>
+        </w:rPr>
+        <w:t xml:space="preserve"> </w:t>
+      </w:r>
+      <w:r>
+        <w:rPr>
+          <w:b/>
+          <w:bCs/>
+        </w:rPr>
+        <w:t xml:space="preserve">field recordings, add: field recordings were collected under permit [number]</w:t>
+      </w:r>
+      <w:r>
+        <w:rPr>
+          <w:b/>
+          <w:bCs/>
+        </w:rPr>
+        <w:t xml:space="preserve"> </w:t>
+      </w:r>
+      <w:r>
+        <w:rPr>
+          <w:b/>
+          <w:bCs/>
+        </w:rPr>
+        <w:t xml:space="preserve">issued by [authority]; otherwise delete this sentence.]</w:t>
       </w:r>
     </w:p>
     <w:bookmarkEnd w:id="56"/>

</xml_diff>

<commit_message>
Add placeholder for the putty-nosed call-type citation
The hack/kek/pyow call types are stated as fact (from a species expert).
Add a visible bracketed placeholder in the Background to insert the published
reference once the expert confirms it, and track it in the checklist. Also
log the time-of-day-filter confirmation TODO.

https://claude.ai/code/session_01GRhKW3iKJjm2wYYeUd56Hq
</commit_message>
<xml_diff>
--- a/paper/methodsx_manuscript.docx
+++ b/paper/methodsx_manuscript.docx
@@ -739,7 +739,34 @@
         <w:t xml:space="preserve"> </w:t>
       </w:r>
       <w:r>
-        <w:t xml:space="preserve">call types, and</w:t>
+        <w:t xml:space="preserve">call types</w:t>
+      </w:r>
+      <w:r>
+        <w:t xml:space="preserve"> </w:t>
+      </w:r>
+      <w:r>
+        <w:rPr>
+          <w:b/>
+          <w:bCs/>
+        </w:rPr>
+        <w:t xml:space="preserve">[cite the putty-nosed call-type source — confirm</w:t>
+      </w:r>
+      <w:r>
+        <w:rPr>
+          <w:b/>
+          <w:bCs/>
+        </w:rPr>
+        <w:t xml:space="preserve"> </w:t>
+      </w:r>
+      <w:r>
+        <w:rPr>
+          <w:b/>
+          <w:bCs/>
+        </w:rPr>
+        <w:t xml:space="preserve">the reference with the species expert]</w:t>
+      </w:r>
+      <w:r>
+        <w:t xml:space="preserve">, and</w:t>
       </w:r>
       <w:r>
         <w:t xml:space="preserve"> </w:t>

</xml_diff>

<commit_message>
Abstract & Background: clarify "classifier" 98%, use Latin species name
- Abstract: "The model reaches 98% validation accuracy" -> "The classifier
  reaches 98% validation accuracy" so the figure is clearly the classifier's
  validation-set accuracy, not an end-to-end field-detection metric (the
  detection/cleanup pipeline is described separately; its field numbers are
  pending).
- Background: drop the common name; introduce the species as Cercopithecus
  nictitans, consistent with the abstract.

https://claude.ai/code/session_01GRhKW3iKJjm2wYYeUd56Hq
</commit_message>
<xml_diff>
--- a/paper/methodsx_manuscript.docx
+++ b/paper/methodsx_manuscript.docx
@@ -167,13 +167,19 @@
         <w:t xml:space="preserve"> </w:t>
       </w:r>
       <w:r>
-        <w:t xml:space="preserve">cleanup that flags false positives and recycles them into training. The model</w:t>
-      </w:r>
-      <w:r>
-        <w:t xml:space="preserve"> </w:t>
-      </w:r>
-      <w:r>
-        <w:t xml:space="preserve">reaches 98% validation accuracy with zero confusion between the two species.</w:t>
+        <w:t xml:space="preserve">cleanup that flags false positives and recycles them into training. The</w:t>
+      </w:r>
+      <w:r>
+        <w:t xml:space="preserve"> </w:t>
+      </w:r>
+      <w:r>
+        <w:t xml:space="preserve">classifier reaches 98% validation accuracy, with zero confusion between the</w:t>
+      </w:r>
+      <w:r>
+        <w:t xml:space="preserve"> </w:t>
+      </w:r>
+      <w:r>
+        <w:t xml:space="preserve">two species.</w:t>
       </w:r>
     </w:p>
     <w:p>
@@ -693,7 +699,10 @@
         <w:t xml:space="preserve"> </w:t>
       </w:r>
       <w:r>
-        <w:t xml:space="preserve">Makokou, Gabon: the putty-nosed monkey (</w:t>
+        <w:t xml:space="preserve">Makokou, Gabon:</w:t>
+      </w:r>
+      <w:r>
+        <w:t xml:space="preserve"> </w:t>
       </w:r>
       <w:r>
         <w:rPr>
@@ -703,7 +712,7 @@
         <w:t xml:space="preserve">Cercopithecus nictitans</w:t>
       </w:r>
       <w:r>
-        <w:t xml:space="preserve">),</w:t>
+        <w:t xml:space="preserve">,</w:t>
       </w:r>
       <w:r>
         <w:t xml:space="preserve"> </w:t>

</xml_diff>

<commit_message>
Describe reference clips as "curated", not "clean"
The reference clips are hand-curated with the target call prominent but still
contain incidental ambient noise (the §3 high-frequency augmentation explicitly
relies on the Colobus clips carrying incidental bird/insect energy), so "clean"
overstated their purity and contradicted §3. Change the three clip-describing
uses (abstract, Background, Mahalanobis filter) from "clean" to "curated".
Left untouched: the auto-cleanup verb ("detect -> clean -> fold-in") and the
"clean vs suspicious" detection label, which are unrelated technical terms.

https://claude.ai/code/session_01GRhKW3iKJjm2wYYeUd56Hq
</commit_message>
<xml_diff>
--- a/paper/methodsx_manuscript.docx
+++ b/paper/methodsx_manuscript.docx
@@ -90,7 +90,7 @@
         <w:t xml:space="preserve"> </w:t>
       </w:r>
       <w:r>
-        <w:t xml:space="preserve">trained on clean reference clips also fires on non-target forest</w:t>
+        <w:t xml:space="preserve">trained on curated reference clips also fires on non-target forest</w:t>
       </w:r>
       <w:r>
         <w:t xml:space="preserve"> </w:t>
@@ -635,7 +635,7 @@
         <w:t xml:space="preserve"> </w:t>
       </w:r>
       <w:r>
-        <w:t xml:space="preserve">on clean, isolated reference clips.</w:t>
+        <w:t xml:space="preserve">on curated, isolated reference clips.</w:t>
       </w:r>
     </w:p>
     <w:p>
@@ -3805,7 +3805,7 @@
         <w:t xml:space="preserve"> </w:t>
       </w:r>
       <w:r>
-        <w:t xml:space="preserve">Because field clips are systematically noisier than clean training clips,</w:t>
+        <w:t xml:space="preserve">Because field clips are systematically noisier than the curated training clips,</w:t>
       </w:r>
       <w:r>
         <w:t xml:space="preserve"> </w:t>

</xml_diff>

<commit_message>
Paper: add reproducibility & reuse subsection to Method details
New subsection 9 makes the repo's reproducibility explicit: ready-to-run
notebooks (main_local, auto_cleanup_local), SETUP.md, pinned deps for an
exact environment, and the config-driven design that lets users retarget
the method to a new species/site without editing code. Also tightened the
Resource availability line in the specifications table. Regenerated docx.

Co-Authored-By: Claude Opus 4.8 <noreply@anthropic.com>
Claude-Session: https://claude.ai/code/session_01GRhKW3iKJjm2wYYeUd56Hq
</commit_message>
<xml_diff>
--- a/paper/methodsx_manuscript.docx
+++ b/paper/methodsx_manuscript.docx
@@ -530,19 +530,43 @@
               </w:r>
             </w:hyperlink>
             <w:r>
-              <w:t xml:space="preserve">. Python 3,</w:t>
+              <w:t xml:space="preserve">, including</w:t>
             </w:r>
             <w:r>
               <w:t xml:space="preserve"> </w:t>
             </w:r>
             <w:r>
+              <w:t xml:space="preserve">ready-to-run Jupyter notebooks and a step-by-step</w:t>
+            </w:r>
+            <w:r>
+              <w:t xml:space="preserve"> </w:t>
+            </w:r>
+            <w:r>
+              <w:rPr>
+                <w:rStyle w:val="VerbatimChar"/>
+              </w:rPr>
+              <w:t xml:space="preserve">SETUP.md</w:t>
+            </w:r>
+            <w:r>
+              <w:t xml:space="preserve">, with</w:t>
+            </w:r>
+            <w:r>
+              <w:t xml:space="preserve"> </w:t>
+            </w:r>
+            <w:r>
+              <w:t xml:space="preserve">pinned dependencies for an exactly reproducible environment. Python 3,</w:t>
+            </w:r>
+            <w:r>
+              <w:t xml:space="preserve"> </w:t>
+            </w:r>
+            <w:r>
               <w:t xml:space="preserve">TensorFlow 2, librosa, scikit-learn, OpenCV, soundfile; the YAMNet filter</w:t>
             </w:r>
             <w:r>
               <w:t xml:space="preserve"> </w:t>
             </w:r>
             <w:r>
-              <w:t xml:space="preserve">additionally needs tensorflow-hub and resampy. [Add a data DOI/repository</w:t>
+              <w:t xml:space="preserve">additionally needs tensorflow-hub. [Add a data DOI/repository</w:t>
             </w:r>
             <w:r>
               <w:t xml:space="preserve"> </w:t>
@@ -890,7 +914,7 @@
       </w:r>
     </w:p>
     <w:bookmarkEnd w:id="13"/>
-    <w:bookmarkStart w:id="40" w:name="method-details"/>
+    <w:bookmarkStart w:id="41" w:name="method-details"/>
     <w:p>
       <w:pPr>
         <w:pStyle w:val="Heading1"/>
@@ -4265,14 +4289,13 @@
       </w:r>
     </w:p>
     <w:bookmarkEnd w:id="39"/>
-    <w:bookmarkEnd w:id="40"/>
-    <w:bookmarkStart w:id="54" w:name="method-validation"/>
-    <w:p>
-      <w:pPr>
-        <w:pStyle w:val="Heading1"/>
-      </w:pPr>
-      <w:r>
-        <w:t xml:space="preserve">Method validation</w:t>
+    <w:bookmarkStart w:id="40" w:name="X82f8dbe80f0e99a5ca56c337b4aca15a6dbffa4"/>
+    <w:p>
+      <w:pPr>
+        <w:pStyle w:val="Heading2"/>
+      </w:pPr>
+      <w:r>
+        <w:t xml:space="preserve">9. Reproducibility and reuse on new species or sites</w:t>
       </w:r>
     </w:p>
     <w:p>
@@ -4280,25 +4303,131 @@
         <w:pStyle w:val="FirstParagraph"/>
       </w:pPr>
       <w:r>
-        <w:t xml:space="preserve">We report validation at two levels: (i) performance on a held-out validation</w:t>
-      </w:r>
-      <w:r>
-        <w:t xml:space="preserve"> </w:t>
-      </w:r>
-      <w:r>
-        <w:t xml:space="preserve">split drawn from the same curated clip pool as training, and (ii) deployment on</w:t>
-      </w:r>
-      <w:r>
-        <w:t xml:space="preserve"> </w:t>
-      </w:r>
-      <w:r>
-        <w:t xml:space="preserve">the continuous field recordings, where the biology of the site provides an</w:t>
-      </w:r>
-      <w:r>
-        <w:t xml:space="preserve"> </w:t>
-      </w:r>
-      <w:r>
-        <w:t xml:space="preserve">independent check on the</w:t>
+        <w:t xml:space="preserve">The complete method is released as a self-contained repository</w:t>
+      </w:r>
+      <w:r>
+        <w:t xml:space="preserve"> </w:t>
+      </w:r>
+      <w:r>
+        <w:t xml:space="preserve">(</w:t>
+      </w:r>
+      <w:hyperlink r:id="rId11">
+        <w:r>
+          <w:rPr>
+            <w:rStyle w:val="Hyperlink"/>
+          </w:rPr>
+          <w:t xml:space="preserve">https://github.com/mo119m/primates-sound-detection</w:t>
+        </w:r>
+      </w:hyperlink>
+      <w:r>
+        <w:t xml:space="preserve">) designed to be run by</w:t>
+      </w:r>
+      <w:r>
+        <w:t xml:space="preserve"> </w:t>
+      </w:r>
+      <w:r>
+        <w:t xml:space="preserve">others, not only read. Two Jupyter notebooks reproduce the entire workflow on a</w:t>
+      </w:r>
+      <w:r>
+        <w:t xml:space="preserve"> </w:t>
+      </w:r>
+      <w:r>
+        <w:t xml:space="preserve">local machine with no code editing:</w:t>
+      </w:r>
+      <w:r>
+        <w:t xml:space="preserve"> </w:t>
+      </w:r>
+      <w:r>
+        <w:rPr>
+          <w:rStyle w:val="VerbatimChar"/>
+        </w:rPr>
+        <w:t xml:space="preserve">main_local.ipynb</w:t>
+      </w:r>
+      <w:r>
+        <w:t xml:space="preserve"> </w:t>
+      </w:r>
+      <w:r>
+        <w:t xml:space="preserve">runs</w:t>
+      </w:r>
+      <w:r>
+        <w:t xml:space="preserve"> </w:t>
+      </w:r>
+      <w:r>
+        <w:t xml:space="preserve">preprocessing, training, and sliding-window detection end-to-end, and</w:t>
+      </w:r>
+      <w:r>
+        <w:t xml:space="preserve"> </w:t>
+      </w:r>
+      <w:r>
+        <w:rPr>
+          <w:rStyle w:val="VerbatimChar"/>
+        </w:rPr>
+        <w:t xml:space="preserve">auto_cleanup_local.ipynb</w:t>
+      </w:r>
+      <w:r>
+        <w:t xml:space="preserve"> </w:t>
+      </w:r>
+      <w:r>
+        <w:t xml:space="preserve">runs the three-filter false-positive cleanup</w:t>
+      </w:r>
+      <w:r>
+        <w:t xml:space="preserve"> </w:t>
+      </w:r>
+      <w:r>
+        <w:t xml:space="preserve">of Section 7. Both notebooks locate the project automatically, detect and use a</w:t>
+      </w:r>
+      <w:r>
+        <w:t xml:space="preserve"> </w:t>
+      </w:r>
+      <w:r>
+        <w:t xml:space="preserve">GPU if one is present (falling back to CPU otherwise), and load the published</w:t>
+      </w:r>
+      <w:r>
+        <w:t xml:space="preserve"> </w:t>
+      </w:r>
+      <w:r>
+        <w:t xml:space="preserve">V12 model directly. A step-by-step</w:t>
+      </w:r>
+      <w:r>
+        <w:t xml:space="preserve"> </w:t>
+      </w:r>
+      <w:r>
+        <w:rPr>
+          <w:rStyle w:val="VerbatimChar"/>
+        </w:rPr>
+        <w:t xml:space="preserve">SETUP.md</w:t>
+      </w:r>
+      <w:r>
+        <w:t xml:space="preserve"> </w:t>
+      </w:r>
+      <w:r>
+        <w:t xml:space="preserve">takes a user from a fresh</w:t>
+      </w:r>
+      <w:r>
+        <w:t xml:space="preserve"> </w:t>
+      </w:r>
+      <w:r>
+        <w:t xml:space="preserve">machine to a running notebook, and the Python dependencies are pinned so that</w:t>
+      </w:r>
+      <w:r>
+        <w:t xml:space="preserve"> </w:t>
+      </w:r>
+      <w:r>
+        <w:t xml:space="preserve">the exact software environment used to train the released model can be recreated</w:t>
+      </w:r>
+      <w:r>
+        <w:t xml:space="preserve"> </w:t>
+      </w:r>
+      <w:r>
+        <w:t xml:space="preserve">on Windows, macOS, or Linux.</w:t>
+      </w:r>
+    </w:p>
+    <w:p>
+      <w:pPr>
+        <w:pStyle w:val="BodyText"/>
+      </w:pPr>
+      <w:r>
+        <w:t xml:space="preserve">Crucially, the pipeline is</w:t>
       </w:r>
       <w:r>
         <w:t xml:space="preserve"> </w:t>
@@ -4308,6 +4437,167 @@
           <w:i/>
           <w:iCs/>
         </w:rPr>
+        <w:t xml:space="preserve">configuration-driven</w:t>
+      </w:r>
+      <w:r>
+        <w:t xml:space="preserve">: all paths, class</w:t>
+      </w:r>
+      <w:r>
+        <w:t xml:space="preserve"> </w:t>
+      </w:r>
+      <w:r>
+        <w:t xml:space="preserve">definitions, audio parameters, and hyperparameters live in a single</w:t>
+      </w:r>
+      <w:r>
+        <w:t xml:space="preserve"> </w:t>
+      </w:r>
+      <w:r>
+        <w:rPr>
+          <w:rStyle w:val="VerbatimChar"/>
+        </w:rPr>
+        <w:t xml:space="preserve">config.py</w:t>
+      </w:r>
+      <w:r>
+        <w:t xml:space="preserve">. Re-targeting the method to a different species or field site</w:t>
+      </w:r>
+      <w:r>
+        <w:t xml:space="preserve"> </w:t>
+      </w:r>
+      <w:r>
+        <w:t xml:space="preserve">requires no change to the source code. A user drops their own labelled reference</w:t>
+      </w:r>
+      <w:r>
+        <w:t xml:space="preserve"> </w:t>
+      </w:r>
+      <w:r>
+        <w:t xml:space="preserve">clips into the</w:t>
+      </w:r>
+      <w:r>
+        <w:t xml:space="preserve"> </w:t>
+      </w:r>
+      <w:r>
+        <w:rPr>
+          <w:rStyle w:val="VerbatimChar"/>
+        </w:rPr>
+        <w:t xml:space="preserve">data/</w:t>
+      </w:r>
+      <w:r>
+        <w:t xml:space="preserve"> </w:t>
+      </w:r>
+      <w:r>
+        <w:t xml:space="preserve">folders, lists the new class names in the</w:t>
+      </w:r>
+      <w:r>
+        <w:t xml:space="preserve"> </w:t>
+      </w:r>
+      <w:r>
+        <w:rPr>
+          <w:rStyle w:val="VerbatimChar"/>
+        </w:rPr>
+        <w:t xml:space="preserve">SPECIES_FOLDERS</w:t>
+      </w:r>
+      <w:r>
+        <w:t xml:space="preserve"> </w:t>
+      </w:r>
+      <w:r>
+        <w:t xml:space="preserve">and</w:t>
+      </w:r>
+      <w:r>
+        <w:t xml:space="preserve"> </w:t>
+      </w:r>
+      <w:r>
+        <w:rPr>
+          <w:rStyle w:val="VerbatimChar"/>
+        </w:rPr>
+        <w:t xml:space="preserve">BACKGROUND_FOLDERS</w:t>
+      </w:r>
+      <w:r>
+        <w:t xml:space="preserve"> </w:t>
+      </w:r>
+      <w:r>
+        <w:t xml:space="preserve">dictionaries, and</w:t>
+      </w:r>
+      <w:r>
+        <w:t xml:space="preserve"> </w:t>
+      </w:r>
+      <w:r>
+        <w:t xml:space="preserve">re-runs the same notebook; the number of output classes, class weighting, and</w:t>
+      </w:r>
+      <w:r>
+        <w:t xml:space="preserve"> </w:t>
+      </w:r>
+      <w:r>
+        <w:t xml:space="preserve">the detection grouping all follow automatically from that configuration. The</w:t>
+      </w:r>
+      <w:r>
+        <w:t xml:space="preserve"> </w:t>
+      </w:r>
+      <w:r>
+        <w:t xml:space="preserve">frequency-position head, confuser-class mechanism, and three-filter cleanup are</w:t>
+      </w:r>
+      <w:r>
+        <w:t xml:space="preserve"> </w:t>
+      </w:r>
+      <w:r>
+        <w:t xml:space="preserve">generic and apply unchanged to any new target call. In this way the repository</w:t>
+      </w:r>
+      <w:r>
+        <w:t xml:space="preserve"> </w:t>
+      </w:r>
+      <w:r>
+        <w:t xml:space="preserve">functions both as an exact reproduction of the results reported here and as a</w:t>
+      </w:r>
+      <w:r>
+        <w:t xml:space="preserve"> </w:t>
+      </w:r>
+      <w:r>
+        <w:t xml:space="preserve">reusable template for new passive-acoustic-monitoring problems.</w:t>
+      </w:r>
+    </w:p>
+    <w:bookmarkEnd w:id="40"/>
+    <w:bookmarkEnd w:id="41"/>
+    <w:bookmarkStart w:id="55" w:name="method-validation"/>
+    <w:p>
+      <w:pPr>
+        <w:pStyle w:val="Heading1"/>
+      </w:pPr>
+      <w:r>
+        <w:t xml:space="preserve">Method validation</w:t>
+      </w:r>
+    </w:p>
+    <w:p>
+      <w:pPr>
+        <w:pStyle w:val="FirstParagraph"/>
+      </w:pPr>
+      <w:r>
+        <w:t xml:space="preserve">We report validation at two levels: (i) performance on a held-out validation</w:t>
+      </w:r>
+      <w:r>
+        <w:t xml:space="preserve"> </w:t>
+      </w:r>
+      <w:r>
+        <w:t xml:space="preserve">split drawn from the same curated clip pool as training, and (ii) deployment on</w:t>
+      </w:r>
+      <w:r>
+        <w:t xml:space="preserve"> </w:t>
+      </w:r>
+      <w:r>
+        <w:t xml:space="preserve">the continuous field recordings, where the biology of the site provides an</w:t>
+      </w:r>
+      <w:r>
+        <w:t xml:space="preserve"> </w:t>
+      </w:r>
+      <w:r>
+        <w:t xml:space="preserve">independent check on the</w:t>
+      </w:r>
+      <w:r>
+        <w:t xml:space="preserve"> </w:t>
+      </w:r>
+      <w:r>
+        <w:rPr>
+          <w:i/>
+          <w:iCs/>
+        </w:rPr>
         <w:t xml:space="preserve">Colobus</w:t>
       </w:r>
       <w:r>
@@ -4317,7 +4607,7 @@
         <w:t xml:space="preserve">false-positive rate.</w:t>
       </w:r>
     </w:p>
-    <w:bookmarkStart w:id="51" w:name="validation-set-performance-v12-model."/>
+    <w:bookmarkStart w:id="52" w:name="validation-set-performance-v12-model."/>
     <w:p>
       <w:pPr>
         <w:pStyle w:val="Heading4"/>
@@ -4427,7 +4717,7 @@
         <w:t xml:space="preserve">gives the full confusion matrix.</w:t>
       </w:r>
     </w:p>
-    <w:bookmarkStart w:id="44" w:name="fig:training"/>
+    <w:bookmarkStart w:id="45" w:name="fig:training"/>
     <w:p>
       <w:pPr>
         <w:pStyle w:val="CaptionedFigure"/>
@@ -4437,18 +4727,18 @@
           <wp:inline>
             <wp:extent cx="5334000" cy="2121199"/>
             <wp:effectExtent b="0" l="0" r="0" t="0"/>
-            <wp:docPr descr="" title="" id="42" name="Picture"/>
+            <wp:docPr descr="" title="" id="43" name="Picture"/>
             <a:graphic>
               <a:graphicData uri="http://schemas.openxmlformats.org/drawingml/2006/picture">
                 <pic:pic>
                   <pic:nvPicPr>
-                    <pic:cNvPr descr="training_curves_v12.png" id="43" name="Picture"/>
+                    <pic:cNvPr descr="training_curves_v12.png" id="44" name="Picture"/>
                     <pic:cNvPicPr>
                       <a:picLocks noChangeArrowheads="1" noChangeAspect="1"/>
                     </pic:cNvPicPr>
                   </pic:nvPicPr>
                   <pic:blipFill>
-                    <a:blip r:embed="rId41"/>
+                    <a:blip r:embed="rId42"/>
                     <a:stretch>
                       <a:fillRect/>
                     </a:stretch>
@@ -4507,8 +4797,8 @@
         <w:t xml:space="preserve">checkpoint (98.12 %).</w:t>
       </w:r>
     </w:p>
-    <w:bookmarkEnd w:id="44"/>
-    <w:bookmarkStart w:id="45" w:name="tab:val"/>
+    <w:bookmarkEnd w:id="45"/>
+    <w:bookmarkStart w:id="46" w:name="tab:val"/>
     <w:p>
       <w:pPr>
         <w:pStyle w:val="TableCaption"/>
@@ -4852,8 +5142,9 @@
         </w:tc>
       </w:tr>
     </w:tbl>
-    <w:bookmarkEnd w:id="45"/>
-    <w:bookmarkStart w:id="46" w:name="tab:confusion"/>
+    <w:bookmarkEnd w:id="46"/>
+    <w:p/>
+    <w:bookmarkStart w:id="47" w:name="tab:confusion"/>
     <w:p>
       <w:pPr>
         <w:pStyle w:val="TableCaption"/>
@@ -5219,8 +5510,8 @@
         </w:tc>
       </w:tr>
     </w:tbl>
-    <w:bookmarkEnd w:id="46"/>
-    <w:bookmarkStart w:id="50" w:name="fig:confusion"/>
+    <w:bookmarkEnd w:id="47"/>
+    <w:bookmarkStart w:id="51" w:name="fig:confusion"/>
     <w:p>
       <w:pPr>
         <w:pStyle w:val="CaptionedFigure"/>
@@ -5230,18 +5521,18 @@
           <wp:inline>
             <wp:extent cx="3467100" cy="2923485"/>
             <wp:effectExtent b="0" l="0" r="0" t="0"/>
-            <wp:docPr descr="" title="" id="48" name="Picture"/>
+            <wp:docPr descr="" title="" id="49" name="Picture"/>
             <a:graphic>
               <a:graphicData uri="http://schemas.openxmlformats.org/drawingml/2006/picture">
                 <pic:pic>
                   <pic:nvPicPr>
-                    <pic:cNvPr descr="confusion_matrix_v12.png" id="49" name="Picture"/>
+                    <pic:cNvPr descr="confusion_matrix_v12.png" id="50" name="Picture"/>
                     <pic:cNvPicPr>
                       <a:picLocks noChangeArrowheads="1" noChangeAspect="1"/>
                     </pic:cNvPicPr>
                   </pic:nvPicPr>
                   <pic:blipFill>
-                    <a:blip r:embed="rId47"/>
+                    <a:blip r:embed="rId48"/>
                     <a:stretch>
                       <a:fillRect/>
                     </a:stretch>
@@ -5321,7 +5612,7 @@
         <w:t xml:space="preserve">is exactly zero.</w:t>
       </w:r>
     </w:p>
-    <w:bookmarkEnd w:id="50"/>
+    <w:bookmarkEnd w:id="51"/>
     <w:p>
       <w:pPr>
         <w:pStyle w:val="BodyText"/>
@@ -5479,8 +5770,8 @@
         <w:t xml:space="preserve">detections.</w:t>
       </w:r>
     </w:p>
-    <w:bookmarkEnd w:id="51"/>
-    <w:bookmarkStart w:id="52" w:name="field-deployment."/>
+    <w:bookmarkEnd w:id="52"/>
+    <w:bookmarkStart w:id="53" w:name="field-deployment."/>
     <w:p>
       <w:pPr>
         <w:pStyle w:val="Heading4"/>
@@ -5690,8 +5981,8 @@
         <w:t xml:space="preserve">processing completes.]</w:t>
       </w:r>
     </w:p>
-    <w:bookmarkEnd w:id="52"/>
-    <w:bookmarkStart w:id="53" w:name="Xfd7e2a660e56df99e009fb7f8d0a1a9ea97b8e1"/>
+    <w:bookmarkEnd w:id="53"/>
+    <w:bookmarkStart w:id="54" w:name="Xfd7e2a660e56df99e009fb7f8d0a1a9ea97b8e1"/>
     <w:p>
       <w:pPr>
         <w:pStyle w:val="Heading4"/>
@@ -5935,9 +6226,9 @@
         <w:t xml:space="preserve">lowest ratio observed among reference clips.</w:t>
       </w:r>
     </w:p>
-    <w:bookmarkEnd w:id="53"/>
     <w:bookmarkEnd w:id="54"/>
-    <w:bookmarkStart w:id="55" w:name="limitations"/>
+    <w:bookmarkEnd w:id="55"/>
+    <w:bookmarkStart w:id="56" w:name="limitations"/>
     <w:p>
       <w:pPr>
         <w:pStyle w:val="Heading1"/>
@@ -6400,8 +6691,8 @@
         <w:t xml:space="preserve">assumptions.</w:t>
       </w:r>
     </w:p>
-    <w:bookmarkEnd w:id="55"/>
-    <w:bookmarkStart w:id="56" w:name="ethics-statements"/>
+    <w:bookmarkEnd w:id="56"/>
+    <w:bookmarkStart w:id="57" w:name="ethics-statements"/>
     <w:p>
       <w:pPr>
         <w:pStyle w:val="Heading1"/>
@@ -6486,8 +6777,8 @@
         <w:t xml:space="preserve">issued by [authority]; otherwise delete this sentence.]</w:t>
       </w:r>
     </w:p>
-    <w:bookmarkEnd w:id="56"/>
-    <w:bookmarkStart w:id="57" w:name="credit-author-statement"/>
+    <w:bookmarkEnd w:id="57"/>
+    <w:bookmarkStart w:id="58" w:name="credit-author-statement"/>
     <w:p>
       <w:pPr>
         <w:pStyle w:val="Heading1"/>
@@ -6542,8 +6833,8 @@
         <w:t xml:space="preserve">editing, Funding acquisition].</w:t>
       </w:r>
     </w:p>
-    <w:bookmarkEnd w:id="57"/>
-    <w:bookmarkStart w:id="58" w:name="acknowledgments"/>
+    <w:bookmarkEnd w:id="58"/>
+    <w:bookmarkStart w:id="59" w:name="acknowledgments"/>
     <w:p>
       <w:pPr>
         <w:pStyle w:val="Heading1"/>
@@ -6578,8 +6869,8 @@
         <w:t xml:space="preserve">commercial, or not-for-profit sectors.</w:t>
       </w:r>
     </w:p>
-    <w:bookmarkEnd w:id="58"/>
-    <w:bookmarkStart w:id="59" w:name="declaration-of-interests"/>
+    <w:bookmarkEnd w:id="59"/>
+    <w:bookmarkStart w:id="60" w:name="declaration-of-interests"/>
     <w:p>
       <w:pPr>
         <w:pStyle w:val="Heading1"/>
@@ -6644,8 +6935,8 @@
         <w:t xml:space="preserve">competing interests:</w:t>
       </w:r>
     </w:p>
-    <w:bookmarkEnd w:id="59"/>
-    <w:bookmarkStart w:id="60" w:name="data-availability"/>
+    <w:bookmarkEnd w:id="60"/>
+    <w:bookmarkStart w:id="61" w:name="data-availability"/>
     <w:p>
       <w:pPr>
         <w:pStyle w:val="Heading1"/>
@@ -6721,8 +7012,8 @@
         <w:t xml:space="preserve">.]</w:t>
       </w:r>
     </w:p>
-    <w:bookmarkEnd w:id="60"/>
-    <w:bookmarkStart w:id="70" w:name="Xcca0bcaed302a7900b6627b02d68ebe31e9e060"/>
+    <w:bookmarkEnd w:id="61"/>
+    <w:bookmarkStart w:id="71" w:name="Xcca0bcaed302a7900b6627b02d68ebe31e9e060"/>
     <w:p>
       <w:pPr>
         <w:pStyle w:val="Heading1"/>
@@ -6775,7 +7066,7 @@
       <w:r>
         <w:t xml:space="preserve"> </w:t>
       </w:r>
-      <w:hyperlink r:id="rId61">
+      <w:hyperlink r:id="rId62">
         <w:r>
           <w:rPr>
             <w:rStyle w:val="Hyperlink"/>
@@ -6806,7 +7097,7 @@
       <w:r>
         <w:t xml:space="preserve"> </w:t>
       </w:r>
-      <w:hyperlink r:id="rId62">
+      <w:hyperlink r:id="rId63">
         <w:r>
           <w:rPr>
             <w:rStyle w:val="Hyperlink"/>
@@ -6837,7 +7128,7 @@
       <w:r>
         <w:t xml:space="preserve"> </w:t>
       </w:r>
-      <w:hyperlink r:id="rId63">
+      <w:hyperlink r:id="rId64">
         <w:r>
           <w:rPr>
             <w:rStyle w:val="Hyperlink"/>
@@ -6868,7 +7159,7 @@
       <w:r>
         <w:t xml:space="preserve"> </w:t>
       </w:r>
-      <w:hyperlink r:id="rId64">
+      <w:hyperlink r:id="rId65">
         <w:r>
           <w:rPr>
             <w:rStyle w:val="Hyperlink"/>
@@ -6905,7 +7196,7 @@
       <w:r>
         <w:t xml:space="preserve"> </w:t>
       </w:r>
-      <w:hyperlink r:id="rId65">
+      <w:hyperlink r:id="rId66">
         <w:r>
           <w:rPr>
             <w:rStyle w:val="Hyperlink"/>
@@ -6948,7 +7239,7 @@
       <w:r>
         <w:t xml:space="preserve"> </w:t>
       </w:r>
-      <w:hyperlink r:id="rId66">
+      <w:hyperlink r:id="rId67">
         <w:r>
           <w:rPr>
             <w:rStyle w:val="Hyperlink"/>
@@ -6979,7 +7270,7 @@
       <w:r>
         <w:t xml:space="preserve"> </w:t>
       </w:r>
-      <w:hyperlink r:id="rId67">
+      <w:hyperlink r:id="rId68">
         <w:r>
           <w:rPr>
             <w:rStyle w:val="Hyperlink"/>
@@ -7016,7 +7307,7 @@
       <w:r>
         <w:t xml:space="preserve"> </w:t>
       </w:r>
-      <w:hyperlink r:id="rId68">
+      <w:hyperlink r:id="rId69">
         <w:r>
           <w:rPr>
             <w:rStyle w:val="Hyperlink"/>
@@ -7047,7 +7338,7 @@
       <w:r>
         <w:t xml:space="preserve"> </w:t>
       </w:r>
-      <w:hyperlink r:id="rId69">
+      <w:hyperlink r:id="rId70">
         <w:r>
           <w:rPr>
             <w:rStyle w:val="Hyperlink"/>
@@ -7056,7 +7347,7 @@
         </w:r>
       </w:hyperlink>
     </w:p>
-    <w:bookmarkEnd w:id="70"/>
+    <w:bookmarkEnd w:id="71"/>
     <w:sectPr>
       <w:footnotePr>
         <w:numRestart w:val="eachSect"/>

</xml_diff>

<commit_message>
Paper: generalize reproducibility subsection (don't hardcode notebook names)
Point to the repo README for complete documentation and describe the
ready-to-run notebooks generically, noting both local (CPU/GPU) and
Google Colab (free GPU) options rather than naming specific files.
Regenerated docx.

Co-Authored-By: Claude Opus 4.8 <noreply@anthropic.com>
Claude-Session: https://claude.ai/code/session_01GRhKW3iKJjm2wYYeUd56Hq
</commit_message>
<xml_diff>
--- a/paper/methodsx_manuscript.docx
+++ b/paper/methodsx_manuscript.docx
@@ -4326,100 +4326,55 @@
         <w:t xml:space="preserve"> </w:t>
       </w:r>
       <w:r>
-        <w:t xml:space="preserve">others, not only read. Two Jupyter notebooks reproduce the entire workflow on a</w:t>
-      </w:r>
-      <w:r>
-        <w:t xml:space="preserve"> </w:t>
-      </w:r>
-      <w:r>
-        <w:t xml:space="preserve">local machine with no code editing:</w:t>
-      </w:r>
-      <w:r>
-        <w:t xml:space="preserve"> </w:t>
-      </w:r>
-      <w:r>
-        <w:rPr>
-          <w:rStyle w:val="VerbatimChar"/>
-        </w:rPr>
-        <w:t xml:space="preserve">main_local.ipynb</w:t>
-      </w:r>
-      <w:r>
-        <w:t xml:space="preserve"> </w:t>
-      </w:r>
-      <w:r>
-        <w:t xml:space="preserve">runs</w:t>
-      </w:r>
-      <w:r>
-        <w:t xml:space="preserve"> </w:t>
-      </w:r>
-      <w:r>
-        <w:t xml:space="preserve">preprocessing, training, and sliding-window detection end-to-end, and</w:t>
-      </w:r>
-      <w:r>
-        <w:t xml:space="preserve"> </w:t>
-      </w:r>
-      <w:r>
-        <w:rPr>
-          <w:rStyle w:val="VerbatimChar"/>
-        </w:rPr>
-        <w:t xml:space="preserve">auto_cleanup_local.ipynb</w:t>
-      </w:r>
-      <w:r>
-        <w:t xml:space="preserve"> </w:t>
-      </w:r>
-      <w:r>
-        <w:t xml:space="preserve">runs the three-filter false-positive cleanup</w:t>
-      </w:r>
-      <w:r>
-        <w:t xml:space="preserve"> </w:t>
-      </w:r>
-      <w:r>
-        <w:t xml:space="preserve">of Section 7. Both notebooks locate the project automatically, detect and use a</w:t>
-      </w:r>
-      <w:r>
-        <w:t xml:space="preserve"> </w:t>
-      </w:r>
-      <w:r>
-        <w:t xml:space="preserve">GPU if one is present (falling back to CPU otherwise), and load the published</w:t>
-      </w:r>
-      <w:r>
-        <w:t xml:space="preserve"> </w:t>
-      </w:r>
-      <w:r>
-        <w:t xml:space="preserve">V12 model directly. A step-by-step</w:t>
-      </w:r>
-      <w:r>
-        <w:t xml:space="preserve"> </w:t>
-      </w:r>
-      <w:r>
-        <w:rPr>
-          <w:rStyle w:val="VerbatimChar"/>
-        </w:rPr>
-        <w:t xml:space="preserve">SETUP.md</w:t>
-      </w:r>
-      <w:r>
-        <w:t xml:space="preserve"> </w:t>
-      </w:r>
-      <w:r>
-        <w:t xml:space="preserve">takes a user from a fresh</w:t>
-      </w:r>
-      <w:r>
-        <w:t xml:space="preserve"> </w:t>
-      </w:r>
-      <w:r>
-        <w:t xml:space="preserve">machine to a running notebook, and the Python dependencies are pinned so that</w:t>
-      </w:r>
-      <w:r>
-        <w:t xml:space="preserve"> </w:t>
-      </w:r>
-      <w:r>
-        <w:t xml:space="preserve">the exact software environment used to train the released model can be recreated</w:t>
-      </w:r>
-      <w:r>
-        <w:t xml:space="preserve"> </w:t>
-      </w:r>
-      <w:r>
-        <w:t xml:space="preserve">on Windows, macOS, or Linux.</w:t>
+        <w:t xml:space="preserve">others, not only read. Its README provides complete, step-by-step documentation,</w:t>
+      </w:r>
+      <w:r>
+        <w:t xml:space="preserve"> </w:t>
+      </w:r>
+      <w:r>
+        <w:t xml:space="preserve">and ready-to-run Jupyter notebooks reproduce the entire workflow — preprocessing,</w:t>
+      </w:r>
+      <w:r>
+        <w:t xml:space="preserve"> </w:t>
+      </w:r>
+      <w:r>
+        <w:t xml:space="preserve">training, sliding-window detection, and the three-filter false-positive cleanup</w:t>
+      </w:r>
+      <w:r>
+        <w:t xml:space="preserve"> </w:t>
+      </w:r>
+      <w:r>
+        <w:t xml:space="preserve">of Section 7 — with no code editing. Notebooks are provided for both running</w:t>
+      </w:r>
+      <w:r>
+        <w:t xml:space="preserve"> </w:t>
+      </w:r>
+      <w:r>
+        <w:t xml:space="preserve">locally (on a personal machine, with automatic use of a GPU if present and a</w:t>
+      </w:r>
+      <w:r>
+        <w:t xml:space="preserve"> </w:t>
+      </w:r>
+      <w:r>
+        <w:t xml:space="preserve">CPU fallback otherwise) and running in the cloud on Google Colab with a free</w:t>
+      </w:r>
+      <w:r>
+        <w:t xml:space="preserve"> </w:t>
+      </w:r>
+      <w:r>
+        <w:t xml:space="preserve">GPU, so users can choose whichever suits their hardware. The Python dependencies</w:t>
+      </w:r>
+      <w:r>
+        <w:t xml:space="preserve"> </w:t>
+      </w:r>
+      <w:r>
+        <w:t xml:space="preserve">are pinned so that the exact software environment used to train the released</w:t>
+      </w:r>
+      <w:r>
+        <w:t xml:space="preserve"> </w:t>
+      </w:r>
+      <w:r>
+        <w:t xml:space="preserve">model can be recreated on Windows, macOS, or Linux.</w:t>
       </w:r>
     </w:p>
     <w:p>

</xml_diff>